<commit_message>
Review card: drop the O/X check table
Co-Authored-By: Claude Fable 5.1 <noreply@anthropic.com>
</commit_message>
<xml_diff>
--- a/worksheets/친구NPC_검토카드.docx
+++ b/worksheets/친구NPC_검토카드.docx
@@ -44,7 +44,7 @@
       </w:tblGrid>
       <w:tr>
         <w:trPr>
-          <w:trHeight w:val="7484" w:hRule="exact"/>
+          <w:trHeight w:val="6010" w:hRule="exact"/>
         </w:trPr>
         <w:tc>
           <w:tcPr>
@@ -261,7 +261,7 @@
           </w:p>
           <w:p>
             <w:pPr>
-              <w:spacing w:after="0" w:before="0"/>
+              <w:spacing w:after="80" w:before="0"/>
             </w:pPr>
             <w:r>
               <w:rPr>
@@ -291,7 +291,7 @@
           </w:p>
           <w:p>
             <w:pPr>
-              <w:spacing w:after="60" w:before="0"/>
+              <w:spacing w:after="120" w:before="0"/>
             </w:pPr>
             <w:r>
               <w:rPr>
@@ -317,221 +317,6 @@
                 <w:sz w:val="19"/>
               </w:rPr>
               <w:t>이에요.</w:t>
-            </w:r>
-          </w:p>
-          <w:tbl>
-            <w:tblPr>
-              <w:tblW w:type="auto" w:w="0"/>
-              <w:jc w:val="center"/>
-              <w:tblLook w:firstColumn="1" w:firstRow="1" w:lastColumn="0" w:lastRow="0" w:noHBand="0" w:noVBand="1" w:val="04A0"/>
-              <w:tblBorders>
-                <w:top w:val="single" w:sz="6" w:color="E8A5C4"/>
-                <w:left w:val="single" w:sz="6" w:color="E8A5C4"/>
-                <w:bottom w:val="single" w:sz="6" w:color="E8A5C4"/>
-                <w:right w:val="single" w:sz="6" w:color="E8A5C4"/>
-                <w:insideH w:val="single" w:sz="6" w:color="E8A5C4"/>
-                <w:insideV w:val="single" w:sz="6" w:color="E8A5C4"/>
-              </w:tblBorders>
-              <w:tblLayout w:type="fixed"/>
-              <w:tblCellMar>
-                <w:top w:w="20" w:type="dxa"/>
-                <w:left w:w="80" w:type="dxa"/>
-                <w:bottom w:w="20" w:type="dxa"/>
-                <w:right w:w="60" w:type="dxa"/>
-              </w:tblCellMar>
-              <w:tblLayout w:type="fixed"/>
-            </w:tblPr>
-            <w:tblGrid>
-              <w:gridCol w:w="3742"/>
-              <w:gridCol w:w="907"/>
-            </w:tblGrid>
-            <w:tr>
-              <w:trPr>
-                <w:trHeight w:val="294" w:hRule="atLeast"/>
-              </w:trPr>
-              <w:tc>
-                <w:tcPr>
-                  <w:tcW w:type="dxa" w:w="3742"/>
-                </w:tcPr>
-                <w:p>
-                  <w:pPr>
-                    <w:spacing w:after="0" w:before="0"/>
-                  </w:pPr>
-                  <w:r>
-                    <w:rPr>
-                      <w:rFonts w:ascii="한컴 말랑말랑 Regular" w:hAnsi="한컴 말랑말랑 Regular" w:eastAsia="한컴 말랑말랑 Regular" w:cs="한컴 말랑말랑 Regular"/>
-                      <w:b w:val="0"/>
-                      <w:sz w:val="18"/>
-                    </w:rPr>
-                    <w:t>✖ 상황에 없는 숫자나 사실을 말했다</w:t>
-                  </w:r>
-                </w:p>
-              </w:tc>
-              <w:tc>
-                <w:tcPr>
-                  <w:tcW w:type="dxa" w:w="907"/>
-                </w:tcPr>
-                <w:p>
-                  <w:pPr>
-                    <w:spacing w:after="0" w:before="0"/>
-                    <w:jc w:val="center"/>
-                  </w:pPr>
-                  <w:r>
-                    <w:rPr>
-                      <w:rFonts w:ascii="한컴 말랑말랑 Bold" w:hAnsi="한컴 말랑말랑 Bold" w:eastAsia="한컴 말랑말랑 Bold" w:cs="한컴 말랑말랑 Bold"/>
-                      <w:b/>
-                      <w:color w:val="1F3A5F"/>
-                      <w:sz w:val="20"/>
-                    </w:rPr>
-                    <w:t>○ ×</w:t>
-                  </w:r>
-                </w:p>
-              </w:tc>
-            </w:tr>
-            <w:tr>
-              <w:trPr>
-                <w:trHeight w:val="294" w:hRule="atLeast"/>
-              </w:trPr>
-              <w:tc>
-                <w:tcPr>
-                  <w:tcW w:type="dxa" w:w="3742"/>
-                </w:tcPr>
-                <w:p>
-                  <w:pPr>
-                    <w:spacing w:after="0" w:before="0"/>
-                  </w:pPr>
-                  <w:r>
-                    <w:rPr>
-                      <w:rFonts w:ascii="한컴 말랑말랑 Regular" w:hAnsi="한컴 말랑말랑 Regular" w:eastAsia="한컴 말랑말랑 Regular" w:cs="한컴 말랑말랑 Regular"/>
-                      <w:b w:val="0"/>
-                      <w:sz w:val="18"/>
-                    </w:rPr>
-                    <w:t>✖ 무섭거나 자세하게 묘사했다</w:t>
-                  </w:r>
-                </w:p>
-              </w:tc>
-              <w:tc>
-                <w:tcPr>
-                  <w:tcW w:type="dxa" w:w="907"/>
-                </w:tcPr>
-                <w:p>
-                  <w:pPr>
-                    <w:spacing w:after="0" w:before="0"/>
-                    <w:jc w:val="center"/>
-                  </w:pPr>
-                  <w:r>
-                    <w:rPr>
-                      <w:rFonts w:ascii="한컴 말랑말랑 Bold" w:hAnsi="한컴 말랑말랑 Bold" w:eastAsia="한컴 말랑말랑 Bold" w:cs="한컴 말랑말랑 Bold"/>
-                      <w:b/>
-                      <w:color w:val="1F3A5F"/>
-                      <w:sz w:val="20"/>
-                    </w:rPr>
-                    <w:t>○ ×</w:t>
-                  </w:r>
-                </w:p>
-              </w:tc>
-            </w:tr>
-            <w:tr>
-              <w:trPr>
-                <w:trHeight w:val="294" w:hRule="atLeast"/>
-              </w:trPr>
-              <w:tc>
-                <w:tcPr>
-                  <w:tcW w:type="dxa" w:w="3742"/>
-                </w:tcPr>
-                <w:p>
-                  <w:pPr>
-                    <w:spacing w:after="0" w:before="0"/>
-                  </w:pPr>
-                  <w:r>
-                    <w:rPr>
-                      <w:rFonts w:ascii="한컴 말랑말랑 Regular" w:hAnsi="한컴 말랑말랑 Regular" w:eastAsia="한컴 말랑말랑 Regular" w:cs="한컴 말랑말랑 Regular"/>
-                      <w:b w:val="0"/>
-                      <w:sz w:val="18"/>
-                    </w:rPr>
-                    <w:t>✖ 불쌍한 사람으로만 그렸다</w:t>
-                  </w:r>
-                </w:p>
-              </w:tc>
-              <w:tc>
-                <w:tcPr>
-                  <w:tcW w:type="dxa" w:w="907"/>
-                </w:tcPr>
-                <w:p>
-                  <w:pPr>
-                    <w:spacing w:after="0" w:before="0"/>
-                    <w:jc w:val="center"/>
-                  </w:pPr>
-                  <w:r>
-                    <w:rPr>
-                      <w:rFonts w:ascii="한컴 말랑말랑 Bold" w:hAnsi="한컴 말랑말랑 Bold" w:eastAsia="한컴 말랑말랑 Bold" w:cs="한컴 말랑말랑 Bold"/>
-                      <w:b/>
-                      <w:color w:val="1F3A5F"/>
-                      <w:sz w:val="20"/>
-                    </w:rPr>
-                    <w:t>○ ×</w:t>
-                  </w:r>
-                </w:p>
-              </w:tc>
-            </w:tr>
-            <w:tr>
-              <w:trPr>
-                <w:trHeight w:val="294" w:hRule="atLeast"/>
-              </w:trPr>
-              <w:tc>
-                <w:tcPr>
-                  <w:tcW w:type="dxa" w:w="3742"/>
-                  <w:shd w:val="clear" w:color="auto" w:fill="E2F0EC"/>
-                </w:tcPr>
-                <w:p>
-                  <w:pPr>
-                    <w:spacing w:after="0" w:before="0"/>
-                  </w:pPr>
-                  <w:r>
-                    <w:rPr>
-                      <w:rFonts w:ascii="한컴 말랑말랑 Regular" w:hAnsi="한컴 말랑말랑 Regular" w:eastAsia="한컴 말랑말랑 Regular" w:cs="한컴 말랑말랑 Regular"/>
-                      <w:b w:val="0"/>
-                      <w:sz w:val="18"/>
-                    </w:rPr>
-                    <w:t>✔ 좋은 점과 어려운 점을 둘 다 말해 줬다</w:t>
-                  </w:r>
-                </w:p>
-              </w:tc>
-              <w:tc>
-                <w:tcPr>
-                  <w:tcW w:type="dxa" w:w="907"/>
-                  <w:shd w:val="clear" w:color="auto" w:fill="E2F0EC"/>
-                </w:tcPr>
-                <w:p>
-                  <w:pPr>
-                    <w:spacing w:after="0" w:before="0"/>
-                    <w:jc w:val="center"/>
-                  </w:pPr>
-                  <w:r>
-                    <w:rPr>
-                      <w:rFonts w:ascii="한컴 말랑말랑 Bold" w:hAnsi="한컴 말랑말랑 Bold" w:eastAsia="한컴 말랑말랑 Bold" w:cs="한컴 말랑말랑 Bold"/>
-                      <w:b/>
-                      <w:color w:val="1F3A5F"/>
-                      <w:sz w:val="20"/>
-                    </w:rPr>
-                    <w:t>○ ×</w:t>
-                  </w:r>
-                </w:p>
-              </w:tc>
-            </w:tr>
-          </w:tbl>
-          <w:p>
-            <w:pPr>
-              <w:spacing w:after="60" w:before="20"/>
-            </w:pPr>
-            <w:r>
-              <w:rPr>
-                <w:rFonts w:ascii="한컴 말랑말랑 Regular" w:hAnsi="한컴 말랑말랑 Regular" w:eastAsia="한컴 말랑말랑 Regular" w:cs="한컴 말랑말랑 Regular"/>
-                <w:b w:val="0"/>
-                <w:color w:val="666666"/>
-                <w:sz w:val="15"/>
-              </w:rPr>
-              <w:t>(✖ 줄은 ○가 나오면 만든 모둠이 고칠 곳, ✔ 줄은 ×가 나오면 고칠 곳)</w:t>
             </w:r>
           </w:p>
           <w:p>
@@ -847,7 +632,7 @@
           </w:p>
           <w:p>
             <w:pPr>
-              <w:spacing w:after="0" w:before="0"/>
+              <w:spacing w:after="80" w:before="0"/>
             </w:pPr>
             <w:r>
               <w:rPr>
@@ -877,7 +662,7 @@
           </w:p>
           <w:p>
             <w:pPr>
-              <w:spacing w:after="60" w:before="0"/>
+              <w:spacing w:after="120" w:before="0"/>
             </w:pPr>
             <w:r>
               <w:rPr>
@@ -903,221 +688,6 @@
                 <w:sz w:val="19"/>
               </w:rPr>
               <w:t>이에요.</w:t>
-            </w:r>
-          </w:p>
-          <w:tbl>
-            <w:tblPr>
-              <w:tblW w:type="auto" w:w="0"/>
-              <w:jc w:val="center"/>
-              <w:tblLook w:firstColumn="1" w:firstRow="1" w:lastColumn="0" w:lastRow="0" w:noHBand="0" w:noVBand="1" w:val="04A0"/>
-              <w:tblBorders>
-                <w:top w:val="single" w:sz="6" w:color="E8A5C4"/>
-                <w:left w:val="single" w:sz="6" w:color="E8A5C4"/>
-                <w:bottom w:val="single" w:sz="6" w:color="E8A5C4"/>
-                <w:right w:val="single" w:sz="6" w:color="E8A5C4"/>
-                <w:insideH w:val="single" w:sz="6" w:color="E8A5C4"/>
-                <w:insideV w:val="single" w:sz="6" w:color="E8A5C4"/>
-              </w:tblBorders>
-              <w:tblLayout w:type="fixed"/>
-              <w:tblCellMar>
-                <w:top w:w="20" w:type="dxa"/>
-                <w:left w:w="80" w:type="dxa"/>
-                <w:bottom w:w="20" w:type="dxa"/>
-                <w:right w:w="60" w:type="dxa"/>
-              </w:tblCellMar>
-              <w:tblLayout w:type="fixed"/>
-            </w:tblPr>
-            <w:tblGrid>
-              <w:gridCol w:w="3742"/>
-              <w:gridCol w:w="907"/>
-            </w:tblGrid>
-            <w:tr>
-              <w:trPr>
-                <w:trHeight w:val="294" w:hRule="atLeast"/>
-              </w:trPr>
-              <w:tc>
-                <w:tcPr>
-                  <w:tcW w:type="dxa" w:w="3742"/>
-                </w:tcPr>
-                <w:p>
-                  <w:pPr>
-                    <w:spacing w:after="0" w:before="0"/>
-                  </w:pPr>
-                  <w:r>
-                    <w:rPr>
-                      <w:rFonts w:ascii="한컴 말랑말랑 Regular" w:hAnsi="한컴 말랑말랑 Regular" w:eastAsia="한컴 말랑말랑 Regular" w:cs="한컴 말랑말랑 Regular"/>
-                      <w:b w:val="0"/>
-                      <w:sz w:val="18"/>
-                    </w:rPr>
-                    <w:t>✖ 상황에 없는 숫자나 사실을 말했다</w:t>
-                  </w:r>
-                </w:p>
-              </w:tc>
-              <w:tc>
-                <w:tcPr>
-                  <w:tcW w:type="dxa" w:w="907"/>
-                </w:tcPr>
-                <w:p>
-                  <w:pPr>
-                    <w:spacing w:after="0" w:before="0"/>
-                    <w:jc w:val="center"/>
-                  </w:pPr>
-                  <w:r>
-                    <w:rPr>
-                      <w:rFonts w:ascii="한컴 말랑말랑 Bold" w:hAnsi="한컴 말랑말랑 Bold" w:eastAsia="한컴 말랑말랑 Bold" w:cs="한컴 말랑말랑 Bold"/>
-                      <w:b/>
-                      <w:color w:val="1F3A5F"/>
-                      <w:sz w:val="20"/>
-                    </w:rPr>
-                    <w:t>○ ×</w:t>
-                  </w:r>
-                </w:p>
-              </w:tc>
-            </w:tr>
-            <w:tr>
-              <w:trPr>
-                <w:trHeight w:val="294" w:hRule="atLeast"/>
-              </w:trPr>
-              <w:tc>
-                <w:tcPr>
-                  <w:tcW w:type="dxa" w:w="3742"/>
-                </w:tcPr>
-                <w:p>
-                  <w:pPr>
-                    <w:spacing w:after="0" w:before="0"/>
-                  </w:pPr>
-                  <w:r>
-                    <w:rPr>
-                      <w:rFonts w:ascii="한컴 말랑말랑 Regular" w:hAnsi="한컴 말랑말랑 Regular" w:eastAsia="한컴 말랑말랑 Regular" w:cs="한컴 말랑말랑 Regular"/>
-                      <w:b w:val="0"/>
-                      <w:sz w:val="18"/>
-                    </w:rPr>
-                    <w:t>✖ 무섭거나 자세하게 묘사했다</w:t>
-                  </w:r>
-                </w:p>
-              </w:tc>
-              <w:tc>
-                <w:tcPr>
-                  <w:tcW w:type="dxa" w:w="907"/>
-                </w:tcPr>
-                <w:p>
-                  <w:pPr>
-                    <w:spacing w:after="0" w:before="0"/>
-                    <w:jc w:val="center"/>
-                  </w:pPr>
-                  <w:r>
-                    <w:rPr>
-                      <w:rFonts w:ascii="한컴 말랑말랑 Bold" w:hAnsi="한컴 말랑말랑 Bold" w:eastAsia="한컴 말랑말랑 Bold" w:cs="한컴 말랑말랑 Bold"/>
-                      <w:b/>
-                      <w:color w:val="1F3A5F"/>
-                      <w:sz w:val="20"/>
-                    </w:rPr>
-                    <w:t>○ ×</w:t>
-                  </w:r>
-                </w:p>
-              </w:tc>
-            </w:tr>
-            <w:tr>
-              <w:trPr>
-                <w:trHeight w:val="294" w:hRule="atLeast"/>
-              </w:trPr>
-              <w:tc>
-                <w:tcPr>
-                  <w:tcW w:type="dxa" w:w="3742"/>
-                </w:tcPr>
-                <w:p>
-                  <w:pPr>
-                    <w:spacing w:after="0" w:before="0"/>
-                  </w:pPr>
-                  <w:r>
-                    <w:rPr>
-                      <w:rFonts w:ascii="한컴 말랑말랑 Regular" w:hAnsi="한컴 말랑말랑 Regular" w:eastAsia="한컴 말랑말랑 Regular" w:cs="한컴 말랑말랑 Regular"/>
-                      <w:b w:val="0"/>
-                      <w:sz w:val="18"/>
-                    </w:rPr>
-                    <w:t>✖ 불쌍한 사람으로만 그렸다</w:t>
-                  </w:r>
-                </w:p>
-              </w:tc>
-              <w:tc>
-                <w:tcPr>
-                  <w:tcW w:type="dxa" w:w="907"/>
-                </w:tcPr>
-                <w:p>
-                  <w:pPr>
-                    <w:spacing w:after="0" w:before="0"/>
-                    <w:jc w:val="center"/>
-                  </w:pPr>
-                  <w:r>
-                    <w:rPr>
-                      <w:rFonts w:ascii="한컴 말랑말랑 Bold" w:hAnsi="한컴 말랑말랑 Bold" w:eastAsia="한컴 말랑말랑 Bold" w:cs="한컴 말랑말랑 Bold"/>
-                      <w:b/>
-                      <w:color w:val="1F3A5F"/>
-                      <w:sz w:val="20"/>
-                    </w:rPr>
-                    <w:t>○ ×</w:t>
-                  </w:r>
-                </w:p>
-              </w:tc>
-            </w:tr>
-            <w:tr>
-              <w:trPr>
-                <w:trHeight w:val="294" w:hRule="atLeast"/>
-              </w:trPr>
-              <w:tc>
-                <w:tcPr>
-                  <w:tcW w:type="dxa" w:w="3742"/>
-                  <w:shd w:val="clear" w:color="auto" w:fill="E2F0EC"/>
-                </w:tcPr>
-                <w:p>
-                  <w:pPr>
-                    <w:spacing w:after="0" w:before="0"/>
-                  </w:pPr>
-                  <w:r>
-                    <w:rPr>
-                      <w:rFonts w:ascii="한컴 말랑말랑 Regular" w:hAnsi="한컴 말랑말랑 Regular" w:eastAsia="한컴 말랑말랑 Regular" w:cs="한컴 말랑말랑 Regular"/>
-                      <w:b w:val="0"/>
-                      <w:sz w:val="18"/>
-                    </w:rPr>
-                    <w:t>✔ 좋은 점과 어려운 점을 둘 다 말해 줬다</w:t>
-                  </w:r>
-                </w:p>
-              </w:tc>
-              <w:tc>
-                <w:tcPr>
-                  <w:tcW w:type="dxa" w:w="907"/>
-                  <w:shd w:val="clear" w:color="auto" w:fill="E2F0EC"/>
-                </w:tcPr>
-                <w:p>
-                  <w:pPr>
-                    <w:spacing w:after="0" w:before="0"/>
-                    <w:jc w:val="center"/>
-                  </w:pPr>
-                  <w:r>
-                    <w:rPr>
-                      <w:rFonts w:ascii="한컴 말랑말랑 Bold" w:hAnsi="한컴 말랑말랑 Bold" w:eastAsia="한컴 말랑말랑 Bold" w:cs="한컴 말랑말랑 Bold"/>
-                      <w:b/>
-                      <w:color w:val="1F3A5F"/>
-                      <w:sz w:val="20"/>
-                    </w:rPr>
-                    <w:t>○ ×</w:t>
-                  </w:r>
-                </w:p>
-              </w:tc>
-            </w:tr>
-          </w:tbl>
-          <w:p>
-            <w:pPr>
-              <w:spacing w:after="60" w:before="20"/>
-            </w:pPr>
-            <w:r>
-              <w:rPr>
-                <w:rFonts w:ascii="한컴 말랑말랑 Regular" w:hAnsi="한컴 말랑말랑 Regular" w:eastAsia="한컴 말랑말랑 Regular" w:cs="한컴 말랑말랑 Regular"/>
-                <w:b w:val="0"/>
-                <w:color w:val="666666"/>
-                <w:sz w:val="15"/>
-              </w:rPr>
-              <w:t>(✖ 줄은 ○가 나오면 만든 모둠이 고칠 곳, ✔ 줄은 ×가 나오면 고칠 곳)</w:t>
             </w:r>
           </w:p>
           <w:p>
@@ -1221,7 +791,7 @@
       </w:tr>
       <w:tr>
         <w:trPr>
-          <w:trHeight w:val="7484" w:hRule="exact"/>
+          <w:trHeight w:val="6010" w:hRule="exact"/>
         </w:trPr>
         <w:tc>
           <w:tcPr>
@@ -1438,7 +1008,7 @@
           </w:p>
           <w:p>
             <w:pPr>
-              <w:spacing w:after="0" w:before="0"/>
+              <w:spacing w:after="80" w:before="0"/>
             </w:pPr>
             <w:r>
               <w:rPr>
@@ -1468,7 +1038,7 @@
           </w:p>
           <w:p>
             <w:pPr>
-              <w:spacing w:after="60" w:before="0"/>
+              <w:spacing w:after="120" w:before="0"/>
             </w:pPr>
             <w:r>
               <w:rPr>
@@ -1494,221 +1064,6 @@
                 <w:sz w:val="19"/>
               </w:rPr>
               <w:t>이에요.</w:t>
-            </w:r>
-          </w:p>
-          <w:tbl>
-            <w:tblPr>
-              <w:tblW w:type="auto" w:w="0"/>
-              <w:jc w:val="center"/>
-              <w:tblLook w:firstColumn="1" w:firstRow="1" w:lastColumn="0" w:lastRow="0" w:noHBand="0" w:noVBand="1" w:val="04A0"/>
-              <w:tblBorders>
-                <w:top w:val="single" w:sz="6" w:color="E8A5C4"/>
-                <w:left w:val="single" w:sz="6" w:color="E8A5C4"/>
-                <w:bottom w:val="single" w:sz="6" w:color="E8A5C4"/>
-                <w:right w:val="single" w:sz="6" w:color="E8A5C4"/>
-                <w:insideH w:val="single" w:sz="6" w:color="E8A5C4"/>
-                <w:insideV w:val="single" w:sz="6" w:color="E8A5C4"/>
-              </w:tblBorders>
-              <w:tblLayout w:type="fixed"/>
-              <w:tblCellMar>
-                <w:top w:w="20" w:type="dxa"/>
-                <w:left w:w="80" w:type="dxa"/>
-                <w:bottom w:w="20" w:type="dxa"/>
-                <w:right w:w="60" w:type="dxa"/>
-              </w:tblCellMar>
-              <w:tblLayout w:type="fixed"/>
-            </w:tblPr>
-            <w:tblGrid>
-              <w:gridCol w:w="3742"/>
-              <w:gridCol w:w="907"/>
-            </w:tblGrid>
-            <w:tr>
-              <w:trPr>
-                <w:trHeight w:val="294" w:hRule="atLeast"/>
-              </w:trPr>
-              <w:tc>
-                <w:tcPr>
-                  <w:tcW w:type="dxa" w:w="3742"/>
-                </w:tcPr>
-                <w:p>
-                  <w:pPr>
-                    <w:spacing w:after="0" w:before="0"/>
-                  </w:pPr>
-                  <w:r>
-                    <w:rPr>
-                      <w:rFonts w:ascii="한컴 말랑말랑 Regular" w:hAnsi="한컴 말랑말랑 Regular" w:eastAsia="한컴 말랑말랑 Regular" w:cs="한컴 말랑말랑 Regular"/>
-                      <w:b w:val="0"/>
-                      <w:sz w:val="18"/>
-                    </w:rPr>
-                    <w:t>✖ 상황에 없는 숫자나 사실을 말했다</w:t>
-                  </w:r>
-                </w:p>
-              </w:tc>
-              <w:tc>
-                <w:tcPr>
-                  <w:tcW w:type="dxa" w:w="907"/>
-                </w:tcPr>
-                <w:p>
-                  <w:pPr>
-                    <w:spacing w:after="0" w:before="0"/>
-                    <w:jc w:val="center"/>
-                  </w:pPr>
-                  <w:r>
-                    <w:rPr>
-                      <w:rFonts w:ascii="한컴 말랑말랑 Bold" w:hAnsi="한컴 말랑말랑 Bold" w:eastAsia="한컴 말랑말랑 Bold" w:cs="한컴 말랑말랑 Bold"/>
-                      <w:b/>
-                      <w:color w:val="1F3A5F"/>
-                      <w:sz w:val="20"/>
-                    </w:rPr>
-                    <w:t>○ ×</w:t>
-                  </w:r>
-                </w:p>
-              </w:tc>
-            </w:tr>
-            <w:tr>
-              <w:trPr>
-                <w:trHeight w:val="294" w:hRule="atLeast"/>
-              </w:trPr>
-              <w:tc>
-                <w:tcPr>
-                  <w:tcW w:type="dxa" w:w="3742"/>
-                </w:tcPr>
-                <w:p>
-                  <w:pPr>
-                    <w:spacing w:after="0" w:before="0"/>
-                  </w:pPr>
-                  <w:r>
-                    <w:rPr>
-                      <w:rFonts w:ascii="한컴 말랑말랑 Regular" w:hAnsi="한컴 말랑말랑 Regular" w:eastAsia="한컴 말랑말랑 Regular" w:cs="한컴 말랑말랑 Regular"/>
-                      <w:b w:val="0"/>
-                      <w:sz w:val="18"/>
-                    </w:rPr>
-                    <w:t>✖ 무섭거나 자세하게 묘사했다</w:t>
-                  </w:r>
-                </w:p>
-              </w:tc>
-              <w:tc>
-                <w:tcPr>
-                  <w:tcW w:type="dxa" w:w="907"/>
-                </w:tcPr>
-                <w:p>
-                  <w:pPr>
-                    <w:spacing w:after="0" w:before="0"/>
-                    <w:jc w:val="center"/>
-                  </w:pPr>
-                  <w:r>
-                    <w:rPr>
-                      <w:rFonts w:ascii="한컴 말랑말랑 Bold" w:hAnsi="한컴 말랑말랑 Bold" w:eastAsia="한컴 말랑말랑 Bold" w:cs="한컴 말랑말랑 Bold"/>
-                      <w:b/>
-                      <w:color w:val="1F3A5F"/>
-                      <w:sz w:val="20"/>
-                    </w:rPr>
-                    <w:t>○ ×</w:t>
-                  </w:r>
-                </w:p>
-              </w:tc>
-            </w:tr>
-            <w:tr>
-              <w:trPr>
-                <w:trHeight w:val="294" w:hRule="atLeast"/>
-              </w:trPr>
-              <w:tc>
-                <w:tcPr>
-                  <w:tcW w:type="dxa" w:w="3742"/>
-                </w:tcPr>
-                <w:p>
-                  <w:pPr>
-                    <w:spacing w:after="0" w:before="0"/>
-                  </w:pPr>
-                  <w:r>
-                    <w:rPr>
-                      <w:rFonts w:ascii="한컴 말랑말랑 Regular" w:hAnsi="한컴 말랑말랑 Regular" w:eastAsia="한컴 말랑말랑 Regular" w:cs="한컴 말랑말랑 Regular"/>
-                      <w:b w:val="0"/>
-                      <w:sz w:val="18"/>
-                    </w:rPr>
-                    <w:t>✖ 불쌍한 사람으로만 그렸다</w:t>
-                  </w:r>
-                </w:p>
-              </w:tc>
-              <w:tc>
-                <w:tcPr>
-                  <w:tcW w:type="dxa" w:w="907"/>
-                </w:tcPr>
-                <w:p>
-                  <w:pPr>
-                    <w:spacing w:after="0" w:before="0"/>
-                    <w:jc w:val="center"/>
-                  </w:pPr>
-                  <w:r>
-                    <w:rPr>
-                      <w:rFonts w:ascii="한컴 말랑말랑 Bold" w:hAnsi="한컴 말랑말랑 Bold" w:eastAsia="한컴 말랑말랑 Bold" w:cs="한컴 말랑말랑 Bold"/>
-                      <w:b/>
-                      <w:color w:val="1F3A5F"/>
-                      <w:sz w:val="20"/>
-                    </w:rPr>
-                    <w:t>○ ×</w:t>
-                  </w:r>
-                </w:p>
-              </w:tc>
-            </w:tr>
-            <w:tr>
-              <w:trPr>
-                <w:trHeight w:val="294" w:hRule="atLeast"/>
-              </w:trPr>
-              <w:tc>
-                <w:tcPr>
-                  <w:tcW w:type="dxa" w:w="3742"/>
-                  <w:shd w:val="clear" w:color="auto" w:fill="E2F0EC"/>
-                </w:tcPr>
-                <w:p>
-                  <w:pPr>
-                    <w:spacing w:after="0" w:before="0"/>
-                  </w:pPr>
-                  <w:r>
-                    <w:rPr>
-                      <w:rFonts w:ascii="한컴 말랑말랑 Regular" w:hAnsi="한컴 말랑말랑 Regular" w:eastAsia="한컴 말랑말랑 Regular" w:cs="한컴 말랑말랑 Regular"/>
-                      <w:b w:val="0"/>
-                      <w:sz w:val="18"/>
-                    </w:rPr>
-                    <w:t>✔ 좋은 점과 어려운 점을 둘 다 말해 줬다</w:t>
-                  </w:r>
-                </w:p>
-              </w:tc>
-              <w:tc>
-                <w:tcPr>
-                  <w:tcW w:type="dxa" w:w="907"/>
-                  <w:shd w:val="clear" w:color="auto" w:fill="E2F0EC"/>
-                </w:tcPr>
-                <w:p>
-                  <w:pPr>
-                    <w:spacing w:after="0" w:before="0"/>
-                    <w:jc w:val="center"/>
-                  </w:pPr>
-                  <w:r>
-                    <w:rPr>
-                      <w:rFonts w:ascii="한컴 말랑말랑 Bold" w:hAnsi="한컴 말랑말랑 Bold" w:eastAsia="한컴 말랑말랑 Bold" w:cs="한컴 말랑말랑 Bold"/>
-                      <w:b/>
-                      <w:color w:val="1F3A5F"/>
-                      <w:sz w:val="20"/>
-                    </w:rPr>
-                    <w:t>○ ×</w:t>
-                  </w:r>
-                </w:p>
-              </w:tc>
-            </w:tr>
-          </w:tbl>
-          <w:p>
-            <w:pPr>
-              <w:spacing w:after="60" w:before="20"/>
-            </w:pPr>
-            <w:r>
-              <w:rPr>
-                <w:rFonts w:ascii="한컴 말랑말랑 Regular" w:hAnsi="한컴 말랑말랑 Regular" w:eastAsia="한컴 말랑말랑 Regular" w:cs="한컴 말랑말랑 Regular"/>
-                <w:b w:val="0"/>
-                <w:color w:val="666666"/>
-                <w:sz w:val="15"/>
-              </w:rPr>
-              <w:t>(✖ 줄은 ○가 나오면 만든 모둠이 고칠 곳, ✔ 줄은 ×가 나오면 고칠 곳)</w:t>
             </w:r>
           </w:p>
           <w:p>
@@ -2024,7 +1379,7 @@
           </w:p>
           <w:p>
             <w:pPr>
-              <w:spacing w:after="0" w:before="0"/>
+              <w:spacing w:after="80" w:before="0"/>
             </w:pPr>
             <w:r>
               <w:rPr>
@@ -2054,7 +1409,7 @@
           </w:p>
           <w:p>
             <w:pPr>
-              <w:spacing w:after="60" w:before="0"/>
+              <w:spacing w:after="120" w:before="0"/>
             </w:pPr>
             <w:r>
               <w:rPr>
@@ -2080,221 +1435,6 @@
                 <w:sz w:val="19"/>
               </w:rPr>
               <w:t>이에요.</w:t>
-            </w:r>
-          </w:p>
-          <w:tbl>
-            <w:tblPr>
-              <w:tblW w:type="auto" w:w="0"/>
-              <w:jc w:val="center"/>
-              <w:tblLook w:firstColumn="1" w:firstRow="1" w:lastColumn="0" w:lastRow="0" w:noHBand="0" w:noVBand="1" w:val="04A0"/>
-              <w:tblBorders>
-                <w:top w:val="single" w:sz="6" w:color="E8A5C4"/>
-                <w:left w:val="single" w:sz="6" w:color="E8A5C4"/>
-                <w:bottom w:val="single" w:sz="6" w:color="E8A5C4"/>
-                <w:right w:val="single" w:sz="6" w:color="E8A5C4"/>
-                <w:insideH w:val="single" w:sz="6" w:color="E8A5C4"/>
-                <w:insideV w:val="single" w:sz="6" w:color="E8A5C4"/>
-              </w:tblBorders>
-              <w:tblLayout w:type="fixed"/>
-              <w:tblCellMar>
-                <w:top w:w="20" w:type="dxa"/>
-                <w:left w:w="80" w:type="dxa"/>
-                <w:bottom w:w="20" w:type="dxa"/>
-                <w:right w:w="60" w:type="dxa"/>
-              </w:tblCellMar>
-              <w:tblLayout w:type="fixed"/>
-            </w:tblPr>
-            <w:tblGrid>
-              <w:gridCol w:w="3742"/>
-              <w:gridCol w:w="907"/>
-            </w:tblGrid>
-            <w:tr>
-              <w:trPr>
-                <w:trHeight w:val="294" w:hRule="atLeast"/>
-              </w:trPr>
-              <w:tc>
-                <w:tcPr>
-                  <w:tcW w:type="dxa" w:w="3742"/>
-                </w:tcPr>
-                <w:p>
-                  <w:pPr>
-                    <w:spacing w:after="0" w:before="0"/>
-                  </w:pPr>
-                  <w:r>
-                    <w:rPr>
-                      <w:rFonts w:ascii="한컴 말랑말랑 Regular" w:hAnsi="한컴 말랑말랑 Regular" w:eastAsia="한컴 말랑말랑 Regular" w:cs="한컴 말랑말랑 Regular"/>
-                      <w:b w:val="0"/>
-                      <w:sz w:val="18"/>
-                    </w:rPr>
-                    <w:t>✖ 상황에 없는 숫자나 사실을 말했다</w:t>
-                  </w:r>
-                </w:p>
-              </w:tc>
-              <w:tc>
-                <w:tcPr>
-                  <w:tcW w:type="dxa" w:w="907"/>
-                </w:tcPr>
-                <w:p>
-                  <w:pPr>
-                    <w:spacing w:after="0" w:before="0"/>
-                    <w:jc w:val="center"/>
-                  </w:pPr>
-                  <w:r>
-                    <w:rPr>
-                      <w:rFonts w:ascii="한컴 말랑말랑 Bold" w:hAnsi="한컴 말랑말랑 Bold" w:eastAsia="한컴 말랑말랑 Bold" w:cs="한컴 말랑말랑 Bold"/>
-                      <w:b/>
-                      <w:color w:val="1F3A5F"/>
-                      <w:sz w:val="20"/>
-                    </w:rPr>
-                    <w:t>○ ×</w:t>
-                  </w:r>
-                </w:p>
-              </w:tc>
-            </w:tr>
-            <w:tr>
-              <w:trPr>
-                <w:trHeight w:val="294" w:hRule="atLeast"/>
-              </w:trPr>
-              <w:tc>
-                <w:tcPr>
-                  <w:tcW w:type="dxa" w:w="3742"/>
-                </w:tcPr>
-                <w:p>
-                  <w:pPr>
-                    <w:spacing w:after="0" w:before="0"/>
-                  </w:pPr>
-                  <w:r>
-                    <w:rPr>
-                      <w:rFonts w:ascii="한컴 말랑말랑 Regular" w:hAnsi="한컴 말랑말랑 Regular" w:eastAsia="한컴 말랑말랑 Regular" w:cs="한컴 말랑말랑 Regular"/>
-                      <w:b w:val="0"/>
-                      <w:sz w:val="18"/>
-                    </w:rPr>
-                    <w:t>✖ 무섭거나 자세하게 묘사했다</w:t>
-                  </w:r>
-                </w:p>
-              </w:tc>
-              <w:tc>
-                <w:tcPr>
-                  <w:tcW w:type="dxa" w:w="907"/>
-                </w:tcPr>
-                <w:p>
-                  <w:pPr>
-                    <w:spacing w:after="0" w:before="0"/>
-                    <w:jc w:val="center"/>
-                  </w:pPr>
-                  <w:r>
-                    <w:rPr>
-                      <w:rFonts w:ascii="한컴 말랑말랑 Bold" w:hAnsi="한컴 말랑말랑 Bold" w:eastAsia="한컴 말랑말랑 Bold" w:cs="한컴 말랑말랑 Bold"/>
-                      <w:b/>
-                      <w:color w:val="1F3A5F"/>
-                      <w:sz w:val="20"/>
-                    </w:rPr>
-                    <w:t>○ ×</w:t>
-                  </w:r>
-                </w:p>
-              </w:tc>
-            </w:tr>
-            <w:tr>
-              <w:trPr>
-                <w:trHeight w:val="294" w:hRule="atLeast"/>
-              </w:trPr>
-              <w:tc>
-                <w:tcPr>
-                  <w:tcW w:type="dxa" w:w="3742"/>
-                </w:tcPr>
-                <w:p>
-                  <w:pPr>
-                    <w:spacing w:after="0" w:before="0"/>
-                  </w:pPr>
-                  <w:r>
-                    <w:rPr>
-                      <w:rFonts w:ascii="한컴 말랑말랑 Regular" w:hAnsi="한컴 말랑말랑 Regular" w:eastAsia="한컴 말랑말랑 Regular" w:cs="한컴 말랑말랑 Regular"/>
-                      <w:b w:val="0"/>
-                      <w:sz w:val="18"/>
-                    </w:rPr>
-                    <w:t>✖ 불쌍한 사람으로만 그렸다</w:t>
-                  </w:r>
-                </w:p>
-              </w:tc>
-              <w:tc>
-                <w:tcPr>
-                  <w:tcW w:type="dxa" w:w="907"/>
-                </w:tcPr>
-                <w:p>
-                  <w:pPr>
-                    <w:spacing w:after="0" w:before="0"/>
-                    <w:jc w:val="center"/>
-                  </w:pPr>
-                  <w:r>
-                    <w:rPr>
-                      <w:rFonts w:ascii="한컴 말랑말랑 Bold" w:hAnsi="한컴 말랑말랑 Bold" w:eastAsia="한컴 말랑말랑 Bold" w:cs="한컴 말랑말랑 Bold"/>
-                      <w:b/>
-                      <w:color w:val="1F3A5F"/>
-                      <w:sz w:val="20"/>
-                    </w:rPr>
-                    <w:t>○ ×</w:t>
-                  </w:r>
-                </w:p>
-              </w:tc>
-            </w:tr>
-            <w:tr>
-              <w:trPr>
-                <w:trHeight w:val="294" w:hRule="atLeast"/>
-              </w:trPr>
-              <w:tc>
-                <w:tcPr>
-                  <w:tcW w:type="dxa" w:w="3742"/>
-                  <w:shd w:val="clear" w:color="auto" w:fill="E2F0EC"/>
-                </w:tcPr>
-                <w:p>
-                  <w:pPr>
-                    <w:spacing w:after="0" w:before="0"/>
-                  </w:pPr>
-                  <w:r>
-                    <w:rPr>
-                      <w:rFonts w:ascii="한컴 말랑말랑 Regular" w:hAnsi="한컴 말랑말랑 Regular" w:eastAsia="한컴 말랑말랑 Regular" w:cs="한컴 말랑말랑 Regular"/>
-                      <w:b w:val="0"/>
-                      <w:sz w:val="18"/>
-                    </w:rPr>
-                    <w:t>✔ 좋은 점과 어려운 점을 둘 다 말해 줬다</w:t>
-                  </w:r>
-                </w:p>
-              </w:tc>
-              <w:tc>
-                <w:tcPr>
-                  <w:tcW w:type="dxa" w:w="907"/>
-                  <w:shd w:val="clear" w:color="auto" w:fill="E2F0EC"/>
-                </w:tcPr>
-                <w:p>
-                  <w:pPr>
-                    <w:spacing w:after="0" w:before="0"/>
-                    <w:jc w:val="center"/>
-                  </w:pPr>
-                  <w:r>
-                    <w:rPr>
-                      <w:rFonts w:ascii="한컴 말랑말랑 Bold" w:hAnsi="한컴 말랑말랑 Bold" w:eastAsia="한컴 말랑말랑 Bold" w:cs="한컴 말랑말랑 Bold"/>
-                      <w:b/>
-                      <w:color w:val="1F3A5F"/>
-                      <w:sz w:val="20"/>
-                    </w:rPr>
-                    <w:t>○ ×</w:t>
-                  </w:r>
-                </w:p>
-              </w:tc>
-            </w:tr>
-          </w:tbl>
-          <w:p>
-            <w:pPr>
-              <w:spacing w:after="60" w:before="20"/>
-            </w:pPr>
-            <w:r>
-              <w:rPr>
-                <w:rFonts w:ascii="한컴 말랑말랑 Regular" w:hAnsi="한컴 말랑말랑 Regular" w:eastAsia="한컴 말랑말랑 Regular" w:cs="한컴 말랑말랑 Regular"/>
-                <w:b w:val="0"/>
-                <w:color w:val="666666"/>
-                <w:sz w:val="15"/>
-              </w:rPr>
-              <w:t>(✖ 줄은 ○가 나오면 만든 모둠이 고칠 곳, ✔ 줄은 ×가 나오면 고칠 곳)</w:t>
             </w:r>
           </w:p>
           <w:p>

</xml_diff>

<commit_message>
Review card: roomier writing lines after removing the check table
Co-Authored-By: Claude Fable 5.1 <noreply@anthropic.com>
</commit_message>
<xml_diff>
--- a/worksheets/친구NPC_검토카드.docx
+++ b/worksheets/친구NPC_검토카드.docx
@@ -44,7 +44,7 @@
       </w:tblGrid>
       <w:tr>
         <w:trPr>
-          <w:trHeight w:val="6010" w:hRule="exact"/>
+          <w:trHeight w:val="7484" w:hRule="exact"/>
         </w:trPr>
         <w:tc>
           <w:tcPr>
@@ -156,37 +156,42 @@
           </w:tbl>
           <w:p>
             <w:pPr>
-              <w:spacing w:after="20" w:before="40"/>
+              <w:spacing w:after="120" w:before="120"/>
             </w:pPr>
             <w:r>
               <w:rPr>
                 <w:rFonts w:ascii="한컴 말랑말랑 Regular" w:hAnsi="한컴 말랑말랑 Regular" w:eastAsia="한컴 말랑말랑 Regular" w:cs="한컴 말랑말랑 Regular"/>
                 <w:b w:val="0"/>
-                <w:sz w:val="19"/>
+                <w:sz w:val="20"/>
               </w:rPr>
-              <w:t>NPC 이름: ____________</w:t>
+              <w:t>NPC 이름: ______________</w:t>
             </w:r>
           </w:p>
           <w:p>
             <w:pPr>
-              <w:spacing w:after="80" w:before="0"/>
+              <w:spacing w:after="40" w:before="0"/>
             </w:pPr>
             <w:r>
               <w:rPr>
                 <w:rFonts w:ascii="한컴 말랑말랑 Regular" w:hAnsi="한컴 말랑말랑 Regular" w:eastAsia="한컴 말랑말랑 Regular" w:cs="한컴 말랑말랑 Regular"/>
                 <w:b w:val="0"/>
-                <w:sz w:val="19"/>
+                <w:sz w:val="20"/>
               </w:rPr>
-              <w:t xml:space="preserve">우리가 담으려던 이 친구의 마음 (낱말 하나): </w:t>
+              <w:t>우리가 담으려던 이 친구의 마음 (낱말 하나)</w:t>
             </w:r>
+          </w:p>
+          <w:p>
+            <w:pPr>
+              <w:spacing w:after="200" w:before="0"/>
+            </w:pPr>
             <w:r>
               <w:rPr>
                 <w:rFonts w:ascii="한컴 말랑말랑 Regular" w:hAnsi="한컴 말랑말랑 Regular" w:eastAsia="한컴 말랑말랑 Regular" w:cs="한컴 말랑말랑 Regular"/>
                 <w:b w:val="0"/>
                 <w:color w:val="1F3A5F"/>
-                <w:sz w:val="19"/>
+                <w:sz w:val="20"/>
               </w:rPr>
-              <w:t>__________</w:t>
+              <w:t>➜ ________________________</w:t>
             </w:r>
           </w:p>
           <w:tbl>
@@ -248,26 +253,26 @@
           </w:tbl>
           <w:p>
             <w:pPr>
-              <w:spacing w:after="20" w:before="40"/>
+              <w:spacing w:after="160" w:before="120"/>
             </w:pPr>
             <w:r>
               <w:rPr>
                 <w:rFonts w:ascii="한컴 말랑말랑 Regular" w:hAnsi="한컴 말랑말랑 Regular" w:eastAsia="한컴 말랑말랑 Regular" w:cs="한컴 말랑말랑 Regular"/>
                 <w:b w:val="0"/>
-                <w:sz w:val="19"/>
+                <w:sz w:val="20"/>
               </w:rPr>
-              <w:t>NPC 이름: ____________   만든 모둠: ____모둠</w:t>
+              <w:t>NPC 이름: ______________   만든 모둠: ____모둠</w:t>
             </w:r>
           </w:p>
           <w:p>
             <w:pPr>
-              <w:spacing w:after="80" w:before="0"/>
+              <w:spacing w:after="160" w:before="0"/>
             </w:pPr>
             <w:r>
               <w:rPr>
                 <w:rFonts w:ascii="한컴 말랑말랑 Regular" w:hAnsi="한컴 말랑말랑 Regular" w:eastAsia="한컴 말랑말랑 Regular" w:cs="한컴 말랑말랑 Regular"/>
                 <w:b w:val="0"/>
-                <w:sz w:val="19"/>
+                <w:sz w:val="20"/>
               </w:rPr>
               <w:t xml:space="preserve">이 친구의 마음은 </w:t>
             </w:r>
@@ -276,28 +281,28 @@
                 <w:rFonts w:ascii="한컴 말랑말랑 Regular" w:hAnsi="한컴 말랑말랑 Regular" w:eastAsia="한컴 말랑말랑 Regular" w:cs="한컴 말랑말랑 Regular"/>
                 <w:b w:val="0"/>
                 <w:color w:val="1F3A5F"/>
-                <w:sz w:val="19"/>
+                <w:sz w:val="20"/>
               </w:rPr>
-              <w:t>__________</w:t>
+              <w:t>______________</w:t>
             </w:r>
             <w:r>
               <w:rPr>
                 <w:rFonts w:ascii="한컴 말랑말랑 Regular" w:hAnsi="한컴 말랑말랑 Regular" w:eastAsia="한컴 말랑말랑 Regular" w:cs="한컴 말랑말랑 Regular"/>
                 <w:b w:val="0"/>
-                <w:sz w:val="19"/>
+                <w:sz w:val="20"/>
               </w:rPr>
               <w:t>이고,</w:t>
             </w:r>
           </w:p>
           <w:p>
             <w:pPr>
-              <w:spacing w:after="120" w:before="0"/>
+              <w:spacing w:after="40" w:before="0"/>
             </w:pPr>
             <w:r>
               <w:rPr>
                 <w:rFonts w:ascii="한컴 말랑말랑 Regular" w:hAnsi="한컴 말랑말랑 Regular" w:eastAsia="한컴 말랑말랑 Regular" w:cs="한컴 말랑말랑 Regular"/>
                 <w:b w:val="0"/>
-                <w:sz w:val="19"/>
+                <w:sz w:val="20"/>
               </w:rPr>
               <w:t xml:space="preserve">가장 바라는 것은 </w:t>
             </w:r>
@@ -306,28 +311,42 @@
                 <w:rFonts w:ascii="한컴 말랑말랑 Regular" w:hAnsi="한컴 말랑말랑 Regular" w:eastAsia="한컴 말랑말랑 Regular" w:cs="한컴 말랑말랑 Regular"/>
                 <w:b w:val="0"/>
                 <w:color w:val="1F3A5F"/>
-                <w:sz w:val="19"/>
+                <w:sz w:val="20"/>
               </w:rPr>
-              <w:t>______________________</w:t>
+              <w:t>____________________</w:t>
             </w:r>
             <w:r>
               <w:rPr>
                 <w:rFonts w:ascii="한컴 말랑말랑 Regular" w:hAnsi="한컴 말랑말랑 Regular" w:eastAsia="한컴 말랑말랑 Regular" w:cs="한컴 말랑말랑 Regular"/>
                 <w:b w:val="0"/>
-                <w:sz w:val="19"/>
+                <w:sz w:val="20"/>
               </w:rPr>
               <w:t>이에요.</w:t>
             </w:r>
           </w:p>
           <w:p>
             <w:pPr>
-              <w:spacing w:after="80" w:before="0"/>
+              <w:spacing w:after="200" w:before="0"/>
             </w:pPr>
             <w:r>
               <w:rPr>
                 <w:rFonts w:ascii="한컴 말랑말랑 Regular" w:hAnsi="한컴 말랑말랑 Regular" w:eastAsia="한컴 말랑말랑 Regular" w:cs="한컴 말랑말랑 Regular"/>
                 <w:b w:val="0"/>
-                <w:sz w:val="19"/>
+                <w:color w:val="1F3A5F"/>
+                <w:sz w:val="20"/>
+              </w:rPr>
+              <w:t>________________________________</w:t>
+            </w:r>
+          </w:p>
+          <w:p>
+            <w:pPr>
+              <w:spacing w:after="200" w:before="0"/>
+            </w:pPr>
+            <w:r>
+              <w:rPr>
+                <w:rFonts w:ascii="한컴 말랑말랑 Regular" w:hAnsi="한컴 말랑말랑 Regular" w:eastAsia="한컴 말랑말랑 Regular" w:cs="한컴 말랑말랑 Regular"/>
+                <w:b w:val="0"/>
+                <w:sz w:val="20"/>
               </w:rPr>
               <w:t xml:space="preserve">내 선택:  </w:t>
             </w:r>
@@ -336,7 +355,7 @@
                 <w:rFonts w:ascii="한컴 말랑말랑 Bold" w:hAnsi="한컴 말랑말랑 Bold" w:eastAsia="한컴 말랑말랑 Bold" w:cs="한컴 말랑말랑 Bold"/>
                 <w:b/>
                 <w:color w:val="1F3A5F"/>
-                <w:sz w:val="19"/>
+                <w:sz w:val="20"/>
               </w:rPr>
               <w:t>A · B · C</w:t>
             </w:r>
@@ -344,24 +363,24 @@
               <w:rPr>
                 <w:rFonts w:ascii="한컴 말랑말랑 Regular" w:hAnsi="한컴 말랑말랑 Regular" w:eastAsia="한컴 말랑말랑 Regular" w:cs="한컴 말랑말랑 Regular"/>
                 <w:b w:val="0"/>
-                <w:sz w:val="19"/>
+                <w:sz w:val="20"/>
               </w:rPr>
-              <w:t xml:space="preserve"> 중 (   ), </w:t>
+              <w:t xml:space="preserve"> 중 (    ), </w:t>
             </w:r>
             <w:r>
               <w:rPr>
                 <w:rFonts w:ascii="한컴 말랑말랑 Regular" w:hAnsi="한컴 말랑말랑 Regular" w:eastAsia="한컴 말랑말랑 Regular" w:cs="한컴 말랑말랑 Regular"/>
                 <w:b w:val="0"/>
                 <w:color w:val="1F3A5F"/>
-                <w:sz w:val="19"/>
+                <w:sz w:val="20"/>
               </w:rPr>
-              <w:t>__________</w:t>
+              <w:t>____________</w:t>
             </w:r>
             <w:r>
               <w:rPr>
                 <w:rFonts w:ascii="한컴 말랑말랑 Regular" w:hAnsi="한컴 말랑말랑 Regular" w:eastAsia="한컴 말랑말랑 Regular" w:cs="한컴 말랑말랑 Regular"/>
                 <w:b w:val="0"/>
-                <w:sz w:val="19"/>
+                <w:sz w:val="20"/>
               </w:rPr>
               <w:t>와 함께.</w:t>
             </w:r>
@@ -527,37 +546,42 @@
           </w:tbl>
           <w:p>
             <w:pPr>
-              <w:spacing w:after="20" w:before="40"/>
+              <w:spacing w:after="120" w:before="120"/>
             </w:pPr>
             <w:r>
               <w:rPr>
                 <w:rFonts w:ascii="한컴 말랑말랑 Regular" w:hAnsi="한컴 말랑말랑 Regular" w:eastAsia="한컴 말랑말랑 Regular" w:cs="한컴 말랑말랑 Regular"/>
                 <w:b w:val="0"/>
-                <w:sz w:val="19"/>
+                <w:sz w:val="20"/>
               </w:rPr>
-              <w:t>NPC 이름: ____________</w:t>
+              <w:t>NPC 이름: ______________</w:t>
             </w:r>
           </w:p>
           <w:p>
             <w:pPr>
-              <w:spacing w:after="80" w:before="0"/>
+              <w:spacing w:after="40" w:before="0"/>
             </w:pPr>
             <w:r>
               <w:rPr>
                 <w:rFonts w:ascii="한컴 말랑말랑 Regular" w:hAnsi="한컴 말랑말랑 Regular" w:eastAsia="한컴 말랑말랑 Regular" w:cs="한컴 말랑말랑 Regular"/>
                 <w:b w:val="0"/>
-                <w:sz w:val="19"/>
+                <w:sz w:val="20"/>
               </w:rPr>
-              <w:t xml:space="preserve">우리가 담으려던 이 친구의 마음 (낱말 하나): </w:t>
+              <w:t>우리가 담으려던 이 친구의 마음 (낱말 하나)</w:t>
             </w:r>
+          </w:p>
+          <w:p>
+            <w:pPr>
+              <w:spacing w:after="200" w:before="0"/>
+            </w:pPr>
             <w:r>
               <w:rPr>
                 <w:rFonts w:ascii="한컴 말랑말랑 Regular" w:hAnsi="한컴 말랑말랑 Regular" w:eastAsia="한컴 말랑말랑 Regular" w:cs="한컴 말랑말랑 Regular"/>
                 <w:b w:val="0"/>
                 <w:color w:val="1F3A5F"/>
-                <w:sz w:val="19"/>
+                <w:sz w:val="20"/>
               </w:rPr>
-              <w:t>__________</w:t>
+              <w:t>➜ ________________________</w:t>
             </w:r>
           </w:p>
           <w:tbl>
@@ -619,26 +643,26 @@
           </w:tbl>
           <w:p>
             <w:pPr>
-              <w:spacing w:after="20" w:before="40"/>
+              <w:spacing w:after="160" w:before="120"/>
             </w:pPr>
             <w:r>
               <w:rPr>
                 <w:rFonts w:ascii="한컴 말랑말랑 Regular" w:hAnsi="한컴 말랑말랑 Regular" w:eastAsia="한컴 말랑말랑 Regular" w:cs="한컴 말랑말랑 Regular"/>
                 <w:b w:val="0"/>
-                <w:sz w:val="19"/>
+                <w:sz w:val="20"/>
               </w:rPr>
-              <w:t>NPC 이름: ____________   만든 모둠: ____모둠</w:t>
+              <w:t>NPC 이름: ______________   만든 모둠: ____모둠</w:t>
             </w:r>
           </w:p>
           <w:p>
             <w:pPr>
-              <w:spacing w:after="80" w:before="0"/>
+              <w:spacing w:after="160" w:before="0"/>
             </w:pPr>
             <w:r>
               <w:rPr>
                 <w:rFonts w:ascii="한컴 말랑말랑 Regular" w:hAnsi="한컴 말랑말랑 Regular" w:eastAsia="한컴 말랑말랑 Regular" w:cs="한컴 말랑말랑 Regular"/>
                 <w:b w:val="0"/>
-                <w:sz w:val="19"/>
+                <w:sz w:val="20"/>
               </w:rPr>
               <w:t xml:space="preserve">이 친구의 마음은 </w:t>
             </w:r>
@@ -647,28 +671,28 @@
                 <w:rFonts w:ascii="한컴 말랑말랑 Regular" w:hAnsi="한컴 말랑말랑 Regular" w:eastAsia="한컴 말랑말랑 Regular" w:cs="한컴 말랑말랑 Regular"/>
                 <w:b w:val="0"/>
                 <w:color w:val="1F3A5F"/>
-                <w:sz w:val="19"/>
+                <w:sz w:val="20"/>
               </w:rPr>
-              <w:t>__________</w:t>
+              <w:t>______________</w:t>
             </w:r>
             <w:r>
               <w:rPr>
                 <w:rFonts w:ascii="한컴 말랑말랑 Regular" w:hAnsi="한컴 말랑말랑 Regular" w:eastAsia="한컴 말랑말랑 Regular" w:cs="한컴 말랑말랑 Regular"/>
                 <w:b w:val="0"/>
-                <w:sz w:val="19"/>
+                <w:sz w:val="20"/>
               </w:rPr>
               <w:t>이고,</w:t>
             </w:r>
           </w:p>
           <w:p>
             <w:pPr>
-              <w:spacing w:after="120" w:before="0"/>
+              <w:spacing w:after="40" w:before="0"/>
             </w:pPr>
             <w:r>
               <w:rPr>
                 <w:rFonts w:ascii="한컴 말랑말랑 Regular" w:hAnsi="한컴 말랑말랑 Regular" w:eastAsia="한컴 말랑말랑 Regular" w:cs="한컴 말랑말랑 Regular"/>
                 <w:b w:val="0"/>
-                <w:sz w:val="19"/>
+                <w:sz w:val="20"/>
               </w:rPr>
               <w:t xml:space="preserve">가장 바라는 것은 </w:t>
             </w:r>
@@ -677,28 +701,42 @@
                 <w:rFonts w:ascii="한컴 말랑말랑 Regular" w:hAnsi="한컴 말랑말랑 Regular" w:eastAsia="한컴 말랑말랑 Regular" w:cs="한컴 말랑말랑 Regular"/>
                 <w:b w:val="0"/>
                 <w:color w:val="1F3A5F"/>
-                <w:sz w:val="19"/>
+                <w:sz w:val="20"/>
               </w:rPr>
-              <w:t>______________________</w:t>
+              <w:t>____________________</w:t>
             </w:r>
             <w:r>
               <w:rPr>
                 <w:rFonts w:ascii="한컴 말랑말랑 Regular" w:hAnsi="한컴 말랑말랑 Regular" w:eastAsia="한컴 말랑말랑 Regular" w:cs="한컴 말랑말랑 Regular"/>
                 <w:b w:val="0"/>
-                <w:sz w:val="19"/>
+                <w:sz w:val="20"/>
               </w:rPr>
               <w:t>이에요.</w:t>
             </w:r>
           </w:p>
           <w:p>
             <w:pPr>
-              <w:spacing w:after="80" w:before="0"/>
+              <w:spacing w:after="200" w:before="0"/>
             </w:pPr>
             <w:r>
               <w:rPr>
                 <w:rFonts w:ascii="한컴 말랑말랑 Regular" w:hAnsi="한컴 말랑말랑 Regular" w:eastAsia="한컴 말랑말랑 Regular" w:cs="한컴 말랑말랑 Regular"/>
                 <w:b w:val="0"/>
-                <w:sz w:val="19"/>
+                <w:color w:val="1F3A5F"/>
+                <w:sz w:val="20"/>
+              </w:rPr>
+              <w:t>________________________________</w:t>
+            </w:r>
+          </w:p>
+          <w:p>
+            <w:pPr>
+              <w:spacing w:after="200" w:before="0"/>
+            </w:pPr>
+            <w:r>
+              <w:rPr>
+                <w:rFonts w:ascii="한컴 말랑말랑 Regular" w:hAnsi="한컴 말랑말랑 Regular" w:eastAsia="한컴 말랑말랑 Regular" w:cs="한컴 말랑말랑 Regular"/>
+                <w:b w:val="0"/>
+                <w:sz w:val="20"/>
               </w:rPr>
               <w:t xml:space="preserve">내 선택:  </w:t>
             </w:r>
@@ -707,7 +745,7 @@
                 <w:rFonts w:ascii="한컴 말랑말랑 Bold" w:hAnsi="한컴 말랑말랑 Bold" w:eastAsia="한컴 말랑말랑 Bold" w:cs="한컴 말랑말랑 Bold"/>
                 <w:b/>
                 <w:color w:val="1F3A5F"/>
-                <w:sz w:val="19"/>
+                <w:sz w:val="20"/>
               </w:rPr>
               <w:t>A · B · C</w:t>
             </w:r>
@@ -715,24 +753,24 @@
               <w:rPr>
                 <w:rFonts w:ascii="한컴 말랑말랑 Regular" w:hAnsi="한컴 말랑말랑 Regular" w:eastAsia="한컴 말랑말랑 Regular" w:cs="한컴 말랑말랑 Regular"/>
                 <w:b w:val="0"/>
-                <w:sz w:val="19"/>
+                <w:sz w:val="20"/>
               </w:rPr>
-              <w:t xml:space="preserve"> 중 (   ), </w:t>
+              <w:t xml:space="preserve"> 중 (    ), </w:t>
             </w:r>
             <w:r>
               <w:rPr>
                 <w:rFonts w:ascii="한컴 말랑말랑 Regular" w:hAnsi="한컴 말랑말랑 Regular" w:eastAsia="한컴 말랑말랑 Regular" w:cs="한컴 말랑말랑 Regular"/>
                 <w:b w:val="0"/>
                 <w:color w:val="1F3A5F"/>
-                <w:sz w:val="19"/>
+                <w:sz w:val="20"/>
               </w:rPr>
-              <w:t>__________</w:t>
+              <w:t>____________</w:t>
             </w:r>
             <w:r>
               <w:rPr>
                 <w:rFonts w:ascii="한컴 말랑말랑 Regular" w:hAnsi="한컴 말랑말랑 Regular" w:eastAsia="한컴 말랑말랑 Regular" w:cs="한컴 말랑말랑 Regular"/>
                 <w:b w:val="0"/>
-                <w:sz w:val="19"/>
+                <w:sz w:val="20"/>
               </w:rPr>
               <w:t>와 함께.</w:t>
             </w:r>
@@ -791,7 +829,7 @@
       </w:tr>
       <w:tr>
         <w:trPr>
-          <w:trHeight w:val="6010" w:hRule="exact"/>
+          <w:trHeight w:val="7484" w:hRule="exact"/>
         </w:trPr>
         <w:tc>
           <w:tcPr>
@@ -903,37 +941,42 @@
           </w:tbl>
           <w:p>
             <w:pPr>
-              <w:spacing w:after="20" w:before="40"/>
+              <w:spacing w:after="120" w:before="120"/>
             </w:pPr>
             <w:r>
               <w:rPr>
                 <w:rFonts w:ascii="한컴 말랑말랑 Regular" w:hAnsi="한컴 말랑말랑 Regular" w:eastAsia="한컴 말랑말랑 Regular" w:cs="한컴 말랑말랑 Regular"/>
                 <w:b w:val="0"/>
-                <w:sz w:val="19"/>
+                <w:sz w:val="20"/>
               </w:rPr>
-              <w:t>NPC 이름: ____________</w:t>
+              <w:t>NPC 이름: ______________</w:t>
             </w:r>
           </w:p>
           <w:p>
             <w:pPr>
-              <w:spacing w:after="80" w:before="0"/>
+              <w:spacing w:after="40" w:before="0"/>
             </w:pPr>
             <w:r>
               <w:rPr>
                 <w:rFonts w:ascii="한컴 말랑말랑 Regular" w:hAnsi="한컴 말랑말랑 Regular" w:eastAsia="한컴 말랑말랑 Regular" w:cs="한컴 말랑말랑 Regular"/>
                 <w:b w:val="0"/>
-                <w:sz w:val="19"/>
+                <w:sz w:val="20"/>
               </w:rPr>
-              <w:t xml:space="preserve">우리가 담으려던 이 친구의 마음 (낱말 하나): </w:t>
+              <w:t>우리가 담으려던 이 친구의 마음 (낱말 하나)</w:t>
             </w:r>
+          </w:p>
+          <w:p>
+            <w:pPr>
+              <w:spacing w:after="200" w:before="0"/>
+            </w:pPr>
             <w:r>
               <w:rPr>
                 <w:rFonts w:ascii="한컴 말랑말랑 Regular" w:hAnsi="한컴 말랑말랑 Regular" w:eastAsia="한컴 말랑말랑 Regular" w:cs="한컴 말랑말랑 Regular"/>
                 <w:b w:val="0"/>
                 <w:color w:val="1F3A5F"/>
-                <w:sz w:val="19"/>
+                <w:sz w:val="20"/>
               </w:rPr>
-              <w:t>__________</w:t>
+              <w:t>➜ ________________________</w:t>
             </w:r>
           </w:p>
           <w:tbl>
@@ -995,26 +1038,26 @@
           </w:tbl>
           <w:p>
             <w:pPr>
-              <w:spacing w:after="20" w:before="40"/>
+              <w:spacing w:after="160" w:before="120"/>
             </w:pPr>
             <w:r>
               <w:rPr>
                 <w:rFonts w:ascii="한컴 말랑말랑 Regular" w:hAnsi="한컴 말랑말랑 Regular" w:eastAsia="한컴 말랑말랑 Regular" w:cs="한컴 말랑말랑 Regular"/>
                 <w:b w:val="0"/>
-                <w:sz w:val="19"/>
+                <w:sz w:val="20"/>
               </w:rPr>
-              <w:t>NPC 이름: ____________   만든 모둠: ____모둠</w:t>
+              <w:t>NPC 이름: ______________   만든 모둠: ____모둠</w:t>
             </w:r>
           </w:p>
           <w:p>
             <w:pPr>
-              <w:spacing w:after="80" w:before="0"/>
+              <w:spacing w:after="160" w:before="0"/>
             </w:pPr>
             <w:r>
               <w:rPr>
                 <w:rFonts w:ascii="한컴 말랑말랑 Regular" w:hAnsi="한컴 말랑말랑 Regular" w:eastAsia="한컴 말랑말랑 Regular" w:cs="한컴 말랑말랑 Regular"/>
                 <w:b w:val="0"/>
-                <w:sz w:val="19"/>
+                <w:sz w:val="20"/>
               </w:rPr>
               <w:t xml:space="preserve">이 친구의 마음은 </w:t>
             </w:r>
@@ -1023,28 +1066,28 @@
                 <w:rFonts w:ascii="한컴 말랑말랑 Regular" w:hAnsi="한컴 말랑말랑 Regular" w:eastAsia="한컴 말랑말랑 Regular" w:cs="한컴 말랑말랑 Regular"/>
                 <w:b w:val="0"/>
                 <w:color w:val="1F3A5F"/>
-                <w:sz w:val="19"/>
+                <w:sz w:val="20"/>
               </w:rPr>
-              <w:t>__________</w:t>
+              <w:t>______________</w:t>
             </w:r>
             <w:r>
               <w:rPr>
                 <w:rFonts w:ascii="한컴 말랑말랑 Regular" w:hAnsi="한컴 말랑말랑 Regular" w:eastAsia="한컴 말랑말랑 Regular" w:cs="한컴 말랑말랑 Regular"/>
                 <w:b w:val="0"/>
-                <w:sz w:val="19"/>
+                <w:sz w:val="20"/>
               </w:rPr>
               <w:t>이고,</w:t>
             </w:r>
           </w:p>
           <w:p>
             <w:pPr>
-              <w:spacing w:after="120" w:before="0"/>
+              <w:spacing w:after="40" w:before="0"/>
             </w:pPr>
             <w:r>
               <w:rPr>
                 <w:rFonts w:ascii="한컴 말랑말랑 Regular" w:hAnsi="한컴 말랑말랑 Regular" w:eastAsia="한컴 말랑말랑 Regular" w:cs="한컴 말랑말랑 Regular"/>
                 <w:b w:val="0"/>
-                <w:sz w:val="19"/>
+                <w:sz w:val="20"/>
               </w:rPr>
               <w:t xml:space="preserve">가장 바라는 것은 </w:t>
             </w:r>
@@ -1053,28 +1096,42 @@
                 <w:rFonts w:ascii="한컴 말랑말랑 Regular" w:hAnsi="한컴 말랑말랑 Regular" w:eastAsia="한컴 말랑말랑 Regular" w:cs="한컴 말랑말랑 Regular"/>
                 <w:b w:val="0"/>
                 <w:color w:val="1F3A5F"/>
-                <w:sz w:val="19"/>
+                <w:sz w:val="20"/>
               </w:rPr>
-              <w:t>______________________</w:t>
+              <w:t>____________________</w:t>
             </w:r>
             <w:r>
               <w:rPr>
                 <w:rFonts w:ascii="한컴 말랑말랑 Regular" w:hAnsi="한컴 말랑말랑 Regular" w:eastAsia="한컴 말랑말랑 Regular" w:cs="한컴 말랑말랑 Regular"/>
                 <w:b w:val="0"/>
-                <w:sz w:val="19"/>
+                <w:sz w:val="20"/>
               </w:rPr>
               <w:t>이에요.</w:t>
             </w:r>
           </w:p>
           <w:p>
             <w:pPr>
-              <w:spacing w:after="80" w:before="0"/>
+              <w:spacing w:after="200" w:before="0"/>
             </w:pPr>
             <w:r>
               <w:rPr>
                 <w:rFonts w:ascii="한컴 말랑말랑 Regular" w:hAnsi="한컴 말랑말랑 Regular" w:eastAsia="한컴 말랑말랑 Regular" w:cs="한컴 말랑말랑 Regular"/>
                 <w:b w:val="0"/>
-                <w:sz w:val="19"/>
+                <w:color w:val="1F3A5F"/>
+                <w:sz w:val="20"/>
+              </w:rPr>
+              <w:t>________________________________</w:t>
+            </w:r>
+          </w:p>
+          <w:p>
+            <w:pPr>
+              <w:spacing w:after="200" w:before="0"/>
+            </w:pPr>
+            <w:r>
+              <w:rPr>
+                <w:rFonts w:ascii="한컴 말랑말랑 Regular" w:hAnsi="한컴 말랑말랑 Regular" w:eastAsia="한컴 말랑말랑 Regular" w:cs="한컴 말랑말랑 Regular"/>
+                <w:b w:val="0"/>
+                <w:sz w:val="20"/>
               </w:rPr>
               <w:t xml:space="preserve">내 선택:  </w:t>
             </w:r>
@@ -1083,7 +1140,7 @@
                 <w:rFonts w:ascii="한컴 말랑말랑 Bold" w:hAnsi="한컴 말랑말랑 Bold" w:eastAsia="한컴 말랑말랑 Bold" w:cs="한컴 말랑말랑 Bold"/>
                 <w:b/>
                 <w:color w:val="1F3A5F"/>
-                <w:sz w:val="19"/>
+                <w:sz w:val="20"/>
               </w:rPr>
               <w:t>A · B · C</w:t>
             </w:r>
@@ -1091,24 +1148,24 @@
               <w:rPr>
                 <w:rFonts w:ascii="한컴 말랑말랑 Regular" w:hAnsi="한컴 말랑말랑 Regular" w:eastAsia="한컴 말랑말랑 Regular" w:cs="한컴 말랑말랑 Regular"/>
                 <w:b w:val="0"/>
-                <w:sz w:val="19"/>
+                <w:sz w:val="20"/>
               </w:rPr>
-              <w:t xml:space="preserve"> 중 (   ), </w:t>
+              <w:t xml:space="preserve"> 중 (    ), </w:t>
             </w:r>
             <w:r>
               <w:rPr>
                 <w:rFonts w:ascii="한컴 말랑말랑 Regular" w:hAnsi="한컴 말랑말랑 Regular" w:eastAsia="한컴 말랑말랑 Regular" w:cs="한컴 말랑말랑 Regular"/>
                 <w:b w:val="0"/>
                 <w:color w:val="1F3A5F"/>
-                <w:sz w:val="19"/>
+                <w:sz w:val="20"/>
               </w:rPr>
-              <w:t>__________</w:t>
+              <w:t>____________</w:t>
             </w:r>
             <w:r>
               <w:rPr>
                 <w:rFonts w:ascii="한컴 말랑말랑 Regular" w:hAnsi="한컴 말랑말랑 Regular" w:eastAsia="한컴 말랑말랑 Regular" w:cs="한컴 말랑말랑 Regular"/>
                 <w:b w:val="0"/>
-                <w:sz w:val="19"/>
+                <w:sz w:val="20"/>
               </w:rPr>
               <w:t>와 함께.</w:t>
             </w:r>
@@ -1274,37 +1331,42 @@
           </w:tbl>
           <w:p>
             <w:pPr>
-              <w:spacing w:after="20" w:before="40"/>
+              <w:spacing w:after="120" w:before="120"/>
             </w:pPr>
             <w:r>
               <w:rPr>
                 <w:rFonts w:ascii="한컴 말랑말랑 Regular" w:hAnsi="한컴 말랑말랑 Regular" w:eastAsia="한컴 말랑말랑 Regular" w:cs="한컴 말랑말랑 Regular"/>
                 <w:b w:val="0"/>
-                <w:sz w:val="19"/>
+                <w:sz w:val="20"/>
               </w:rPr>
-              <w:t>NPC 이름: ____________</w:t>
+              <w:t>NPC 이름: ______________</w:t>
             </w:r>
           </w:p>
           <w:p>
             <w:pPr>
-              <w:spacing w:after="80" w:before="0"/>
+              <w:spacing w:after="40" w:before="0"/>
             </w:pPr>
             <w:r>
               <w:rPr>
                 <w:rFonts w:ascii="한컴 말랑말랑 Regular" w:hAnsi="한컴 말랑말랑 Regular" w:eastAsia="한컴 말랑말랑 Regular" w:cs="한컴 말랑말랑 Regular"/>
                 <w:b w:val="0"/>
-                <w:sz w:val="19"/>
+                <w:sz w:val="20"/>
               </w:rPr>
-              <w:t xml:space="preserve">우리가 담으려던 이 친구의 마음 (낱말 하나): </w:t>
+              <w:t>우리가 담으려던 이 친구의 마음 (낱말 하나)</w:t>
             </w:r>
+          </w:p>
+          <w:p>
+            <w:pPr>
+              <w:spacing w:after="200" w:before="0"/>
+            </w:pPr>
             <w:r>
               <w:rPr>
                 <w:rFonts w:ascii="한컴 말랑말랑 Regular" w:hAnsi="한컴 말랑말랑 Regular" w:eastAsia="한컴 말랑말랑 Regular" w:cs="한컴 말랑말랑 Regular"/>
                 <w:b w:val="0"/>
                 <w:color w:val="1F3A5F"/>
-                <w:sz w:val="19"/>
+                <w:sz w:val="20"/>
               </w:rPr>
-              <w:t>__________</w:t>
+              <w:t>➜ ________________________</w:t>
             </w:r>
           </w:p>
           <w:tbl>
@@ -1366,26 +1428,26 @@
           </w:tbl>
           <w:p>
             <w:pPr>
-              <w:spacing w:after="20" w:before="40"/>
+              <w:spacing w:after="160" w:before="120"/>
             </w:pPr>
             <w:r>
               <w:rPr>
                 <w:rFonts w:ascii="한컴 말랑말랑 Regular" w:hAnsi="한컴 말랑말랑 Regular" w:eastAsia="한컴 말랑말랑 Regular" w:cs="한컴 말랑말랑 Regular"/>
                 <w:b w:val="0"/>
-                <w:sz w:val="19"/>
+                <w:sz w:val="20"/>
               </w:rPr>
-              <w:t>NPC 이름: ____________   만든 모둠: ____모둠</w:t>
+              <w:t>NPC 이름: ______________   만든 모둠: ____모둠</w:t>
             </w:r>
           </w:p>
           <w:p>
             <w:pPr>
-              <w:spacing w:after="80" w:before="0"/>
+              <w:spacing w:after="160" w:before="0"/>
             </w:pPr>
             <w:r>
               <w:rPr>
                 <w:rFonts w:ascii="한컴 말랑말랑 Regular" w:hAnsi="한컴 말랑말랑 Regular" w:eastAsia="한컴 말랑말랑 Regular" w:cs="한컴 말랑말랑 Regular"/>
                 <w:b w:val="0"/>
-                <w:sz w:val="19"/>
+                <w:sz w:val="20"/>
               </w:rPr>
               <w:t xml:space="preserve">이 친구의 마음은 </w:t>
             </w:r>
@@ -1394,28 +1456,28 @@
                 <w:rFonts w:ascii="한컴 말랑말랑 Regular" w:hAnsi="한컴 말랑말랑 Regular" w:eastAsia="한컴 말랑말랑 Regular" w:cs="한컴 말랑말랑 Regular"/>
                 <w:b w:val="0"/>
                 <w:color w:val="1F3A5F"/>
-                <w:sz w:val="19"/>
+                <w:sz w:val="20"/>
               </w:rPr>
-              <w:t>__________</w:t>
+              <w:t>______________</w:t>
             </w:r>
             <w:r>
               <w:rPr>
                 <w:rFonts w:ascii="한컴 말랑말랑 Regular" w:hAnsi="한컴 말랑말랑 Regular" w:eastAsia="한컴 말랑말랑 Regular" w:cs="한컴 말랑말랑 Regular"/>
                 <w:b w:val="0"/>
-                <w:sz w:val="19"/>
+                <w:sz w:val="20"/>
               </w:rPr>
               <w:t>이고,</w:t>
             </w:r>
           </w:p>
           <w:p>
             <w:pPr>
-              <w:spacing w:after="120" w:before="0"/>
+              <w:spacing w:after="40" w:before="0"/>
             </w:pPr>
             <w:r>
               <w:rPr>
                 <w:rFonts w:ascii="한컴 말랑말랑 Regular" w:hAnsi="한컴 말랑말랑 Regular" w:eastAsia="한컴 말랑말랑 Regular" w:cs="한컴 말랑말랑 Regular"/>
                 <w:b w:val="0"/>
-                <w:sz w:val="19"/>
+                <w:sz w:val="20"/>
               </w:rPr>
               <w:t xml:space="preserve">가장 바라는 것은 </w:t>
             </w:r>
@@ -1424,28 +1486,42 @@
                 <w:rFonts w:ascii="한컴 말랑말랑 Regular" w:hAnsi="한컴 말랑말랑 Regular" w:eastAsia="한컴 말랑말랑 Regular" w:cs="한컴 말랑말랑 Regular"/>
                 <w:b w:val="0"/>
                 <w:color w:val="1F3A5F"/>
-                <w:sz w:val="19"/>
+                <w:sz w:val="20"/>
               </w:rPr>
-              <w:t>______________________</w:t>
+              <w:t>____________________</w:t>
             </w:r>
             <w:r>
               <w:rPr>
                 <w:rFonts w:ascii="한컴 말랑말랑 Regular" w:hAnsi="한컴 말랑말랑 Regular" w:eastAsia="한컴 말랑말랑 Regular" w:cs="한컴 말랑말랑 Regular"/>
                 <w:b w:val="0"/>
-                <w:sz w:val="19"/>
+                <w:sz w:val="20"/>
               </w:rPr>
               <w:t>이에요.</w:t>
             </w:r>
           </w:p>
           <w:p>
             <w:pPr>
-              <w:spacing w:after="80" w:before="0"/>
+              <w:spacing w:after="200" w:before="0"/>
             </w:pPr>
             <w:r>
               <w:rPr>
                 <w:rFonts w:ascii="한컴 말랑말랑 Regular" w:hAnsi="한컴 말랑말랑 Regular" w:eastAsia="한컴 말랑말랑 Regular" w:cs="한컴 말랑말랑 Regular"/>
                 <w:b w:val="0"/>
-                <w:sz w:val="19"/>
+                <w:color w:val="1F3A5F"/>
+                <w:sz w:val="20"/>
+              </w:rPr>
+              <w:t>________________________________</w:t>
+            </w:r>
+          </w:p>
+          <w:p>
+            <w:pPr>
+              <w:spacing w:after="200" w:before="0"/>
+            </w:pPr>
+            <w:r>
+              <w:rPr>
+                <w:rFonts w:ascii="한컴 말랑말랑 Regular" w:hAnsi="한컴 말랑말랑 Regular" w:eastAsia="한컴 말랑말랑 Regular" w:cs="한컴 말랑말랑 Regular"/>
+                <w:b w:val="0"/>
+                <w:sz w:val="20"/>
               </w:rPr>
               <w:t xml:space="preserve">내 선택:  </w:t>
             </w:r>
@@ -1454,7 +1530,7 @@
                 <w:rFonts w:ascii="한컴 말랑말랑 Bold" w:hAnsi="한컴 말랑말랑 Bold" w:eastAsia="한컴 말랑말랑 Bold" w:cs="한컴 말랑말랑 Bold"/>
                 <w:b/>
                 <w:color w:val="1F3A5F"/>
-                <w:sz w:val="19"/>
+                <w:sz w:val="20"/>
               </w:rPr>
               <w:t>A · B · C</w:t>
             </w:r>
@@ -1462,24 +1538,24 @@
               <w:rPr>
                 <w:rFonts w:ascii="한컴 말랑말랑 Regular" w:hAnsi="한컴 말랑말랑 Regular" w:eastAsia="한컴 말랑말랑 Regular" w:cs="한컴 말랑말랑 Regular"/>
                 <w:b w:val="0"/>
-                <w:sz w:val="19"/>
+                <w:sz w:val="20"/>
               </w:rPr>
-              <w:t xml:space="preserve"> 중 (   ), </w:t>
+              <w:t xml:space="preserve"> 중 (    ), </w:t>
             </w:r>
             <w:r>
               <w:rPr>
                 <w:rFonts w:ascii="한컴 말랑말랑 Regular" w:hAnsi="한컴 말랑말랑 Regular" w:eastAsia="한컴 말랑말랑 Regular" w:cs="한컴 말랑말랑 Regular"/>
                 <w:b w:val="0"/>
                 <w:color w:val="1F3A5F"/>
-                <w:sz w:val="19"/>
+                <w:sz w:val="20"/>
               </w:rPr>
-              <w:t>__________</w:t>
+              <w:t>____________</w:t>
             </w:r>
             <w:r>
               <w:rPr>
                 <w:rFonts w:ascii="한컴 말랑말랑 Regular" w:hAnsi="한컴 말랑말랑 Regular" w:eastAsia="한컴 말랑말랑 Regular" w:cs="한컴 말랑말랑 Regular"/>
                 <w:b w:val="0"/>
-                <w:sz w:val="19"/>
+                <w:sz w:val="20"/>
               </w:rPr>
               <w:t>와 함께.</w:t>
             </w:r>

</xml_diff>

<commit_message>
Review card v2: worksheet-style label/answer boxes, add PDF
Co-Authored-By: Claude Fable 5.1 <noreply@anthropic.com>
</commit_message>
<xml_diff>
--- a/worksheets/친구NPC_검토카드.docx
+++ b/worksheets/친구NPC_검토카드.docx
@@ -13,7 +13,7 @@
           <w:color w:val="666666"/>
           <w:sz w:val="15"/>
         </w:rPr>
-        <w:t>✂ 점선을 따라 네 장으로 잘라요 · 한 학생당 한 장 · 교사용 안내는 활동지_구성안 10절</w:t>
+        <w:t>✂ 점선을 따라 네 장으로 잘라요 · 한 학생당 한 장 · 9차시 비밀 임무 2 (교사용 안내: 활동지_구성안 10절)</w:t>
       </w:r>
     </w:p>
     <w:tbl>
@@ -22,19 +22,19 @@
         <w:jc w:val="center"/>
         <w:tblLook w:firstColumn="1" w:firstRow="1" w:lastColumn="0" w:lastRow="0" w:noHBand="0" w:noVBand="1" w:val="04A0"/>
         <w:tblBorders>
-          <w:top w:val="single" w:sz="4" w:color="999999"/>
-          <w:left w:val="single" w:sz="4" w:color="999999"/>
-          <w:bottom w:val="single" w:sz="4" w:color="999999"/>
-          <w:right w:val="single" w:sz="4" w:color="999999"/>
-          <w:insideH w:val="single" w:sz="4" w:color="999999"/>
-          <w:insideV w:val="single" w:sz="4" w:color="999999"/>
+          <w:top w:val="dashed" w:sz="4" w:color="9A9A9A"/>
+          <w:left w:val="dashed" w:sz="4" w:color="9A9A9A"/>
+          <w:bottom w:val="dashed" w:sz="4" w:color="9A9A9A"/>
+          <w:right w:val="dashed" w:sz="4" w:color="9A9A9A"/>
+          <w:insideH w:val="dashed" w:sz="4" w:color="9A9A9A"/>
+          <w:insideV w:val="dashed" w:sz="4" w:color="9A9A9A"/>
         </w:tblBorders>
         <w:tblLayout w:type="fixed"/>
         <w:tblCellMar>
-          <w:top w:w="120" w:type="dxa"/>
-          <w:left w:w="150" w:type="dxa"/>
-          <w:bottom w:w="120" w:type="dxa"/>
-          <w:right w:w="150" w:type="dxa"/>
+          <w:top w:w="110" w:type="dxa"/>
+          <w:left w:w="140" w:type="dxa"/>
+          <w:bottom w:w="110" w:type="dxa"/>
+          <w:right w:w="140" w:type="dxa"/>
         </w:tblCellMar>
         <w:tblLayout w:type="fixed"/>
       </w:tblPr>
@@ -44,7 +44,7 @@
       </w:tblGrid>
       <w:tr>
         <w:trPr>
-          <w:trHeight w:val="7484" w:hRule="exact"/>
+          <w:trHeight w:val="7541" w:hRule="exact"/>
         </w:trPr>
         <w:tc>
           <w:tcPr>
@@ -53,49 +53,8 @@
           </w:tcPr>
           <w:p>
             <w:pPr>
-              <w:spacing w:after="40" w:before="0"/>
+              <w:spacing w:after="0" w:line="20" w:lineRule="exact"/>
             </w:pPr>
-            <w:r>
-              <w:rPr>
-                <w:rFonts w:ascii="한컴 말랑말랑 Bold" w:hAnsi="한컴 말랑말랑 Bold" w:eastAsia="한컴 말랑말랑 Bold" w:cs="한컴 말랑말랑 Bold"/>
-                <w:b/>
-                <w:color w:val="B03A6E"/>
-                <w:sz w:val="26"/>
-              </w:rPr>
-              <w:t>👥 친구 NPC 검토 카드</w:t>
-            </w:r>
-            <w:r>
-              <w:rPr>
-                <w:rFonts w:ascii="한컴 말랑말랑 Regular" w:hAnsi="한컴 말랑말랑 Regular" w:eastAsia="한컴 말랑말랑 Regular" w:cs="한컴 말랑말랑 Regular"/>
-                <w:b w:val="0"/>
-                <w:color w:val="666666"/>
-                <w:sz w:val="17"/>
-              </w:rPr>
-              <w:t xml:space="preserve">   9차시 · 비밀 임무 2</w:t>
-            </w:r>
-          </w:p>
-          <w:p>
-            <w:pPr>
-              <w:spacing w:after="60" w:before="0"/>
-            </w:pPr>
-            <w:r>
-              <w:rPr>
-                <w:rFonts w:ascii="한컴 말랑말랑 Regular" w:hAnsi="한컴 말랑말랑 Regular" w:eastAsia="한컴 말랑말랑 Regular" w:cs="한컴 말랑말랑 Regular"/>
-                <w:b w:val="0"/>
-                <w:color w:val="1F3A5F"/>
-                <w:sz w:val="19"/>
-              </w:rPr>
-              <w:t xml:space="preserve">모둠 ____   별칭 __________   </w:t>
-            </w:r>
-            <w:r>
-              <w:rPr>
-                <w:rFonts w:ascii="한컴 말랑말랑 Regular" w:hAnsi="한컴 말랑말랑 Regular" w:eastAsia="한컴 말랑말랑 Regular" w:cs="한컴 말랑말랑 Regular"/>
-                <w:b w:val="0"/>
-                <w:color w:val="666666"/>
-                <w:sz w:val="16"/>
-              </w:rPr>
-              <w:t>(이름은 쓰지 않아요)</w:t>
-            </w:r>
           </w:p>
           <w:tbl>
             <w:tblPr>
@@ -103,30 +62,30 @@
               <w:jc w:val="center"/>
               <w:tblLook w:firstColumn="1" w:firstRow="1" w:lastColumn="0" w:lastRow="0" w:noHBand="0" w:noVBand="1" w:val="04A0"/>
               <w:tblBorders>
-                <w:top w:val="single" w:sz="8" w:color="D94F8A"/>
-                <w:left w:val="single" w:sz="8" w:color="D94F8A"/>
-                <w:bottom w:val="single" w:sz="8" w:color="D94F8A"/>
-                <w:right w:val="single" w:sz="8" w:color="D94F8A"/>
-                <w:insideH w:val="single" w:sz="8" w:color="D94F8A"/>
-                <w:insideV w:val="single" w:sz="8" w:color="D94F8A"/>
+                <w:top w:val="single" w:sz="2" w:color="FFFFFF"/>
+                <w:left w:val="single" w:sz="2" w:color="FFFFFF"/>
+                <w:bottom w:val="single" w:sz="2" w:color="FFFFFF"/>
+                <w:right w:val="single" w:sz="2" w:color="FFFFFF"/>
+                <w:insideH w:val="nil"/>
+                <w:insideV w:val="nil"/>
               </w:tblBorders>
               <w:tblLayout w:type="fixed"/>
               <w:tblCellMar>
-                <w:top w:w="40" w:type="dxa"/>
-                <w:left w:w="90" w:type="dxa"/>
-                <w:bottom w:w="40" w:type="dxa"/>
-                <w:right w:w="90" w:type="dxa"/>
+                <w:top w:w="0" w:type="dxa"/>
+                <w:left w:w="0" w:type="dxa"/>
+                <w:bottom w:w="0" w:type="dxa"/>
+                <w:right w:w="0" w:type="dxa"/>
               </w:tblCellMar>
               <w:tblLayout w:type="fixed"/>
             </w:tblPr>
             <w:tblGrid>
-              <w:gridCol w:w="4649"/>
+              <w:gridCol w:w="2721"/>
+              <w:gridCol w:w="2494"/>
             </w:tblGrid>
             <w:tr>
               <w:tc>
                 <w:tcPr>
-                  <w:tcW w:type="dxa" w:w="4649"/>
-                  <w:shd w:val="clear" w:color="auto" w:fill="F6C9DD"/>
+                  <w:tcW w:type="dxa" w:w="2721"/>
                 </w:tcPr>
                 <w:p>
                   <w:pPr>
@@ -137,18 +96,29 @@
                       <w:rFonts w:ascii="한컴 말랑말랑 Bold" w:hAnsi="한컴 말랑말랑 Bold" w:eastAsia="한컴 말랑말랑 Bold" w:cs="한컴 말랑말랑 Bold"/>
                       <w:b/>
                       <w:color w:val="B03A6E"/>
-                      <w:sz w:val="21"/>
+                      <w:sz w:val="26"/>
                     </w:rPr>
-                    <w:t xml:space="preserve">1  우리 모둠 NPC  </w:t>
+                    <w:t>👥 친구 NPC 검토 카드</w:t>
                   </w:r>
+                </w:p>
+              </w:tc>
+              <w:tc>
+                <w:tcPr>
+                  <w:tcW w:type="dxa" w:w="2494"/>
+                </w:tcPr>
+                <w:p>
+                  <w:pPr>
+                    <w:spacing w:after="0" w:before="0"/>
+                    <w:jc w:val="right"/>
+                  </w:pPr>
                   <w:r>
                     <w:rPr>
                       <w:rFonts w:ascii="한컴 말랑말랑 Regular" w:hAnsi="한컴 말랑말랑 Regular" w:eastAsia="한컴 말랑말랑 Regular" w:cs="한컴 말랑말랑 Regular"/>
                       <w:b w:val="0"/>
-                      <w:color w:val="666666"/>
-                      <w:sz w:val="17"/>
+                      <w:color w:val="1F3A5F"/>
+                      <w:sz w:val="19"/>
                     </w:rPr>
-                    <w:t>대화하기 전에 써요</w:t>
+                    <w:t>모둠 ____  별칭 ________</w:t>
                   </w:r>
                 </w:p>
               </w:tc>
@@ -156,233 +126,15 @@
           </w:tbl>
           <w:p>
             <w:pPr>
-              <w:spacing w:after="120" w:before="120"/>
+              <w:spacing w:after="0" w:before="0" w:line="100" w:lineRule="exact"/>
             </w:pPr>
             <w:r>
               <w:rPr>
                 <w:rFonts w:ascii="한컴 말랑말랑 Regular" w:hAnsi="한컴 말랑말랑 Regular" w:eastAsia="한컴 말랑말랑 Regular" w:cs="한컴 말랑말랑 Regular"/>
                 <w:b w:val="0"/>
-                <w:sz w:val="20"/>
+                <w:sz w:val="4"/>
               </w:rPr>
-              <w:t>NPC 이름: ______________</w:t>
-            </w:r>
-          </w:p>
-          <w:p>
-            <w:pPr>
-              <w:spacing w:after="40" w:before="0"/>
-            </w:pPr>
-            <w:r>
-              <w:rPr>
-                <w:rFonts w:ascii="한컴 말랑말랑 Regular" w:hAnsi="한컴 말랑말랑 Regular" w:eastAsia="한컴 말랑말랑 Regular" w:cs="한컴 말랑말랑 Regular"/>
-                <w:b w:val="0"/>
-                <w:sz w:val="20"/>
-              </w:rPr>
-              <w:t>우리가 담으려던 이 친구의 마음 (낱말 하나)</w:t>
-            </w:r>
-          </w:p>
-          <w:p>
-            <w:pPr>
-              <w:spacing w:after="200" w:before="0"/>
-            </w:pPr>
-            <w:r>
-              <w:rPr>
-                <w:rFonts w:ascii="한컴 말랑말랑 Regular" w:hAnsi="한컴 말랑말랑 Regular" w:eastAsia="한컴 말랑말랑 Regular" w:cs="한컴 말랑말랑 Regular"/>
-                <w:b w:val="0"/>
-                <w:color w:val="1F3A5F"/>
-                <w:sz w:val="20"/>
-              </w:rPr>
-              <w:t>➜ ________________________</w:t>
-            </w:r>
-          </w:p>
-          <w:tbl>
-            <w:tblPr>
-              <w:tblW w:type="auto" w:w="0"/>
-              <w:jc w:val="center"/>
-              <w:tblLook w:firstColumn="1" w:firstRow="1" w:lastColumn="0" w:lastRow="0" w:noHBand="0" w:noVBand="1" w:val="04A0"/>
-              <w:tblBorders>
-                <w:top w:val="single" w:sz="8" w:color="D94F8A"/>
-                <w:left w:val="single" w:sz="8" w:color="D94F8A"/>
-                <w:bottom w:val="single" w:sz="8" w:color="D94F8A"/>
-                <w:right w:val="single" w:sz="8" w:color="D94F8A"/>
-                <w:insideH w:val="single" w:sz="8" w:color="D94F8A"/>
-                <w:insideV w:val="single" w:sz="8" w:color="D94F8A"/>
-              </w:tblBorders>
-              <w:tblLayout w:type="fixed"/>
-              <w:tblCellMar>
-                <w:top w:w="40" w:type="dxa"/>
-                <w:left w:w="90" w:type="dxa"/>
-                <w:bottom w:w="40" w:type="dxa"/>
-                <w:right w:w="90" w:type="dxa"/>
-              </w:tblCellMar>
-              <w:tblLayout w:type="fixed"/>
-            </w:tblPr>
-            <w:tblGrid>
-              <w:gridCol w:w="4649"/>
-            </w:tblGrid>
-            <w:tr>
-              <w:tc>
-                <w:tcPr>
-                  <w:tcW w:type="dxa" w:w="4649"/>
-                  <w:shd w:val="clear" w:color="auto" w:fill="F6C9DD"/>
-                </w:tcPr>
-                <w:p>
-                  <w:pPr>
-                    <w:spacing w:after="0" w:before="0"/>
-                  </w:pPr>
-                  <w:r>
-                    <w:rPr>
-                      <w:rFonts w:ascii="한컴 말랑말랑 Bold" w:hAnsi="한컴 말랑말랑 Bold" w:eastAsia="한컴 말랑말랑 Bold" w:cs="한컴 말랑말랑 Bold"/>
-                      <w:b/>
-                      <w:color w:val="B03A6E"/>
-                      <w:sz w:val="21"/>
-                    </w:rPr>
-                    <w:t xml:space="preserve">2  만난 친구 NPC  </w:t>
-                  </w:r>
-                  <w:r>
-                    <w:rPr>
-                      <w:rFonts w:ascii="한컴 말랑말랑 Regular" w:hAnsi="한컴 말랑말랑 Regular" w:eastAsia="한컴 말랑말랑 Regular" w:cs="한컴 말랑말랑 Regular"/>
-                      <w:b w:val="0"/>
-                      <w:color w:val="666666"/>
-                      <w:sz w:val="17"/>
-                    </w:rPr>
-                    <w:t>다른 모둠 NPC와 대화한 뒤에 써요</w:t>
-                  </w:r>
-                </w:p>
-              </w:tc>
-            </w:tr>
-          </w:tbl>
-          <w:p>
-            <w:pPr>
-              <w:spacing w:after="160" w:before="120"/>
-            </w:pPr>
-            <w:r>
-              <w:rPr>
-                <w:rFonts w:ascii="한컴 말랑말랑 Regular" w:hAnsi="한컴 말랑말랑 Regular" w:eastAsia="한컴 말랑말랑 Regular" w:cs="한컴 말랑말랑 Regular"/>
-                <w:b w:val="0"/>
-                <w:sz w:val="20"/>
-              </w:rPr>
-              <w:t>NPC 이름: ______________   만든 모둠: ____모둠</w:t>
-            </w:r>
-          </w:p>
-          <w:p>
-            <w:pPr>
-              <w:spacing w:after="160" w:before="0"/>
-            </w:pPr>
-            <w:r>
-              <w:rPr>
-                <w:rFonts w:ascii="한컴 말랑말랑 Regular" w:hAnsi="한컴 말랑말랑 Regular" w:eastAsia="한컴 말랑말랑 Regular" w:cs="한컴 말랑말랑 Regular"/>
-                <w:b w:val="0"/>
-                <w:sz w:val="20"/>
-              </w:rPr>
-              <w:t xml:space="preserve">이 친구의 마음은 </w:t>
-            </w:r>
-            <w:r>
-              <w:rPr>
-                <w:rFonts w:ascii="한컴 말랑말랑 Regular" w:hAnsi="한컴 말랑말랑 Regular" w:eastAsia="한컴 말랑말랑 Regular" w:cs="한컴 말랑말랑 Regular"/>
-                <w:b w:val="0"/>
-                <w:color w:val="1F3A5F"/>
-                <w:sz w:val="20"/>
-              </w:rPr>
-              <w:t>______________</w:t>
-            </w:r>
-            <w:r>
-              <w:rPr>
-                <w:rFonts w:ascii="한컴 말랑말랑 Regular" w:hAnsi="한컴 말랑말랑 Regular" w:eastAsia="한컴 말랑말랑 Regular" w:cs="한컴 말랑말랑 Regular"/>
-                <w:b w:val="0"/>
-                <w:sz w:val="20"/>
-              </w:rPr>
-              <w:t>이고,</w:t>
-            </w:r>
-          </w:p>
-          <w:p>
-            <w:pPr>
-              <w:spacing w:after="40" w:before="0"/>
-            </w:pPr>
-            <w:r>
-              <w:rPr>
-                <w:rFonts w:ascii="한컴 말랑말랑 Regular" w:hAnsi="한컴 말랑말랑 Regular" w:eastAsia="한컴 말랑말랑 Regular" w:cs="한컴 말랑말랑 Regular"/>
-                <w:b w:val="0"/>
-                <w:sz w:val="20"/>
-              </w:rPr>
-              <w:t xml:space="preserve">가장 바라는 것은 </w:t>
-            </w:r>
-            <w:r>
-              <w:rPr>
-                <w:rFonts w:ascii="한컴 말랑말랑 Regular" w:hAnsi="한컴 말랑말랑 Regular" w:eastAsia="한컴 말랑말랑 Regular" w:cs="한컴 말랑말랑 Regular"/>
-                <w:b w:val="0"/>
-                <w:color w:val="1F3A5F"/>
-                <w:sz w:val="20"/>
-              </w:rPr>
-              <w:t>____________________</w:t>
-            </w:r>
-            <w:r>
-              <w:rPr>
-                <w:rFonts w:ascii="한컴 말랑말랑 Regular" w:hAnsi="한컴 말랑말랑 Regular" w:eastAsia="한컴 말랑말랑 Regular" w:cs="한컴 말랑말랑 Regular"/>
-                <w:b w:val="0"/>
-                <w:sz w:val="20"/>
-              </w:rPr>
-              <w:t>이에요.</w:t>
-            </w:r>
-          </w:p>
-          <w:p>
-            <w:pPr>
-              <w:spacing w:after="200" w:before="0"/>
-            </w:pPr>
-            <w:r>
-              <w:rPr>
-                <w:rFonts w:ascii="한컴 말랑말랑 Regular" w:hAnsi="한컴 말랑말랑 Regular" w:eastAsia="한컴 말랑말랑 Regular" w:cs="한컴 말랑말랑 Regular"/>
-                <w:b w:val="0"/>
-                <w:color w:val="1F3A5F"/>
-                <w:sz w:val="20"/>
-              </w:rPr>
-              <w:t>________________________________</w:t>
-            </w:r>
-          </w:p>
-          <w:p>
-            <w:pPr>
-              <w:spacing w:after="200" w:before="0"/>
-            </w:pPr>
-            <w:r>
-              <w:rPr>
-                <w:rFonts w:ascii="한컴 말랑말랑 Regular" w:hAnsi="한컴 말랑말랑 Regular" w:eastAsia="한컴 말랑말랑 Regular" w:cs="한컴 말랑말랑 Regular"/>
-                <w:b w:val="0"/>
-                <w:sz w:val="20"/>
-              </w:rPr>
-              <w:t xml:space="preserve">내 선택:  </w:t>
-            </w:r>
-            <w:r>
-              <w:rPr>
-                <w:rFonts w:ascii="한컴 말랑말랑 Bold" w:hAnsi="한컴 말랑말랑 Bold" w:eastAsia="한컴 말랑말랑 Bold" w:cs="한컴 말랑말랑 Bold"/>
-                <w:b/>
-                <w:color w:val="1F3A5F"/>
-                <w:sz w:val="20"/>
-              </w:rPr>
-              <w:t>A · B · C</w:t>
-            </w:r>
-            <w:r>
-              <w:rPr>
-                <w:rFonts w:ascii="한컴 말랑말랑 Regular" w:hAnsi="한컴 말랑말랑 Regular" w:eastAsia="한컴 말랑말랑 Regular" w:cs="한컴 말랑말랑 Regular"/>
-                <w:b w:val="0"/>
-                <w:sz w:val="20"/>
-              </w:rPr>
-              <w:t xml:space="preserve"> 중 (    ), </w:t>
-            </w:r>
-            <w:r>
-              <w:rPr>
-                <w:rFonts w:ascii="한컴 말랑말랑 Regular" w:hAnsi="한컴 말랑말랑 Regular" w:eastAsia="한컴 말랑말랑 Regular" w:cs="한컴 말랑말랑 Regular"/>
-                <w:b w:val="0"/>
-                <w:color w:val="1F3A5F"/>
-                <w:sz w:val="20"/>
-              </w:rPr>
-              <w:t>____________</w:t>
-            </w:r>
-            <w:r>
-              <w:rPr>
-                <w:rFonts w:ascii="한컴 말랑말랑 Regular" w:hAnsi="한컴 말랑말랑 Regular" w:eastAsia="한컴 말랑말랑 Regular" w:cs="한컴 말랑말랑 Regular"/>
-                <w:b w:val="0"/>
-                <w:sz w:val="20"/>
-              </w:rPr>
-              <w:t>와 함께.</w:t>
+              <w:t xml:space="preserve"> </w:t>
             </w:r>
           </w:p>
           <w:tbl>
@@ -401,122 +153,25 @@
               <w:tblLayout w:type="fixed"/>
               <w:tblCellMar>
                 <w:top w:w="30" w:type="dxa"/>
-                <w:left w:w="90" w:type="dxa"/>
+                <w:left w:w="80" w:type="dxa"/>
                 <w:bottom w:w="30" w:type="dxa"/>
-                <w:right w:w="90" w:type="dxa"/>
+                <w:right w:w="80" w:type="dxa"/>
               </w:tblCellMar>
               <w:tblLayout w:type="fixed"/>
             </w:tblPr>
             <w:tblGrid>
-              <w:gridCol w:w="4649"/>
+              <w:gridCol w:w="1644"/>
+              <w:gridCol w:w="3572"/>
             </w:tblGrid>
             <w:tr>
+              <w:trPr>
+                <w:trHeight w:val="351" w:hRule="exact"/>
+              </w:trPr>
               <w:tc>
                 <w:tcPr>
-                  <w:tcW w:type="dxa" w:w="4649"/>
-                  <w:shd w:val="clear" w:color="auto" w:fill="FFF0F6"/>
-                </w:tcPr>
-                <w:p>
-                  <w:pPr>
-                    <w:spacing w:after="0" w:before="0"/>
-                    <w:jc w:val="center"/>
-                  </w:pPr>
-                  <w:r>
-                    <w:rPr>
-                      <w:rFonts w:ascii="한컴 말랑말랑 Bold" w:hAnsi="한컴 말랑말랑 Bold" w:eastAsia="한컴 말랑말랑 Bold" w:cs="한컴 말랑말랑 Bold"/>
-                      <w:b/>
-                      <w:color w:val="B03A6E"/>
-                      <w:sz w:val="18"/>
-                    </w:rPr>
-                    <w:t>✉️ 다 쓰면 만든 모둠에게 돌려줘요.</w:t>
-                  </w:r>
-                </w:p>
-              </w:tc>
-            </w:tr>
-          </w:tbl>
-          <w:p/>
-        </w:tc>
-        <w:tc>
-          <w:tcPr>
-            <w:tcW w:type="dxa" w:w="5386"/>
-            <w:vAlign w:val="top"/>
-          </w:tcPr>
-          <w:p>
-            <w:pPr>
-              <w:spacing w:after="40" w:before="0"/>
-            </w:pPr>
-            <w:r>
-              <w:rPr>
-                <w:rFonts w:ascii="한컴 말랑말랑 Bold" w:hAnsi="한컴 말랑말랑 Bold" w:eastAsia="한컴 말랑말랑 Bold" w:cs="한컴 말랑말랑 Bold"/>
-                <w:b/>
-                <w:color w:val="B03A6E"/>
-                <w:sz w:val="26"/>
-              </w:rPr>
-              <w:t>👥 친구 NPC 검토 카드</w:t>
-            </w:r>
-            <w:r>
-              <w:rPr>
-                <w:rFonts w:ascii="한컴 말랑말랑 Regular" w:hAnsi="한컴 말랑말랑 Regular" w:eastAsia="한컴 말랑말랑 Regular" w:cs="한컴 말랑말랑 Regular"/>
-                <w:b w:val="0"/>
-                <w:color w:val="666666"/>
-                <w:sz w:val="17"/>
-              </w:rPr>
-              <w:t xml:space="preserve">   9차시 · 비밀 임무 2</w:t>
-            </w:r>
-          </w:p>
-          <w:p>
-            <w:pPr>
-              <w:spacing w:after="60" w:before="0"/>
-            </w:pPr>
-            <w:r>
-              <w:rPr>
-                <w:rFonts w:ascii="한컴 말랑말랑 Regular" w:hAnsi="한컴 말랑말랑 Regular" w:eastAsia="한컴 말랑말랑 Regular" w:cs="한컴 말랑말랑 Regular"/>
-                <w:b w:val="0"/>
-                <w:color w:val="1F3A5F"/>
-                <w:sz w:val="19"/>
-              </w:rPr>
-              <w:t xml:space="preserve">모둠 ____   별칭 __________   </w:t>
-            </w:r>
-            <w:r>
-              <w:rPr>
-                <w:rFonts w:ascii="한컴 말랑말랑 Regular" w:hAnsi="한컴 말랑말랑 Regular" w:eastAsia="한컴 말랑말랑 Regular" w:cs="한컴 말랑말랑 Regular"/>
-                <w:b w:val="0"/>
-                <w:color w:val="666666"/>
-                <w:sz w:val="16"/>
-              </w:rPr>
-              <w:t>(이름은 쓰지 않아요)</w:t>
-            </w:r>
-          </w:p>
-          <w:tbl>
-            <w:tblPr>
-              <w:tblW w:type="auto" w:w="0"/>
-              <w:jc w:val="center"/>
-              <w:tblLook w:firstColumn="1" w:firstRow="1" w:lastColumn="0" w:lastRow="0" w:noHBand="0" w:noVBand="1" w:val="04A0"/>
-              <w:tblBorders>
-                <w:top w:val="single" w:sz="8" w:color="D94F8A"/>
-                <w:left w:val="single" w:sz="8" w:color="D94F8A"/>
-                <w:bottom w:val="single" w:sz="8" w:color="D94F8A"/>
-                <w:right w:val="single" w:sz="8" w:color="D94F8A"/>
-                <w:insideH w:val="single" w:sz="8" w:color="D94F8A"/>
-                <w:insideV w:val="single" w:sz="8" w:color="D94F8A"/>
-              </w:tblBorders>
-              <w:tblLayout w:type="fixed"/>
-              <w:tblCellMar>
-                <w:top w:w="40" w:type="dxa"/>
-                <w:left w:w="90" w:type="dxa"/>
-                <w:bottom w:w="40" w:type="dxa"/>
-                <w:right w:w="90" w:type="dxa"/>
-              </w:tblCellMar>
-              <w:tblLayout w:type="fixed"/>
-            </w:tblPr>
-            <w:tblGrid>
-              <w:gridCol w:w="4649"/>
-            </w:tblGrid>
-            <w:tr>
-              <w:tc>
-                <w:tcPr>
-                  <w:tcW w:type="dxa" w:w="4649"/>
-                  <w:shd w:val="clear" w:color="auto" w:fill="F6C9DD"/>
+                  <w:tcW w:type="dxa" w:w="5216"/>
+                  <w:gridSpan w:val="2"/>
+                  <w:shd w:val="clear" w:color="auto" w:fill="D94F8A"/>
                 </w:tcPr>
                 <w:p>
                   <w:pPr>
@@ -526,253 +181,105 @@
                     <w:rPr>
                       <w:rFonts w:ascii="한컴 말랑말랑 Bold" w:hAnsi="한컴 말랑말랑 Bold" w:eastAsia="한컴 말랑말랑 Bold" w:cs="한컴 말랑말랑 Bold"/>
                       <w:b/>
-                      <w:color w:val="B03A6E"/>
+                      <w:color w:val="FFFFFF"/>
                       <w:sz w:val="21"/>
                     </w:rPr>
-                    <w:t xml:space="preserve">1  우리 모둠 NPC  </w:t>
+                    <w:t>1  우리 모둠 NPC</w:t>
                   </w:r>
                   <w:r>
                     <w:rPr>
                       <w:rFonts w:ascii="한컴 말랑말랑 Regular" w:hAnsi="한컴 말랑말랑 Regular" w:eastAsia="한컴 말랑말랑 Regular" w:cs="한컴 말랑말랑 Regular"/>
                       <w:b w:val="0"/>
-                      <w:color w:val="666666"/>
-                      <w:sz w:val="17"/>
+                      <w:color w:val="FFE3EF"/>
+                      <w:sz w:val="16"/>
                     </w:rPr>
-                    <w:t>대화하기 전에 써요</w:t>
+                    <w:t xml:space="preserve">   대화하기 전에 써요</w:t>
                   </w:r>
                 </w:p>
               </w:tc>
             </w:tr>
-          </w:tbl>
-          <w:p>
-            <w:pPr>
-              <w:spacing w:after="120" w:before="120"/>
-            </w:pPr>
-            <w:r>
-              <w:rPr>
-                <w:rFonts w:ascii="한컴 말랑말랑 Regular" w:hAnsi="한컴 말랑말랑 Regular" w:eastAsia="한컴 말랑말랑 Regular" w:cs="한컴 말랑말랑 Regular"/>
-                <w:b w:val="0"/>
-                <w:sz w:val="20"/>
-              </w:rPr>
-              <w:t>NPC 이름: ______________</w:t>
-            </w:r>
-          </w:p>
-          <w:p>
-            <w:pPr>
-              <w:spacing w:after="40" w:before="0"/>
-            </w:pPr>
-            <w:r>
-              <w:rPr>
-                <w:rFonts w:ascii="한컴 말랑말랑 Regular" w:hAnsi="한컴 말랑말랑 Regular" w:eastAsia="한컴 말랑말랑 Regular" w:cs="한컴 말랑말랑 Regular"/>
-                <w:b w:val="0"/>
-                <w:sz w:val="20"/>
-              </w:rPr>
-              <w:t>우리가 담으려던 이 친구의 마음 (낱말 하나)</w:t>
-            </w:r>
-          </w:p>
-          <w:p>
-            <w:pPr>
-              <w:spacing w:after="200" w:before="0"/>
-            </w:pPr>
-            <w:r>
-              <w:rPr>
-                <w:rFonts w:ascii="한컴 말랑말랑 Regular" w:hAnsi="한컴 말랑말랑 Regular" w:eastAsia="한컴 말랑말랑 Regular" w:cs="한컴 말랑말랑 Regular"/>
-                <w:b w:val="0"/>
-                <w:color w:val="1F3A5F"/>
-                <w:sz w:val="20"/>
-              </w:rPr>
-              <w:t>➜ ________________________</w:t>
-            </w:r>
-          </w:p>
-          <w:tbl>
-            <w:tblPr>
-              <w:tblW w:type="auto" w:w="0"/>
-              <w:jc w:val="center"/>
-              <w:tblLook w:firstColumn="1" w:firstRow="1" w:lastColumn="0" w:lastRow="0" w:noHBand="0" w:noVBand="1" w:val="04A0"/>
-              <w:tblBorders>
-                <w:top w:val="single" w:sz="8" w:color="D94F8A"/>
-                <w:left w:val="single" w:sz="8" w:color="D94F8A"/>
-                <w:bottom w:val="single" w:sz="8" w:color="D94F8A"/>
-                <w:right w:val="single" w:sz="8" w:color="D94F8A"/>
-                <w:insideH w:val="single" w:sz="8" w:color="D94F8A"/>
-                <w:insideV w:val="single" w:sz="8" w:color="D94F8A"/>
-              </w:tblBorders>
-              <w:tblLayout w:type="fixed"/>
-              <w:tblCellMar>
-                <w:top w:w="40" w:type="dxa"/>
-                <w:left w:w="90" w:type="dxa"/>
-                <w:bottom w:w="40" w:type="dxa"/>
-                <w:right w:w="90" w:type="dxa"/>
-              </w:tblCellMar>
-              <w:tblLayout w:type="fixed"/>
-            </w:tblPr>
-            <w:tblGrid>
-              <w:gridCol w:w="4649"/>
-            </w:tblGrid>
             <w:tr>
+              <w:trPr>
+                <w:trHeight w:val="425" w:hRule="atLeast"/>
+              </w:trPr>
               <w:tc>
                 <w:tcPr>
-                  <w:tcW w:type="dxa" w:w="4649"/>
-                  <w:shd w:val="clear" w:color="auto" w:fill="F6C9DD"/>
+                  <w:tcW w:type="dxa" w:w="1644"/>
+                  <w:shd w:val="clear" w:color="auto" w:fill="FFF0F6"/>
+                  <w:vAlign w:val="center"/>
                 </w:tcPr>
                 <w:p>
                   <w:pPr>
-                    <w:spacing w:after="0" w:before="0"/>
+                    <w:spacing w:after="0" w:before="0" w:line="276" w:lineRule="auto"/>
                   </w:pPr>
                   <w:r>
                     <w:rPr>
                       <w:rFonts w:ascii="한컴 말랑말랑 Bold" w:hAnsi="한컴 말랑말랑 Bold" w:eastAsia="한컴 말랑말랑 Bold" w:cs="한컴 말랑말랑 Bold"/>
                       <w:b/>
                       <w:color w:val="B03A6E"/>
-                      <w:sz w:val="21"/>
+                      <w:sz w:val="18"/>
                     </w:rPr>
-                    <w:t xml:space="preserve">2  만난 친구 NPC  </w:t>
+                    <w:t>NPC 이름</w:t>
                   </w:r>
+                </w:p>
+              </w:tc>
+              <w:tc>
+                <w:tcPr>
+                  <w:tcW w:type="dxa" w:w="3572"/>
+                  <w:vAlign w:val="top"/>
+                </w:tcPr>
+                <w:p/>
+              </w:tc>
+            </w:tr>
+            <w:tr>
+              <w:trPr>
+                <w:trHeight w:val="708" w:hRule="atLeast"/>
+              </w:trPr>
+              <w:tc>
+                <w:tcPr>
+                  <w:tcW w:type="dxa" w:w="1644"/>
+                  <w:shd w:val="clear" w:color="auto" w:fill="FFF0F6"/>
+                  <w:vAlign w:val="center"/>
+                </w:tcPr>
+                <w:p>
+                  <w:pPr>
+                    <w:spacing w:after="0" w:before="0" w:line="276" w:lineRule="auto"/>
+                  </w:pPr>
                   <w:r>
                     <w:rPr>
-                      <w:rFonts w:ascii="한컴 말랑말랑 Regular" w:hAnsi="한컴 말랑말랑 Regular" w:eastAsia="한컴 말랑말랑 Regular" w:cs="한컴 말랑말랑 Regular"/>
-                      <w:b w:val="0"/>
-                      <w:color w:val="666666"/>
-                      <w:sz w:val="17"/>
+                      <w:rFonts w:ascii="한컴 말랑말랑 Bold" w:hAnsi="한컴 말랑말랑 Bold" w:eastAsia="한컴 말랑말랑 Bold" w:cs="한컴 말랑말랑 Bold"/>
+                      <w:b/>
+                      <w:color w:val="B03A6E"/>
+                      <w:sz w:val="18"/>
                     </w:rPr>
-                    <w:t>다른 모둠 NPC와 대화한 뒤에 써요</w:t>
+                    <w:t>우리가 담으려던</w:t>
+                    <w:br/>
+                    <w:t>이 친구의 마음</w:t>
+                    <w:br/>
+                    <w:t>(낱말 하나)</w:t>
                   </w:r>
                 </w:p>
+              </w:tc>
+              <w:tc>
+                <w:tcPr>
+                  <w:tcW w:type="dxa" w:w="3572"/>
+                  <w:vAlign w:val="top"/>
+                </w:tcPr>
+                <w:p/>
               </w:tc>
             </w:tr>
           </w:tbl>
           <w:p>
             <w:pPr>
-              <w:spacing w:after="160" w:before="120"/>
+              <w:spacing w:after="0" w:before="0" w:line="140" w:lineRule="exact"/>
             </w:pPr>
             <w:r>
               <w:rPr>
                 <w:rFonts w:ascii="한컴 말랑말랑 Regular" w:hAnsi="한컴 말랑말랑 Regular" w:eastAsia="한컴 말랑말랑 Regular" w:cs="한컴 말랑말랑 Regular"/>
                 <w:b w:val="0"/>
-                <w:sz w:val="20"/>
+                <w:sz w:val="4"/>
               </w:rPr>
-              <w:t>NPC 이름: ______________   만든 모둠: ____모둠</w:t>
-            </w:r>
-          </w:p>
-          <w:p>
-            <w:pPr>
-              <w:spacing w:after="160" w:before="0"/>
-            </w:pPr>
-            <w:r>
-              <w:rPr>
-                <w:rFonts w:ascii="한컴 말랑말랑 Regular" w:hAnsi="한컴 말랑말랑 Regular" w:eastAsia="한컴 말랑말랑 Regular" w:cs="한컴 말랑말랑 Regular"/>
-                <w:b w:val="0"/>
-                <w:sz w:val="20"/>
-              </w:rPr>
-              <w:t xml:space="preserve">이 친구의 마음은 </w:t>
-            </w:r>
-            <w:r>
-              <w:rPr>
-                <w:rFonts w:ascii="한컴 말랑말랑 Regular" w:hAnsi="한컴 말랑말랑 Regular" w:eastAsia="한컴 말랑말랑 Regular" w:cs="한컴 말랑말랑 Regular"/>
-                <w:b w:val="0"/>
-                <w:color w:val="1F3A5F"/>
-                <w:sz w:val="20"/>
-              </w:rPr>
-              <w:t>______________</w:t>
-            </w:r>
-            <w:r>
-              <w:rPr>
-                <w:rFonts w:ascii="한컴 말랑말랑 Regular" w:hAnsi="한컴 말랑말랑 Regular" w:eastAsia="한컴 말랑말랑 Regular" w:cs="한컴 말랑말랑 Regular"/>
-                <w:b w:val="0"/>
-                <w:sz w:val="20"/>
-              </w:rPr>
-              <w:t>이고,</w:t>
-            </w:r>
-          </w:p>
-          <w:p>
-            <w:pPr>
-              <w:spacing w:after="40" w:before="0"/>
-            </w:pPr>
-            <w:r>
-              <w:rPr>
-                <w:rFonts w:ascii="한컴 말랑말랑 Regular" w:hAnsi="한컴 말랑말랑 Regular" w:eastAsia="한컴 말랑말랑 Regular" w:cs="한컴 말랑말랑 Regular"/>
-                <w:b w:val="0"/>
-                <w:sz w:val="20"/>
-              </w:rPr>
-              <w:t xml:space="preserve">가장 바라는 것은 </w:t>
-            </w:r>
-            <w:r>
-              <w:rPr>
-                <w:rFonts w:ascii="한컴 말랑말랑 Regular" w:hAnsi="한컴 말랑말랑 Regular" w:eastAsia="한컴 말랑말랑 Regular" w:cs="한컴 말랑말랑 Regular"/>
-                <w:b w:val="0"/>
-                <w:color w:val="1F3A5F"/>
-                <w:sz w:val="20"/>
-              </w:rPr>
-              <w:t>____________________</w:t>
-            </w:r>
-            <w:r>
-              <w:rPr>
-                <w:rFonts w:ascii="한컴 말랑말랑 Regular" w:hAnsi="한컴 말랑말랑 Regular" w:eastAsia="한컴 말랑말랑 Regular" w:cs="한컴 말랑말랑 Regular"/>
-                <w:b w:val="0"/>
-                <w:sz w:val="20"/>
-              </w:rPr>
-              <w:t>이에요.</w:t>
-            </w:r>
-          </w:p>
-          <w:p>
-            <w:pPr>
-              <w:spacing w:after="200" w:before="0"/>
-            </w:pPr>
-            <w:r>
-              <w:rPr>
-                <w:rFonts w:ascii="한컴 말랑말랑 Regular" w:hAnsi="한컴 말랑말랑 Regular" w:eastAsia="한컴 말랑말랑 Regular" w:cs="한컴 말랑말랑 Regular"/>
-                <w:b w:val="0"/>
-                <w:color w:val="1F3A5F"/>
-                <w:sz w:val="20"/>
-              </w:rPr>
-              <w:t>________________________________</w:t>
-            </w:r>
-          </w:p>
-          <w:p>
-            <w:pPr>
-              <w:spacing w:after="200" w:before="0"/>
-            </w:pPr>
-            <w:r>
-              <w:rPr>
-                <w:rFonts w:ascii="한컴 말랑말랑 Regular" w:hAnsi="한컴 말랑말랑 Regular" w:eastAsia="한컴 말랑말랑 Regular" w:cs="한컴 말랑말랑 Regular"/>
-                <w:b w:val="0"/>
-                <w:sz w:val="20"/>
-              </w:rPr>
-              <w:t xml:space="preserve">내 선택:  </w:t>
-            </w:r>
-            <w:r>
-              <w:rPr>
-                <w:rFonts w:ascii="한컴 말랑말랑 Bold" w:hAnsi="한컴 말랑말랑 Bold" w:eastAsia="한컴 말랑말랑 Bold" w:cs="한컴 말랑말랑 Bold"/>
-                <w:b/>
-                <w:color w:val="1F3A5F"/>
-                <w:sz w:val="20"/>
-              </w:rPr>
-              <w:t>A · B · C</w:t>
-            </w:r>
-            <w:r>
-              <w:rPr>
-                <w:rFonts w:ascii="한컴 말랑말랑 Regular" w:hAnsi="한컴 말랑말랑 Regular" w:eastAsia="한컴 말랑말랑 Regular" w:cs="한컴 말랑말랑 Regular"/>
-                <w:b w:val="0"/>
-                <w:sz w:val="20"/>
-              </w:rPr>
-              <w:t xml:space="preserve"> 중 (    ), </w:t>
-            </w:r>
-            <w:r>
-              <w:rPr>
-                <w:rFonts w:ascii="한컴 말랑말랑 Regular" w:hAnsi="한컴 말랑말랑 Regular" w:eastAsia="한컴 말랑말랑 Regular" w:cs="한컴 말랑말랑 Regular"/>
-                <w:b w:val="0"/>
-                <w:color w:val="1F3A5F"/>
-                <w:sz w:val="20"/>
-              </w:rPr>
-              <w:t>____________</w:t>
-            </w:r>
-            <w:r>
-              <w:rPr>
-                <w:rFonts w:ascii="한컴 말랑말랑 Regular" w:hAnsi="한컴 말랑말랑 Regular" w:eastAsia="한컴 말랑말랑 Regular" w:cs="한컴 말랑말랑 Regular"/>
-                <w:b w:val="0"/>
-                <w:sz w:val="20"/>
-              </w:rPr>
-              <w:t>와 함께.</w:t>
+              <w:t xml:space="preserve"> </w:t>
             </w:r>
           </w:p>
           <w:tbl>
@@ -791,19 +298,289 @@
               <w:tblLayout w:type="fixed"/>
               <w:tblCellMar>
                 <w:top w:w="30" w:type="dxa"/>
-                <w:left w:w="90" w:type="dxa"/>
+                <w:left w:w="80" w:type="dxa"/>
                 <w:bottom w:w="30" w:type="dxa"/>
-                <w:right w:w="90" w:type="dxa"/>
+                <w:right w:w="80" w:type="dxa"/>
               </w:tblCellMar>
               <w:tblLayout w:type="fixed"/>
             </w:tblPr>
             <w:tblGrid>
-              <w:gridCol w:w="4649"/>
+              <w:gridCol w:w="1644"/>
+              <w:gridCol w:w="3572"/>
+            </w:tblGrid>
+            <w:tr>
+              <w:trPr>
+                <w:trHeight w:val="351" w:hRule="exact"/>
+              </w:trPr>
+              <w:tc>
+                <w:tcPr>
+                  <w:tcW w:type="dxa" w:w="5216"/>
+                  <w:gridSpan w:val="2"/>
+                  <w:shd w:val="clear" w:color="auto" w:fill="D94F8A"/>
+                </w:tcPr>
+                <w:p>
+                  <w:pPr>
+                    <w:spacing w:after="0" w:before="0"/>
+                  </w:pPr>
+                  <w:r>
+                    <w:rPr>
+                      <w:rFonts w:ascii="한컴 말랑말랑 Bold" w:hAnsi="한컴 말랑말랑 Bold" w:eastAsia="한컴 말랑말랑 Bold" w:cs="한컴 말랑말랑 Bold"/>
+                      <w:b/>
+                      <w:color w:val="FFFFFF"/>
+                      <w:sz w:val="21"/>
+                    </w:rPr>
+                    <w:t>2  만난 친구 NPC</w:t>
+                  </w:r>
+                  <w:r>
+                    <w:rPr>
+                      <w:rFonts w:ascii="한컴 말랑말랑 Regular" w:hAnsi="한컴 말랑말랑 Regular" w:eastAsia="한컴 말랑말랑 Regular" w:cs="한컴 말랑말랑 Regular"/>
+                      <w:b w:val="0"/>
+                      <w:color w:val="FFE3EF"/>
+                      <w:sz w:val="16"/>
+                    </w:rPr>
+                    <w:t xml:space="preserve">   다른 모둠 NPC와 대화한 뒤에 써요</w:t>
+                  </w:r>
+                </w:p>
+              </w:tc>
+            </w:tr>
+            <w:tr>
+              <w:trPr>
+                <w:trHeight w:val="538" w:hRule="atLeast"/>
+              </w:trPr>
+              <w:tc>
+                <w:tcPr>
+                  <w:tcW w:type="dxa" w:w="1644"/>
+                  <w:shd w:val="clear" w:color="auto" w:fill="FFF0F6"/>
+                  <w:vAlign w:val="center"/>
+                </w:tcPr>
+                <w:p>
+                  <w:pPr>
+                    <w:spacing w:after="0" w:before="0" w:line="276" w:lineRule="auto"/>
+                  </w:pPr>
+                  <w:r>
+                    <w:rPr>
+                      <w:rFonts w:ascii="한컴 말랑말랑 Bold" w:hAnsi="한컴 말랑말랑 Bold" w:eastAsia="한컴 말랑말랑 Bold" w:cs="한컴 말랑말랑 Bold"/>
+                      <w:b/>
+                      <w:color w:val="B03A6E"/>
+                      <w:sz w:val="18"/>
+                    </w:rPr>
+                    <w:t>NPC 이름</w:t>
+                    <w:br/>
+                    <w:t>만든 모둠</w:t>
+                  </w:r>
+                </w:p>
+              </w:tc>
+              <w:tc>
+                <w:tcPr>
+                  <w:tcW w:type="dxa" w:w="3572"/>
+                  <w:vAlign w:val="top"/>
+                </w:tcPr>
+                <w:p>
+                  <w:pPr>
+                    <w:spacing w:after="0" w:before="0"/>
+                  </w:pPr>
+                  <w:r>
+                    <w:rPr>
+                      <w:rFonts w:ascii="한컴 말랑말랑 Regular" w:hAnsi="한컴 말랑말랑 Regular" w:eastAsia="한컴 말랑말랑 Regular" w:cs="한컴 말랑말랑 Regular"/>
+                      <w:b w:val="0"/>
+                      <w:color w:val="666666"/>
+                      <w:sz w:val="17"/>
+                    </w:rPr>
+                    <w:t>이름:</w:t>
+                  </w:r>
+                  <w:r>
+                    <w:rPr>
+                      <w:rFonts w:ascii="한컴 말랑말랑 Regular" w:hAnsi="한컴 말랑말랑 Regular" w:eastAsia="한컴 말랑말랑 Regular" w:cs="한컴 말랑말랑 Regular"/>
+                      <w:b w:val="0"/>
+                      <w:color w:val="666666"/>
+                      <w:sz w:val="17"/>
+                    </w:rPr>
+                    <w:t xml:space="preserve">                          </w:t>
+                  </w:r>
+                  <w:r>
+                    <w:rPr>
+                      <w:rFonts w:ascii="한컴 말랑말랑 Regular" w:hAnsi="한컴 말랑말랑 Regular" w:eastAsia="한컴 말랑말랑 Regular" w:cs="한컴 말랑말랑 Regular"/>
+                      <w:b w:val="0"/>
+                      <w:color w:val="666666"/>
+                      <w:sz w:val="17"/>
+                    </w:rPr>
+                    <w:t>만든 모둠: ____모둠</w:t>
+                  </w:r>
+                </w:p>
+              </w:tc>
+            </w:tr>
+            <w:tr>
+              <w:trPr>
+                <w:trHeight w:val="595" w:hRule="atLeast"/>
+              </w:trPr>
+              <w:tc>
+                <w:tcPr>
+                  <w:tcW w:type="dxa" w:w="1644"/>
+                  <w:shd w:val="clear" w:color="auto" w:fill="FFF0F6"/>
+                  <w:vAlign w:val="center"/>
+                </w:tcPr>
+                <w:p>
+                  <w:pPr>
+                    <w:spacing w:after="0" w:before="0" w:line="276" w:lineRule="auto"/>
+                  </w:pPr>
+                  <w:r>
+                    <w:rPr>
+                      <w:rFonts w:ascii="한컴 말랑말랑 Bold" w:hAnsi="한컴 말랑말랑 Bold" w:eastAsia="한컴 말랑말랑 Bold" w:cs="한컴 말랑말랑 Bold"/>
+                      <w:b/>
+                      <w:color w:val="B03A6E"/>
+                      <w:sz w:val="18"/>
+                    </w:rPr>
+                    <w:t>이 친구의</w:t>
+                    <w:br/>
+                    <w:t>마음은?</w:t>
+                  </w:r>
+                </w:p>
+              </w:tc>
+              <w:tc>
+                <w:tcPr>
+                  <w:tcW w:type="dxa" w:w="3572"/>
+                  <w:vAlign w:val="top"/>
+                </w:tcPr>
+                <w:p/>
+              </w:tc>
+            </w:tr>
+            <w:tr>
+              <w:trPr>
+                <w:trHeight w:val="822" w:hRule="atLeast"/>
+              </w:trPr>
+              <w:tc>
+                <w:tcPr>
+                  <w:tcW w:type="dxa" w:w="1644"/>
+                  <w:shd w:val="clear" w:color="auto" w:fill="FFF0F6"/>
+                  <w:vAlign w:val="center"/>
+                </w:tcPr>
+                <w:p>
+                  <w:pPr>
+                    <w:spacing w:after="0" w:before="0" w:line="276" w:lineRule="auto"/>
+                  </w:pPr>
+                  <w:r>
+                    <w:rPr>
+                      <w:rFonts w:ascii="한컴 말랑말랑 Bold" w:hAnsi="한컴 말랑말랑 Bold" w:eastAsia="한컴 말랑말랑 Bold" w:cs="한컴 말랑말랑 Bold"/>
+                      <w:b/>
+                      <w:color w:val="B03A6E"/>
+                      <w:sz w:val="18"/>
+                    </w:rPr>
+                    <w:t>가장 바라는</w:t>
+                    <w:br/>
+                    <w:t>것은?</w:t>
+                  </w:r>
+                </w:p>
+              </w:tc>
+              <w:tc>
+                <w:tcPr>
+                  <w:tcW w:type="dxa" w:w="3572"/>
+                  <w:vAlign w:val="top"/>
+                </w:tcPr>
+                <w:p/>
+              </w:tc>
+            </w:tr>
+            <w:tr>
+              <w:trPr>
+                <w:trHeight w:val="708" w:hRule="atLeast"/>
+              </w:trPr>
+              <w:tc>
+                <w:tcPr>
+                  <w:tcW w:type="dxa" w:w="1644"/>
+                  <w:shd w:val="clear" w:color="auto" w:fill="FFF0F6"/>
+                  <w:vAlign w:val="center"/>
+                </w:tcPr>
+                <w:p>
+                  <w:pPr>
+                    <w:spacing w:after="0" w:before="0" w:line="276" w:lineRule="auto"/>
+                  </w:pPr>
+                  <w:r>
+                    <w:rPr>
+                      <w:rFonts w:ascii="한컴 말랑말랑 Bold" w:hAnsi="한컴 말랑말랑 Bold" w:eastAsia="한컴 말랑말랑 Bold" w:cs="한컴 말랑말랑 Bold"/>
+                      <w:b/>
+                      <w:color w:val="B03A6E"/>
+                      <w:sz w:val="18"/>
+                    </w:rPr>
+                    <w:t>내가 고른</w:t>
+                    <w:br/>
+                    <w:t>방법과</w:t>
+                    <w:br/>
+                    <w:t>함께할 사람</w:t>
+                  </w:r>
+                </w:p>
+              </w:tc>
+              <w:tc>
+                <w:tcPr>
+                  <w:tcW w:type="dxa" w:w="3572"/>
+                  <w:vAlign w:val="top"/>
+                </w:tcPr>
+                <w:p>
+                  <w:pPr>
+                    <w:spacing w:after="0" w:before="0"/>
+                  </w:pPr>
+                  <w:r>
+                    <w:rPr>
+                      <w:rFonts w:ascii="한컴 말랑말랑 Bold" w:hAnsi="한컴 말랑말랑 Bold" w:eastAsia="한컴 말랑말랑 Bold" w:cs="한컴 말랑말랑 Bold"/>
+                      <w:b/>
+                      <w:color w:val="1F3A5F"/>
+                      <w:sz w:val="19"/>
+                    </w:rPr>
+                    <w:t>A · B · C  중  (      )</w:t>
+                  </w:r>
+                  <w:r>
+                    <w:rPr>
+                      <w:rFonts w:ascii="한컴 말랑말랑 Regular" w:hAnsi="한컴 말랑말랑 Regular" w:eastAsia="한컴 말랑말랑 Regular" w:cs="한컴 말랑말랑 Regular"/>
+                      <w:b w:val="0"/>
+                      <w:color w:val="666666"/>
+                      <w:sz w:val="18"/>
+                    </w:rPr>
+                    <w:t xml:space="preserve">   함께할 사람:</w:t>
+                  </w:r>
+                </w:p>
+              </w:tc>
+            </w:tr>
+          </w:tbl>
+          <w:p>
+            <w:pPr>
+              <w:spacing w:after="0" w:before="0" w:line="120" w:lineRule="exact"/>
+            </w:pPr>
+            <w:r>
+              <w:rPr>
+                <w:rFonts w:ascii="한컴 말랑말랑 Regular" w:hAnsi="한컴 말랑말랑 Regular" w:eastAsia="한컴 말랑말랑 Regular" w:cs="한컴 말랑말랑 Regular"/>
+                <w:b w:val="0"/>
+                <w:sz w:val="4"/>
+              </w:rPr>
+              <w:t xml:space="preserve"> </w:t>
+            </w:r>
+          </w:p>
+          <w:tbl>
+            <w:tblPr>
+              <w:tblW w:type="auto" w:w="0"/>
+              <w:jc w:val="center"/>
+              <w:tblLook w:firstColumn="1" w:firstRow="1" w:lastColumn="0" w:lastRow="0" w:noHBand="0" w:noVBand="1" w:val="04A0"/>
+              <w:tblBorders>
+                <w:top w:val="single" w:sz="6" w:color="D94F8A"/>
+                <w:left w:val="single" w:sz="6" w:color="D94F8A"/>
+                <w:bottom w:val="single" w:sz="6" w:color="D94F8A"/>
+                <w:right w:val="single" w:sz="6" w:color="D94F8A"/>
+                <w:insideH w:val="single" w:sz="6" w:color="D94F8A"/>
+                <w:insideV w:val="single" w:sz="6" w:color="D94F8A"/>
+              </w:tblBorders>
+              <w:tblLayout w:type="fixed"/>
+              <w:tblCellMar>
+                <w:top w:w="30" w:type="dxa"/>
+                <w:left w:w="80" w:type="dxa"/>
+                <w:bottom w:w="30" w:type="dxa"/>
+                <w:right w:w="80" w:type="dxa"/>
+              </w:tblCellMar>
+              <w:tblLayout w:type="fixed"/>
+            </w:tblPr>
+            <w:tblGrid>
+              <w:gridCol w:w="5216"/>
             </w:tblGrid>
             <w:tr>
               <w:tc>
                 <w:tcPr>
-                  <w:tcW w:type="dxa" w:w="4649"/>
+                  <w:tcW w:type="dxa" w:w="5216"/>
                   <w:shd w:val="clear" w:color="auto" w:fill="FFF0F6"/>
                 </w:tcPr>
                 <w:p>
@@ -816,21 +593,20 @@
                       <w:rFonts w:ascii="한컴 말랑말랑 Bold" w:hAnsi="한컴 말랑말랑 Bold" w:eastAsia="한컴 말랑말랑 Bold" w:cs="한컴 말랑말랑 Bold"/>
                       <w:b/>
                       <w:color w:val="B03A6E"/>
-                      <w:sz w:val="18"/>
+                      <w:sz w:val="17"/>
                     </w:rPr>
-                    <w:t>✉️ 다 쓰면 만든 모둠에게 돌려줘요.</w:t>
+                    <w:t>✉️ 다 쓰면 만든 모둠에게 돌려줘요.  이름 대신 모둠·별칭만 써요.</w:t>
                   </w:r>
                 </w:p>
               </w:tc>
             </w:tr>
           </w:tbl>
-          <w:p/>
+          <w:p>
+            <w:pPr>
+              <w:spacing w:after="0" w:line="20" w:lineRule="exact"/>
+            </w:pPr>
+          </w:p>
         </w:tc>
-      </w:tr>
-      <w:tr>
-        <w:trPr>
-          <w:trHeight w:val="7484" w:hRule="exact"/>
-        </w:trPr>
         <w:tc>
           <w:tcPr>
             <w:tcW w:type="dxa" w:w="5386"/>
@@ -838,49 +614,8 @@
           </w:tcPr>
           <w:p>
             <w:pPr>
-              <w:spacing w:after="40" w:before="0"/>
+              <w:spacing w:after="0" w:line="20" w:lineRule="exact"/>
             </w:pPr>
-            <w:r>
-              <w:rPr>
-                <w:rFonts w:ascii="한컴 말랑말랑 Bold" w:hAnsi="한컴 말랑말랑 Bold" w:eastAsia="한컴 말랑말랑 Bold" w:cs="한컴 말랑말랑 Bold"/>
-                <w:b/>
-                <w:color w:val="B03A6E"/>
-                <w:sz w:val="26"/>
-              </w:rPr>
-              <w:t>👥 친구 NPC 검토 카드</w:t>
-            </w:r>
-            <w:r>
-              <w:rPr>
-                <w:rFonts w:ascii="한컴 말랑말랑 Regular" w:hAnsi="한컴 말랑말랑 Regular" w:eastAsia="한컴 말랑말랑 Regular" w:cs="한컴 말랑말랑 Regular"/>
-                <w:b w:val="0"/>
-                <w:color w:val="666666"/>
-                <w:sz w:val="17"/>
-              </w:rPr>
-              <w:t xml:space="preserve">   9차시 · 비밀 임무 2</w:t>
-            </w:r>
-          </w:p>
-          <w:p>
-            <w:pPr>
-              <w:spacing w:after="60" w:before="0"/>
-            </w:pPr>
-            <w:r>
-              <w:rPr>
-                <w:rFonts w:ascii="한컴 말랑말랑 Regular" w:hAnsi="한컴 말랑말랑 Regular" w:eastAsia="한컴 말랑말랑 Regular" w:cs="한컴 말랑말랑 Regular"/>
-                <w:b w:val="0"/>
-                <w:color w:val="1F3A5F"/>
-                <w:sz w:val="19"/>
-              </w:rPr>
-              <w:t xml:space="preserve">모둠 ____   별칭 __________   </w:t>
-            </w:r>
-            <w:r>
-              <w:rPr>
-                <w:rFonts w:ascii="한컴 말랑말랑 Regular" w:hAnsi="한컴 말랑말랑 Regular" w:eastAsia="한컴 말랑말랑 Regular" w:cs="한컴 말랑말랑 Regular"/>
-                <w:b w:val="0"/>
-                <w:color w:val="666666"/>
-                <w:sz w:val="16"/>
-              </w:rPr>
-              <w:t>(이름은 쓰지 않아요)</w:t>
-            </w:r>
           </w:p>
           <w:tbl>
             <w:tblPr>
@@ -888,30 +623,30 @@
               <w:jc w:val="center"/>
               <w:tblLook w:firstColumn="1" w:firstRow="1" w:lastColumn="0" w:lastRow="0" w:noHBand="0" w:noVBand="1" w:val="04A0"/>
               <w:tblBorders>
-                <w:top w:val="single" w:sz="8" w:color="D94F8A"/>
-                <w:left w:val="single" w:sz="8" w:color="D94F8A"/>
-                <w:bottom w:val="single" w:sz="8" w:color="D94F8A"/>
-                <w:right w:val="single" w:sz="8" w:color="D94F8A"/>
-                <w:insideH w:val="single" w:sz="8" w:color="D94F8A"/>
-                <w:insideV w:val="single" w:sz="8" w:color="D94F8A"/>
+                <w:top w:val="single" w:sz="2" w:color="FFFFFF"/>
+                <w:left w:val="single" w:sz="2" w:color="FFFFFF"/>
+                <w:bottom w:val="single" w:sz="2" w:color="FFFFFF"/>
+                <w:right w:val="single" w:sz="2" w:color="FFFFFF"/>
+                <w:insideH w:val="nil"/>
+                <w:insideV w:val="nil"/>
               </w:tblBorders>
               <w:tblLayout w:type="fixed"/>
               <w:tblCellMar>
-                <w:top w:w="40" w:type="dxa"/>
-                <w:left w:w="90" w:type="dxa"/>
-                <w:bottom w:w="40" w:type="dxa"/>
-                <w:right w:w="90" w:type="dxa"/>
+                <w:top w:w="0" w:type="dxa"/>
+                <w:left w:w="0" w:type="dxa"/>
+                <w:bottom w:w="0" w:type="dxa"/>
+                <w:right w:w="0" w:type="dxa"/>
               </w:tblCellMar>
               <w:tblLayout w:type="fixed"/>
             </w:tblPr>
             <w:tblGrid>
-              <w:gridCol w:w="4649"/>
+              <w:gridCol w:w="2721"/>
+              <w:gridCol w:w="2494"/>
             </w:tblGrid>
             <w:tr>
               <w:tc>
                 <w:tcPr>
-                  <w:tcW w:type="dxa" w:w="4649"/>
-                  <w:shd w:val="clear" w:color="auto" w:fill="F6C9DD"/>
+                  <w:tcW w:type="dxa" w:w="2721"/>
                 </w:tcPr>
                 <w:p>
                   <w:pPr>
@@ -922,18 +657,29 @@
                       <w:rFonts w:ascii="한컴 말랑말랑 Bold" w:hAnsi="한컴 말랑말랑 Bold" w:eastAsia="한컴 말랑말랑 Bold" w:cs="한컴 말랑말랑 Bold"/>
                       <w:b/>
                       <w:color w:val="B03A6E"/>
-                      <w:sz w:val="21"/>
+                      <w:sz w:val="26"/>
                     </w:rPr>
-                    <w:t xml:space="preserve">1  우리 모둠 NPC  </w:t>
+                    <w:t>👥 친구 NPC 검토 카드</w:t>
                   </w:r>
+                </w:p>
+              </w:tc>
+              <w:tc>
+                <w:tcPr>
+                  <w:tcW w:type="dxa" w:w="2494"/>
+                </w:tcPr>
+                <w:p>
+                  <w:pPr>
+                    <w:spacing w:after="0" w:before="0"/>
+                    <w:jc w:val="right"/>
+                  </w:pPr>
                   <w:r>
                     <w:rPr>
                       <w:rFonts w:ascii="한컴 말랑말랑 Regular" w:hAnsi="한컴 말랑말랑 Regular" w:eastAsia="한컴 말랑말랑 Regular" w:cs="한컴 말랑말랑 Regular"/>
                       <w:b w:val="0"/>
-                      <w:color w:val="666666"/>
-                      <w:sz w:val="17"/>
+                      <w:color w:val="1F3A5F"/>
+                      <w:sz w:val="19"/>
                     </w:rPr>
-                    <w:t>대화하기 전에 써요</w:t>
+                    <w:t>모둠 ____  별칭 ________</w:t>
                   </w:r>
                 </w:p>
               </w:tc>
@@ -941,233 +687,15 @@
           </w:tbl>
           <w:p>
             <w:pPr>
-              <w:spacing w:after="120" w:before="120"/>
+              <w:spacing w:after="0" w:before="0" w:line="100" w:lineRule="exact"/>
             </w:pPr>
             <w:r>
               <w:rPr>
                 <w:rFonts w:ascii="한컴 말랑말랑 Regular" w:hAnsi="한컴 말랑말랑 Regular" w:eastAsia="한컴 말랑말랑 Regular" w:cs="한컴 말랑말랑 Regular"/>
                 <w:b w:val="0"/>
-                <w:sz w:val="20"/>
+                <w:sz w:val="4"/>
               </w:rPr>
-              <w:t>NPC 이름: ______________</w:t>
-            </w:r>
-          </w:p>
-          <w:p>
-            <w:pPr>
-              <w:spacing w:after="40" w:before="0"/>
-            </w:pPr>
-            <w:r>
-              <w:rPr>
-                <w:rFonts w:ascii="한컴 말랑말랑 Regular" w:hAnsi="한컴 말랑말랑 Regular" w:eastAsia="한컴 말랑말랑 Regular" w:cs="한컴 말랑말랑 Regular"/>
-                <w:b w:val="0"/>
-                <w:sz w:val="20"/>
-              </w:rPr>
-              <w:t>우리가 담으려던 이 친구의 마음 (낱말 하나)</w:t>
-            </w:r>
-          </w:p>
-          <w:p>
-            <w:pPr>
-              <w:spacing w:after="200" w:before="0"/>
-            </w:pPr>
-            <w:r>
-              <w:rPr>
-                <w:rFonts w:ascii="한컴 말랑말랑 Regular" w:hAnsi="한컴 말랑말랑 Regular" w:eastAsia="한컴 말랑말랑 Regular" w:cs="한컴 말랑말랑 Regular"/>
-                <w:b w:val="0"/>
-                <w:color w:val="1F3A5F"/>
-                <w:sz w:val="20"/>
-              </w:rPr>
-              <w:t>➜ ________________________</w:t>
-            </w:r>
-          </w:p>
-          <w:tbl>
-            <w:tblPr>
-              <w:tblW w:type="auto" w:w="0"/>
-              <w:jc w:val="center"/>
-              <w:tblLook w:firstColumn="1" w:firstRow="1" w:lastColumn="0" w:lastRow="0" w:noHBand="0" w:noVBand="1" w:val="04A0"/>
-              <w:tblBorders>
-                <w:top w:val="single" w:sz="8" w:color="D94F8A"/>
-                <w:left w:val="single" w:sz="8" w:color="D94F8A"/>
-                <w:bottom w:val="single" w:sz="8" w:color="D94F8A"/>
-                <w:right w:val="single" w:sz="8" w:color="D94F8A"/>
-                <w:insideH w:val="single" w:sz="8" w:color="D94F8A"/>
-                <w:insideV w:val="single" w:sz="8" w:color="D94F8A"/>
-              </w:tblBorders>
-              <w:tblLayout w:type="fixed"/>
-              <w:tblCellMar>
-                <w:top w:w="40" w:type="dxa"/>
-                <w:left w:w="90" w:type="dxa"/>
-                <w:bottom w:w="40" w:type="dxa"/>
-                <w:right w:w="90" w:type="dxa"/>
-              </w:tblCellMar>
-              <w:tblLayout w:type="fixed"/>
-            </w:tblPr>
-            <w:tblGrid>
-              <w:gridCol w:w="4649"/>
-            </w:tblGrid>
-            <w:tr>
-              <w:tc>
-                <w:tcPr>
-                  <w:tcW w:type="dxa" w:w="4649"/>
-                  <w:shd w:val="clear" w:color="auto" w:fill="F6C9DD"/>
-                </w:tcPr>
-                <w:p>
-                  <w:pPr>
-                    <w:spacing w:after="0" w:before="0"/>
-                  </w:pPr>
-                  <w:r>
-                    <w:rPr>
-                      <w:rFonts w:ascii="한컴 말랑말랑 Bold" w:hAnsi="한컴 말랑말랑 Bold" w:eastAsia="한컴 말랑말랑 Bold" w:cs="한컴 말랑말랑 Bold"/>
-                      <w:b/>
-                      <w:color w:val="B03A6E"/>
-                      <w:sz w:val="21"/>
-                    </w:rPr>
-                    <w:t xml:space="preserve">2  만난 친구 NPC  </w:t>
-                  </w:r>
-                  <w:r>
-                    <w:rPr>
-                      <w:rFonts w:ascii="한컴 말랑말랑 Regular" w:hAnsi="한컴 말랑말랑 Regular" w:eastAsia="한컴 말랑말랑 Regular" w:cs="한컴 말랑말랑 Regular"/>
-                      <w:b w:val="0"/>
-                      <w:color w:val="666666"/>
-                      <w:sz w:val="17"/>
-                    </w:rPr>
-                    <w:t>다른 모둠 NPC와 대화한 뒤에 써요</w:t>
-                  </w:r>
-                </w:p>
-              </w:tc>
-            </w:tr>
-          </w:tbl>
-          <w:p>
-            <w:pPr>
-              <w:spacing w:after="160" w:before="120"/>
-            </w:pPr>
-            <w:r>
-              <w:rPr>
-                <w:rFonts w:ascii="한컴 말랑말랑 Regular" w:hAnsi="한컴 말랑말랑 Regular" w:eastAsia="한컴 말랑말랑 Regular" w:cs="한컴 말랑말랑 Regular"/>
-                <w:b w:val="0"/>
-                <w:sz w:val="20"/>
-              </w:rPr>
-              <w:t>NPC 이름: ______________   만든 모둠: ____모둠</w:t>
-            </w:r>
-          </w:p>
-          <w:p>
-            <w:pPr>
-              <w:spacing w:after="160" w:before="0"/>
-            </w:pPr>
-            <w:r>
-              <w:rPr>
-                <w:rFonts w:ascii="한컴 말랑말랑 Regular" w:hAnsi="한컴 말랑말랑 Regular" w:eastAsia="한컴 말랑말랑 Regular" w:cs="한컴 말랑말랑 Regular"/>
-                <w:b w:val="0"/>
-                <w:sz w:val="20"/>
-              </w:rPr>
-              <w:t xml:space="preserve">이 친구의 마음은 </w:t>
-            </w:r>
-            <w:r>
-              <w:rPr>
-                <w:rFonts w:ascii="한컴 말랑말랑 Regular" w:hAnsi="한컴 말랑말랑 Regular" w:eastAsia="한컴 말랑말랑 Regular" w:cs="한컴 말랑말랑 Regular"/>
-                <w:b w:val="0"/>
-                <w:color w:val="1F3A5F"/>
-                <w:sz w:val="20"/>
-              </w:rPr>
-              <w:t>______________</w:t>
-            </w:r>
-            <w:r>
-              <w:rPr>
-                <w:rFonts w:ascii="한컴 말랑말랑 Regular" w:hAnsi="한컴 말랑말랑 Regular" w:eastAsia="한컴 말랑말랑 Regular" w:cs="한컴 말랑말랑 Regular"/>
-                <w:b w:val="0"/>
-                <w:sz w:val="20"/>
-              </w:rPr>
-              <w:t>이고,</w:t>
-            </w:r>
-          </w:p>
-          <w:p>
-            <w:pPr>
-              <w:spacing w:after="40" w:before="0"/>
-            </w:pPr>
-            <w:r>
-              <w:rPr>
-                <w:rFonts w:ascii="한컴 말랑말랑 Regular" w:hAnsi="한컴 말랑말랑 Regular" w:eastAsia="한컴 말랑말랑 Regular" w:cs="한컴 말랑말랑 Regular"/>
-                <w:b w:val="0"/>
-                <w:sz w:val="20"/>
-              </w:rPr>
-              <w:t xml:space="preserve">가장 바라는 것은 </w:t>
-            </w:r>
-            <w:r>
-              <w:rPr>
-                <w:rFonts w:ascii="한컴 말랑말랑 Regular" w:hAnsi="한컴 말랑말랑 Regular" w:eastAsia="한컴 말랑말랑 Regular" w:cs="한컴 말랑말랑 Regular"/>
-                <w:b w:val="0"/>
-                <w:color w:val="1F3A5F"/>
-                <w:sz w:val="20"/>
-              </w:rPr>
-              <w:t>____________________</w:t>
-            </w:r>
-            <w:r>
-              <w:rPr>
-                <w:rFonts w:ascii="한컴 말랑말랑 Regular" w:hAnsi="한컴 말랑말랑 Regular" w:eastAsia="한컴 말랑말랑 Regular" w:cs="한컴 말랑말랑 Regular"/>
-                <w:b w:val="0"/>
-                <w:sz w:val="20"/>
-              </w:rPr>
-              <w:t>이에요.</w:t>
-            </w:r>
-          </w:p>
-          <w:p>
-            <w:pPr>
-              <w:spacing w:after="200" w:before="0"/>
-            </w:pPr>
-            <w:r>
-              <w:rPr>
-                <w:rFonts w:ascii="한컴 말랑말랑 Regular" w:hAnsi="한컴 말랑말랑 Regular" w:eastAsia="한컴 말랑말랑 Regular" w:cs="한컴 말랑말랑 Regular"/>
-                <w:b w:val="0"/>
-                <w:color w:val="1F3A5F"/>
-                <w:sz w:val="20"/>
-              </w:rPr>
-              <w:t>________________________________</w:t>
-            </w:r>
-          </w:p>
-          <w:p>
-            <w:pPr>
-              <w:spacing w:after="200" w:before="0"/>
-            </w:pPr>
-            <w:r>
-              <w:rPr>
-                <w:rFonts w:ascii="한컴 말랑말랑 Regular" w:hAnsi="한컴 말랑말랑 Regular" w:eastAsia="한컴 말랑말랑 Regular" w:cs="한컴 말랑말랑 Regular"/>
-                <w:b w:val="0"/>
-                <w:sz w:val="20"/>
-              </w:rPr>
-              <w:t xml:space="preserve">내 선택:  </w:t>
-            </w:r>
-            <w:r>
-              <w:rPr>
-                <w:rFonts w:ascii="한컴 말랑말랑 Bold" w:hAnsi="한컴 말랑말랑 Bold" w:eastAsia="한컴 말랑말랑 Bold" w:cs="한컴 말랑말랑 Bold"/>
-                <w:b/>
-                <w:color w:val="1F3A5F"/>
-                <w:sz w:val="20"/>
-              </w:rPr>
-              <w:t>A · B · C</w:t>
-            </w:r>
-            <w:r>
-              <w:rPr>
-                <w:rFonts w:ascii="한컴 말랑말랑 Regular" w:hAnsi="한컴 말랑말랑 Regular" w:eastAsia="한컴 말랑말랑 Regular" w:cs="한컴 말랑말랑 Regular"/>
-                <w:b w:val="0"/>
-                <w:sz w:val="20"/>
-              </w:rPr>
-              <w:t xml:space="preserve"> 중 (    ), </w:t>
-            </w:r>
-            <w:r>
-              <w:rPr>
-                <w:rFonts w:ascii="한컴 말랑말랑 Regular" w:hAnsi="한컴 말랑말랑 Regular" w:eastAsia="한컴 말랑말랑 Regular" w:cs="한컴 말랑말랑 Regular"/>
-                <w:b w:val="0"/>
-                <w:color w:val="1F3A5F"/>
-                <w:sz w:val="20"/>
-              </w:rPr>
-              <w:t>____________</w:t>
-            </w:r>
-            <w:r>
-              <w:rPr>
-                <w:rFonts w:ascii="한컴 말랑말랑 Regular" w:hAnsi="한컴 말랑말랑 Regular" w:eastAsia="한컴 말랑말랑 Regular" w:cs="한컴 말랑말랑 Regular"/>
-                <w:b w:val="0"/>
-                <w:sz w:val="20"/>
-              </w:rPr>
-              <w:t>와 함께.</w:t>
+              <w:t xml:space="preserve"> </w:t>
             </w:r>
           </w:p>
           <w:tbl>
@@ -1186,122 +714,25 @@
               <w:tblLayout w:type="fixed"/>
               <w:tblCellMar>
                 <w:top w:w="30" w:type="dxa"/>
-                <w:left w:w="90" w:type="dxa"/>
+                <w:left w:w="80" w:type="dxa"/>
                 <w:bottom w:w="30" w:type="dxa"/>
-                <w:right w:w="90" w:type="dxa"/>
+                <w:right w:w="80" w:type="dxa"/>
               </w:tblCellMar>
               <w:tblLayout w:type="fixed"/>
             </w:tblPr>
             <w:tblGrid>
-              <w:gridCol w:w="4649"/>
+              <w:gridCol w:w="1644"/>
+              <w:gridCol w:w="3572"/>
             </w:tblGrid>
             <w:tr>
+              <w:trPr>
+                <w:trHeight w:val="351" w:hRule="exact"/>
+              </w:trPr>
               <w:tc>
                 <w:tcPr>
-                  <w:tcW w:type="dxa" w:w="4649"/>
-                  <w:shd w:val="clear" w:color="auto" w:fill="FFF0F6"/>
-                </w:tcPr>
-                <w:p>
-                  <w:pPr>
-                    <w:spacing w:after="0" w:before="0"/>
-                    <w:jc w:val="center"/>
-                  </w:pPr>
-                  <w:r>
-                    <w:rPr>
-                      <w:rFonts w:ascii="한컴 말랑말랑 Bold" w:hAnsi="한컴 말랑말랑 Bold" w:eastAsia="한컴 말랑말랑 Bold" w:cs="한컴 말랑말랑 Bold"/>
-                      <w:b/>
-                      <w:color w:val="B03A6E"/>
-                      <w:sz w:val="18"/>
-                    </w:rPr>
-                    <w:t>✉️ 다 쓰면 만든 모둠에게 돌려줘요.</w:t>
-                  </w:r>
-                </w:p>
-              </w:tc>
-            </w:tr>
-          </w:tbl>
-          <w:p/>
-        </w:tc>
-        <w:tc>
-          <w:tcPr>
-            <w:tcW w:type="dxa" w:w="5386"/>
-            <w:vAlign w:val="top"/>
-          </w:tcPr>
-          <w:p>
-            <w:pPr>
-              <w:spacing w:after="40" w:before="0"/>
-            </w:pPr>
-            <w:r>
-              <w:rPr>
-                <w:rFonts w:ascii="한컴 말랑말랑 Bold" w:hAnsi="한컴 말랑말랑 Bold" w:eastAsia="한컴 말랑말랑 Bold" w:cs="한컴 말랑말랑 Bold"/>
-                <w:b/>
-                <w:color w:val="B03A6E"/>
-                <w:sz w:val="26"/>
-              </w:rPr>
-              <w:t>👥 친구 NPC 검토 카드</w:t>
-            </w:r>
-            <w:r>
-              <w:rPr>
-                <w:rFonts w:ascii="한컴 말랑말랑 Regular" w:hAnsi="한컴 말랑말랑 Regular" w:eastAsia="한컴 말랑말랑 Regular" w:cs="한컴 말랑말랑 Regular"/>
-                <w:b w:val="0"/>
-                <w:color w:val="666666"/>
-                <w:sz w:val="17"/>
-              </w:rPr>
-              <w:t xml:space="preserve">   9차시 · 비밀 임무 2</w:t>
-            </w:r>
-          </w:p>
-          <w:p>
-            <w:pPr>
-              <w:spacing w:after="60" w:before="0"/>
-            </w:pPr>
-            <w:r>
-              <w:rPr>
-                <w:rFonts w:ascii="한컴 말랑말랑 Regular" w:hAnsi="한컴 말랑말랑 Regular" w:eastAsia="한컴 말랑말랑 Regular" w:cs="한컴 말랑말랑 Regular"/>
-                <w:b w:val="0"/>
-                <w:color w:val="1F3A5F"/>
-                <w:sz w:val="19"/>
-              </w:rPr>
-              <w:t xml:space="preserve">모둠 ____   별칭 __________   </w:t>
-            </w:r>
-            <w:r>
-              <w:rPr>
-                <w:rFonts w:ascii="한컴 말랑말랑 Regular" w:hAnsi="한컴 말랑말랑 Regular" w:eastAsia="한컴 말랑말랑 Regular" w:cs="한컴 말랑말랑 Regular"/>
-                <w:b w:val="0"/>
-                <w:color w:val="666666"/>
-                <w:sz w:val="16"/>
-              </w:rPr>
-              <w:t>(이름은 쓰지 않아요)</w:t>
-            </w:r>
-          </w:p>
-          <w:tbl>
-            <w:tblPr>
-              <w:tblW w:type="auto" w:w="0"/>
-              <w:jc w:val="center"/>
-              <w:tblLook w:firstColumn="1" w:firstRow="1" w:lastColumn="0" w:lastRow="0" w:noHBand="0" w:noVBand="1" w:val="04A0"/>
-              <w:tblBorders>
-                <w:top w:val="single" w:sz="8" w:color="D94F8A"/>
-                <w:left w:val="single" w:sz="8" w:color="D94F8A"/>
-                <w:bottom w:val="single" w:sz="8" w:color="D94F8A"/>
-                <w:right w:val="single" w:sz="8" w:color="D94F8A"/>
-                <w:insideH w:val="single" w:sz="8" w:color="D94F8A"/>
-                <w:insideV w:val="single" w:sz="8" w:color="D94F8A"/>
-              </w:tblBorders>
-              <w:tblLayout w:type="fixed"/>
-              <w:tblCellMar>
-                <w:top w:w="40" w:type="dxa"/>
-                <w:left w:w="90" w:type="dxa"/>
-                <w:bottom w:w="40" w:type="dxa"/>
-                <w:right w:w="90" w:type="dxa"/>
-              </w:tblCellMar>
-              <w:tblLayout w:type="fixed"/>
-            </w:tblPr>
-            <w:tblGrid>
-              <w:gridCol w:w="4649"/>
-            </w:tblGrid>
-            <w:tr>
-              <w:tc>
-                <w:tcPr>
-                  <w:tcW w:type="dxa" w:w="4649"/>
-                  <w:shd w:val="clear" w:color="auto" w:fill="F6C9DD"/>
+                  <w:tcW w:type="dxa" w:w="5216"/>
+                  <w:gridSpan w:val="2"/>
+                  <w:shd w:val="clear" w:color="auto" w:fill="D94F8A"/>
                 </w:tcPr>
                 <w:p>
                   <w:pPr>
@@ -1311,253 +742,105 @@
                     <w:rPr>
                       <w:rFonts w:ascii="한컴 말랑말랑 Bold" w:hAnsi="한컴 말랑말랑 Bold" w:eastAsia="한컴 말랑말랑 Bold" w:cs="한컴 말랑말랑 Bold"/>
                       <w:b/>
-                      <w:color w:val="B03A6E"/>
+                      <w:color w:val="FFFFFF"/>
                       <w:sz w:val="21"/>
                     </w:rPr>
-                    <w:t xml:space="preserve">1  우리 모둠 NPC  </w:t>
+                    <w:t>1  우리 모둠 NPC</w:t>
                   </w:r>
                   <w:r>
                     <w:rPr>
                       <w:rFonts w:ascii="한컴 말랑말랑 Regular" w:hAnsi="한컴 말랑말랑 Regular" w:eastAsia="한컴 말랑말랑 Regular" w:cs="한컴 말랑말랑 Regular"/>
                       <w:b w:val="0"/>
-                      <w:color w:val="666666"/>
-                      <w:sz w:val="17"/>
+                      <w:color w:val="FFE3EF"/>
+                      <w:sz w:val="16"/>
                     </w:rPr>
-                    <w:t>대화하기 전에 써요</w:t>
+                    <w:t xml:space="preserve">   대화하기 전에 써요</w:t>
                   </w:r>
                 </w:p>
               </w:tc>
             </w:tr>
-          </w:tbl>
-          <w:p>
-            <w:pPr>
-              <w:spacing w:after="120" w:before="120"/>
-            </w:pPr>
-            <w:r>
-              <w:rPr>
-                <w:rFonts w:ascii="한컴 말랑말랑 Regular" w:hAnsi="한컴 말랑말랑 Regular" w:eastAsia="한컴 말랑말랑 Regular" w:cs="한컴 말랑말랑 Regular"/>
-                <w:b w:val="0"/>
-                <w:sz w:val="20"/>
-              </w:rPr>
-              <w:t>NPC 이름: ______________</w:t>
-            </w:r>
-          </w:p>
-          <w:p>
-            <w:pPr>
-              <w:spacing w:after="40" w:before="0"/>
-            </w:pPr>
-            <w:r>
-              <w:rPr>
-                <w:rFonts w:ascii="한컴 말랑말랑 Regular" w:hAnsi="한컴 말랑말랑 Regular" w:eastAsia="한컴 말랑말랑 Regular" w:cs="한컴 말랑말랑 Regular"/>
-                <w:b w:val="0"/>
-                <w:sz w:val="20"/>
-              </w:rPr>
-              <w:t>우리가 담으려던 이 친구의 마음 (낱말 하나)</w:t>
-            </w:r>
-          </w:p>
-          <w:p>
-            <w:pPr>
-              <w:spacing w:after="200" w:before="0"/>
-            </w:pPr>
-            <w:r>
-              <w:rPr>
-                <w:rFonts w:ascii="한컴 말랑말랑 Regular" w:hAnsi="한컴 말랑말랑 Regular" w:eastAsia="한컴 말랑말랑 Regular" w:cs="한컴 말랑말랑 Regular"/>
-                <w:b w:val="0"/>
-                <w:color w:val="1F3A5F"/>
-                <w:sz w:val="20"/>
-              </w:rPr>
-              <w:t>➜ ________________________</w:t>
-            </w:r>
-          </w:p>
-          <w:tbl>
-            <w:tblPr>
-              <w:tblW w:type="auto" w:w="0"/>
-              <w:jc w:val="center"/>
-              <w:tblLook w:firstColumn="1" w:firstRow="1" w:lastColumn="0" w:lastRow="0" w:noHBand="0" w:noVBand="1" w:val="04A0"/>
-              <w:tblBorders>
-                <w:top w:val="single" w:sz="8" w:color="D94F8A"/>
-                <w:left w:val="single" w:sz="8" w:color="D94F8A"/>
-                <w:bottom w:val="single" w:sz="8" w:color="D94F8A"/>
-                <w:right w:val="single" w:sz="8" w:color="D94F8A"/>
-                <w:insideH w:val="single" w:sz="8" w:color="D94F8A"/>
-                <w:insideV w:val="single" w:sz="8" w:color="D94F8A"/>
-              </w:tblBorders>
-              <w:tblLayout w:type="fixed"/>
-              <w:tblCellMar>
-                <w:top w:w="40" w:type="dxa"/>
-                <w:left w:w="90" w:type="dxa"/>
-                <w:bottom w:w="40" w:type="dxa"/>
-                <w:right w:w="90" w:type="dxa"/>
-              </w:tblCellMar>
-              <w:tblLayout w:type="fixed"/>
-            </w:tblPr>
-            <w:tblGrid>
-              <w:gridCol w:w="4649"/>
-            </w:tblGrid>
             <w:tr>
+              <w:trPr>
+                <w:trHeight w:val="425" w:hRule="atLeast"/>
+              </w:trPr>
               <w:tc>
                 <w:tcPr>
-                  <w:tcW w:type="dxa" w:w="4649"/>
-                  <w:shd w:val="clear" w:color="auto" w:fill="F6C9DD"/>
+                  <w:tcW w:type="dxa" w:w="1644"/>
+                  <w:shd w:val="clear" w:color="auto" w:fill="FFF0F6"/>
+                  <w:vAlign w:val="center"/>
                 </w:tcPr>
                 <w:p>
                   <w:pPr>
-                    <w:spacing w:after="0" w:before="0"/>
+                    <w:spacing w:after="0" w:before="0" w:line="276" w:lineRule="auto"/>
                   </w:pPr>
                   <w:r>
                     <w:rPr>
                       <w:rFonts w:ascii="한컴 말랑말랑 Bold" w:hAnsi="한컴 말랑말랑 Bold" w:eastAsia="한컴 말랑말랑 Bold" w:cs="한컴 말랑말랑 Bold"/>
                       <w:b/>
                       <w:color w:val="B03A6E"/>
-                      <w:sz w:val="21"/>
+                      <w:sz w:val="18"/>
                     </w:rPr>
-                    <w:t xml:space="preserve">2  만난 친구 NPC  </w:t>
+                    <w:t>NPC 이름</w:t>
                   </w:r>
+                </w:p>
+              </w:tc>
+              <w:tc>
+                <w:tcPr>
+                  <w:tcW w:type="dxa" w:w="3572"/>
+                  <w:vAlign w:val="top"/>
+                </w:tcPr>
+                <w:p/>
+              </w:tc>
+            </w:tr>
+            <w:tr>
+              <w:trPr>
+                <w:trHeight w:val="708" w:hRule="atLeast"/>
+              </w:trPr>
+              <w:tc>
+                <w:tcPr>
+                  <w:tcW w:type="dxa" w:w="1644"/>
+                  <w:shd w:val="clear" w:color="auto" w:fill="FFF0F6"/>
+                  <w:vAlign w:val="center"/>
+                </w:tcPr>
+                <w:p>
+                  <w:pPr>
+                    <w:spacing w:after="0" w:before="0" w:line="276" w:lineRule="auto"/>
+                  </w:pPr>
                   <w:r>
                     <w:rPr>
-                      <w:rFonts w:ascii="한컴 말랑말랑 Regular" w:hAnsi="한컴 말랑말랑 Regular" w:eastAsia="한컴 말랑말랑 Regular" w:cs="한컴 말랑말랑 Regular"/>
-                      <w:b w:val="0"/>
-                      <w:color w:val="666666"/>
-                      <w:sz w:val="17"/>
+                      <w:rFonts w:ascii="한컴 말랑말랑 Bold" w:hAnsi="한컴 말랑말랑 Bold" w:eastAsia="한컴 말랑말랑 Bold" w:cs="한컴 말랑말랑 Bold"/>
+                      <w:b/>
+                      <w:color w:val="B03A6E"/>
+                      <w:sz w:val="18"/>
                     </w:rPr>
-                    <w:t>다른 모둠 NPC와 대화한 뒤에 써요</w:t>
+                    <w:t>우리가 담으려던</w:t>
+                    <w:br/>
+                    <w:t>이 친구의 마음</w:t>
+                    <w:br/>
+                    <w:t>(낱말 하나)</w:t>
                   </w:r>
                 </w:p>
+              </w:tc>
+              <w:tc>
+                <w:tcPr>
+                  <w:tcW w:type="dxa" w:w="3572"/>
+                  <w:vAlign w:val="top"/>
+                </w:tcPr>
+                <w:p/>
               </w:tc>
             </w:tr>
           </w:tbl>
           <w:p>
             <w:pPr>
-              <w:spacing w:after="160" w:before="120"/>
+              <w:spacing w:after="0" w:before="0" w:line="140" w:lineRule="exact"/>
             </w:pPr>
             <w:r>
               <w:rPr>
                 <w:rFonts w:ascii="한컴 말랑말랑 Regular" w:hAnsi="한컴 말랑말랑 Regular" w:eastAsia="한컴 말랑말랑 Regular" w:cs="한컴 말랑말랑 Regular"/>
                 <w:b w:val="0"/>
-                <w:sz w:val="20"/>
+                <w:sz w:val="4"/>
               </w:rPr>
-              <w:t>NPC 이름: ______________   만든 모둠: ____모둠</w:t>
-            </w:r>
-          </w:p>
-          <w:p>
-            <w:pPr>
-              <w:spacing w:after="160" w:before="0"/>
-            </w:pPr>
-            <w:r>
-              <w:rPr>
-                <w:rFonts w:ascii="한컴 말랑말랑 Regular" w:hAnsi="한컴 말랑말랑 Regular" w:eastAsia="한컴 말랑말랑 Regular" w:cs="한컴 말랑말랑 Regular"/>
-                <w:b w:val="0"/>
-                <w:sz w:val="20"/>
-              </w:rPr>
-              <w:t xml:space="preserve">이 친구의 마음은 </w:t>
-            </w:r>
-            <w:r>
-              <w:rPr>
-                <w:rFonts w:ascii="한컴 말랑말랑 Regular" w:hAnsi="한컴 말랑말랑 Regular" w:eastAsia="한컴 말랑말랑 Regular" w:cs="한컴 말랑말랑 Regular"/>
-                <w:b w:val="0"/>
-                <w:color w:val="1F3A5F"/>
-                <w:sz w:val="20"/>
-              </w:rPr>
-              <w:t>______________</w:t>
-            </w:r>
-            <w:r>
-              <w:rPr>
-                <w:rFonts w:ascii="한컴 말랑말랑 Regular" w:hAnsi="한컴 말랑말랑 Regular" w:eastAsia="한컴 말랑말랑 Regular" w:cs="한컴 말랑말랑 Regular"/>
-                <w:b w:val="0"/>
-                <w:sz w:val="20"/>
-              </w:rPr>
-              <w:t>이고,</w:t>
-            </w:r>
-          </w:p>
-          <w:p>
-            <w:pPr>
-              <w:spacing w:after="40" w:before="0"/>
-            </w:pPr>
-            <w:r>
-              <w:rPr>
-                <w:rFonts w:ascii="한컴 말랑말랑 Regular" w:hAnsi="한컴 말랑말랑 Regular" w:eastAsia="한컴 말랑말랑 Regular" w:cs="한컴 말랑말랑 Regular"/>
-                <w:b w:val="0"/>
-                <w:sz w:val="20"/>
-              </w:rPr>
-              <w:t xml:space="preserve">가장 바라는 것은 </w:t>
-            </w:r>
-            <w:r>
-              <w:rPr>
-                <w:rFonts w:ascii="한컴 말랑말랑 Regular" w:hAnsi="한컴 말랑말랑 Regular" w:eastAsia="한컴 말랑말랑 Regular" w:cs="한컴 말랑말랑 Regular"/>
-                <w:b w:val="0"/>
-                <w:color w:val="1F3A5F"/>
-                <w:sz w:val="20"/>
-              </w:rPr>
-              <w:t>____________________</w:t>
-            </w:r>
-            <w:r>
-              <w:rPr>
-                <w:rFonts w:ascii="한컴 말랑말랑 Regular" w:hAnsi="한컴 말랑말랑 Regular" w:eastAsia="한컴 말랑말랑 Regular" w:cs="한컴 말랑말랑 Regular"/>
-                <w:b w:val="0"/>
-                <w:sz w:val="20"/>
-              </w:rPr>
-              <w:t>이에요.</w:t>
-            </w:r>
-          </w:p>
-          <w:p>
-            <w:pPr>
-              <w:spacing w:after="200" w:before="0"/>
-            </w:pPr>
-            <w:r>
-              <w:rPr>
-                <w:rFonts w:ascii="한컴 말랑말랑 Regular" w:hAnsi="한컴 말랑말랑 Regular" w:eastAsia="한컴 말랑말랑 Regular" w:cs="한컴 말랑말랑 Regular"/>
-                <w:b w:val="0"/>
-                <w:color w:val="1F3A5F"/>
-                <w:sz w:val="20"/>
-              </w:rPr>
-              <w:t>________________________________</w:t>
-            </w:r>
-          </w:p>
-          <w:p>
-            <w:pPr>
-              <w:spacing w:after="200" w:before="0"/>
-            </w:pPr>
-            <w:r>
-              <w:rPr>
-                <w:rFonts w:ascii="한컴 말랑말랑 Regular" w:hAnsi="한컴 말랑말랑 Regular" w:eastAsia="한컴 말랑말랑 Regular" w:cs="한컴 말랑말랑 Regular"/>
-                <w:b w:val="0"/>
-                <w:sz w:val="20"/>
-              </w:rPr>
-              <w:t xml:space="preserve">내 선택:  </w:t>
-            </w:r>
-            <w:r>
-              <w:rPr>
-                <w:rFonts w:ascii="한컴 말랑말랑 Bold" w:hAnsi="한컴 말랑말랑 Bold" w:eastAsia="한컴 말랑말랑 Bold" w:cs="한컴 말랑말랑 Bold"/>
-                <w:b/>
-                <w:color w:val="1F3A5F"/>
-                <w:sz w:val="20"/>
-              </w:rPr>
-              <w:t>A · B · C</w:t>
-            </w:r>
-            <w:r>
-              <w:rPr>
-                <w:rFonts w:ascii="한컴 말랑말랑 Regular" w:hAnsi="한컴 말랑말랑 Regular" w:eastAsia="한컴 말랑말랑 Regular" w:cs="한컴 말랑말랑 Regular"/>
-                <w:b w:val="0"/>
-                <w:sz w:val="20"/>
-              </w:rPr>
-              <w:t xml:space="preserve"> 중 (    ), </w:t>
-            </w:r>
-            <w:r>
-              <w:rPr>
-                <w:rFonts w:ascii="한컴 말랑말랑 Regular" w:hAnsi="한컴 말랑말랑 Regular" w:eastAsia="한컴 말랑말랑 Regular" w:cs="한컴 말랑말랑 Regular"/>
-                <w:b w:val="0"/>
-                <w:color w:val="1F3A5F"/>
-                <w:sz w:val="20"/>
-              </w:rPr>
-              <w:t>____________</w:t>
-            </w:r>
-            <w:r>
-              <w:rPr>
-                <w:rFonts w:ascii="한컴 말랑말랑 Regular" w:hAnsi="한컴 말랑말랑 Regular" w:eastAsia="한컴 말랑말랑 Regular" w:cs="한컴 말랑말랑 Regular"/>
-                <w:b w:val="0"/>
-                <w:sz w:val="20"/>
-              </w:rPr>
-              <w:t>와 함께.</w:t>
+              <w:t xml:space="preserve"> </w:t>
             </w:r>
           </w:p>
           <w:tbl>
@@ -1576,19 +859,289 @@
               <w:tblLayout w:type="fixed"/>
               <w:tblCellMar>
                 <w:top w:w="30" w:type="dxa"/>
-                <w:left w:w="90" w:type="dxa"/>
+                <w:left w:w="80" w:type="dxa"/>
                 <w:bottom w:w="30" w:type="dxa"/>
-                <w:right w:w="90" w:type="dxa"/>
+                <w:right w:w="80" w:type="dxa"/>
               </w:tblCellMar>
               <w:tblLayout w:type="fixed"/>
             </w:tblPr>
             <w:tblGrid>
-              <w:gridCol w:w="4649"/>
+              <w:gridCol w:w="1644"/>
+              <w:gridCol w:w="3572"/>
+            </w:tblGrid>
+            <w:tr>
+              <w:trPr>
+                <w:trHeight w:val="351" w:hRule="exact"/>
+              </w:trPr>
+              <w:tc>
+                <w:tcPr>
+                  <w:tcW w:type="dxa" w:w="5216"/>
+                  <w:gridSpan w:val="2"/>
+                  <w:shd w:val="clear" w:color="auto" w:fill="D94F8A"/>
+                </w:tcPr>
+                <w:p>
+                  <w:pPr>
+                    <w:spacing w:after="0" w:before="0"/>
+                  </w:pPr>
+                  <w:r>
+                    <w:rPr>
+                      <w:rFonts w:ascii="한컴 말랑말랑 Bold" w:hAnsi="한컴 말랑말랑 Bold" w:eastAsia="한컴 말랑말랑 Bold" w:cs="한컴 말랑말랑 Bold"/>
+                      <w:b/>
+                      <w:color w:val="FFFFFF"/>
+                      <w:sz w:val="21"/>
+                    </w:rPr>
+                    <w:t>2  만난 친구 NPC</w:t>
+                  </w:r>
+                  <w:r>
+                    <w:rPr>
+                      <w:rFonts w:ascii="한컴 말랑말랑 Regular" w:hAnsi="한컴 말랑말랑 Regular" w:eastAsia="한컴 말랑말랑 Regular" w:cs="한컴 말랑말랑 Regular"/>
+                      <w:b w:val="0"/>
+                      <w:color w:val="FFE3EF"/>
+                      <w:sz w:val="16"/>
+                    </w:rPr>
+                    <w:t xml:space="preserve">   다른 모둠 NPC와 대화한 뒤에 써요</w:t>
+                  </w:r>
+                </w:p>
+              </w:tc>
+            </w:tr>
+            <w:tr>
+              <w:trPr>
+                <w:trHeight w:val="538" w:hRule="atLeast"/>
+              </w:trPr>
+              <w:tc>
+                <w:tcPr>
+                  <w:tcW w:type="dxa" w:w="1644"/>
+                  <w:shd w:val="clear" w:color="auto" w:fill="FFF0F6"/>
+                  <w:vAlign w:val="center"/>
+                </w:tcPr>
+                <w:p>
+                  <w:pPr>
+                    <w:spacing w:after="0" w:before="0" w:line="276" w:lineRule="auto"/>
+                  </w:pPr>
+                  <w:r>
+                    <w:rPr>
+                      <w:rFonts w:ascii="한컴 말랑말랑 Bold" w:hAnsi="한컴 말랑말랑 Bold" w:eastAsia="한컴 말랑말랑 Bold" w:cs="한컴 말랑말랑 Bold"/>
+                      <w:b/>
+                      <w:color w:val="B03A6E"/>
+                      <w:sz w:val="18"/>
+                    </w:rPr>
+                    <w:t>NPC 이름</w:t>
+                    <w:br/>
+                    <w:t>만든 모둠</w:t>
+                  </w:r>
+                </w:p>
+              </w:tc>
+              <w:tc>
+                <w:tcPr>
+                  <w:tcW w:type="dxa" w:w="3572"/>
+                  <w:vAlign w:val="top"/>
+                </w:tcPr>
+                <w:p>
+                  <w:pPr>
+                    <w:spacing w:after="0" w:before="0"/>
+                  </w:pPr>
+                  <w:r>
+                    <w:rPr>
+                      <w:rFonts w:ascii="한컴 말랑말랑 Regular" w:hAnsi="한컴 말랑말랑 Regular" w:eastAsia="한컴 말랑말랑 Regular" w:cs="한컴 말랑말랑 Regular"/>
+                      <w:b w:val="0"/>
+                      <w:color w:val="666666"/>
+                      <w:sz w:val="17"/>
+                    </w:rPr>
+                    <w:t>이름:</w:t>
+                  </w:r>
+                  <w:r>
+                    <w:rPr>
+                      <w:rFonts w:ascii="한컴 말랑말랑 Regular" w:hAnsi="한컴 말랑말랑 Regular" w:eastAsia="한컴 말랑말랑 Regular" w:cs="한컴 말랑말랑 Regular"/>
+                      <w:b w:val="0"/>
+                      <w:color w:val="666666"/>
+                      <w:sz w:val="17"/>
+                    </w:rPr>
+                    <w:t xml:space="preserve">                          </w:t>
+                  </w:r>
+                  <w:r>
+                    <w:rPr>
+                      <w:rFonts w:ascii="한컴 말랑말랑 Regular" w:hAnsi="한컴 말랑말랑 Regular" w:eastAsia="한컴 말랑말랑 Regular" w:cs="한컴 말랑말랑 Regular"/>
+                      <w:b w:val="0"/>
+                      <w:color w:val="666666"/>
+                      <w:sz w:val="17"/>
+                    </w:rPr>
+                    <w:t>만든 모둠: ____모둠</w:t>
+                  </w:r>
+                </w:p>
+              </w:tc>
+            </w:tr>
+            <w:tr>
+              <w:trPr>
+                <w:trHeight w:val="595" w:hRule="atLeast"/>
+              </w:trPr>
+              <w:tc>
+                <w:tcPr>
+                  <w:tcW w:type="dxa" w:w="1644"/>
+                  <w:shd w:val="clear" w:color="auto" w:fill="FFF0F6"/>
+                  <w:vAlign w:val="center"/>
+                </w:tcPr>
+                <w:p>
+                  <w:pPr>
+                    <w:spacing w:after="0" w:before="0" w:line="276" w:lineRule="auto"/>
+                  </w:pPr>
+                  <w:r>
+                    <w:rPr>
+                      <w:rFonts w:ascii="한컴 말랑말랑 Bold" w:hAnsi="한컴 말랑말랑 Bold" w:eastAsia="한컴 말랑말랑 Bold" w:cs="한컴 말랑말랑 Bold"/>
+                      <w:b/>
+                      <w:color w:val="B03A6E"/>
+                      <w:sz w:val="18"/>
+                    </w:rPr>
+                    <w:t>이 친구의</w:t>
+                    <w:br/>
+                    <w:t>마음은?</w:t>
+                  </w:r>
+                </w:p>
+              </w:tc>
+              <w:tc>
+                <w:tcPr>
+                  <w:tcW w:type="dxa" w:w="3572"/>
+                  <w:vAlign w:val="top"/>
+                </w:tcPr>
+                <w:p/>
+              </w:tc>
+            </w:tr>
+            <w:tr>
+              <w:trPr>
+                <w:trHeight w:val="822" w:hRule="atLeast"/>
+              </w:trPr>
+              <w:tc>
+                <w:tcPr>
+                  <w:tcW w:type="dxa" w:w="1644"/>
+                  <w:shd w:val="clear" w:color="auto" w:fill="FFF0F6"/>
+                  <w:vAlign w:val="center"/>
+                </w:tcPr>
+                <w:p>
+                  <w:pPr>
+                    <w:spacing w:after="0" w:before="0" w:line="276" w:lineRule="auto"/>
+                  </w:pPr>
+                  <w:r>
+                    <w:rPr>
+                      <w:rFonts w:ascii="한컴 말랑말랑 Bold" w:hAnsi="한컴 말랑말랑 Bold" w:eastAsia="한컴 말랑말랑 Bold" w:cs="한컴 말랑말랑 Bold"/>
+                      <w:b/>
+                      <w:color w:val="B03A6E"/>
+                      <w:sz w:val="18"/>
+                    </w:rPr>
+                    <w:t>가장 바라는</w:t>
+                    <w:br/>
+                    <w:t>것은?</w:t>
+                  </w:r>
+                </w:p>
+              </w:tc>
+              <w:tc>
+                <w:tcPr>
+                  <w:tcW w:type="dxa" w:w="3572"/>
+                  <w:vAlign w:val="top"/>
+                </w:tcPr>
+                <w:p/>
+              </w:tc>
+            </w:tr>
+            <w:tr>
+              <w:trPr>
+                <w:trHeight w:val="708" w:hRule="atLeast"/>
+              </w:trPr>
+              <w:tc>
+                <w:tcPr>
+                  <w:tcW w:type="dxa" w:w="1644"/>
+                  <w:shd w:val="clear" w:color="auto" w:fill="FFF0F6"/>
+                  <w:vAlign w:val="center"/>
+                </w:tcPr>
+                <w:p>
+                  <w:pPr>
+                    <w:spacing w:after="0" w:before="0" w:line="276" w:lineRule="auto"/>
+                  </w:pPr>
+                  <w:r>
+                    <w:rPr>
+                      <w:rFonts w:ascii="한컴 말랑말랑 Bold" w:hAnsi="한컴 말랑말랑 Bold" w:eastAsia="한컴 말랑말랑 Bold" w:cs="한컴 말랑말랑 Bold"/>
+                      <w:b/>
+                      <w:color w:val="B03A6E"/>
+                      <w:sz w:val="18"/>
+                    </w:rPr>
+                    <w:t>내가 고른</w:t>
+                    <w:br/>
+                    <w:t>방법과</w:t>
+                    <w:br/>
+                    <w:t>함께할 사람</w:t>
+                  </w:r>
+                </w:p>
+              </w:tc>
+              <w:tc>
+                <w:tcPr>
+                  <w:tcW w:type="dxa" w:w="3572"/>
+                  <w:vAlign w:val="top"/>
+                </w:tcPr>
+                <w:p>
+                  <w:pPr>
+                    <w:spacing w:after="0" w:before="0"/>
+                  </w:pPr>
+                  <w:r>
+                    <w:rPr>
+                      <w:rFonts w:ascii="한컴 말랑말랑 Bold" w:hAnsi="한컴 말랑말랑 Bold" w:eastAsia="한컴 말랑말랑 Bold" w:cs="한컴 말랑말랑 Bold"/>
+                      <w:b/>
+                      <w:color w:val="1F3A5F"/>
+                      <w:sz w:val="19"/>
+                    </w:rPr>
+                    <w:t>A · B · C  중  (      )</w:t>
+                  </w:r>
+                  <w:r>
+                    <w:rPr>
+                      <w:rFonts w:ascii="한컴 말랑말랑 Regular" w:hAnsi="한컴 말랑말랑 Regular" w:eastAsia="한컴 말랑말랑 Regular" w:cs="한컴 말랑말랑 Regular"/>
+                      <w:b w:val="0"/>
+                      <w:color w:val="666666"/>
+                      <w:sz w:val="18"/>
+                    </w:rPr>
+                    <w:t xml:space="preserve">   함께할 사람:</w:t>
+                  </w:r>
+                </w:p>
+              </w:tc>
+            </w:tr>
+          </w:tbl>
+          <w:p>
+            <w:pPr>
+              <w:spacing w:after="0" w:before="0" w:line="120" w:lineRule="exact"/>
+            </w:pPr>
+            <w:r>
+              <w:rPr>
+                <w:rFonts w:ascii="한컴 말랑말랑 Regular" w:hAnsi="한컴 말랑말랑 Regular" w:eastAsia="한컴 말랑말랑 Regular" w:cs="한컴 말랑말랑 Regular"/>
+                <w:b w:val="0"/>
+                <w:sz w:val="4"/>
+              </w:rPr>
+              <w:t xml:space="preserve"> </w:t>
+            </w:r>
+          </w:p>
+          <w:tbl>
+            <w:tblPr>
+              <w:tblW w:type="auto" w:w="0"/>
+              <w:jc w:val="center"/>
+              <w:tblLook w:firstColumn="1" w:firstRow="1" w:lastColumn="0" w:lastRow="0" w:noHBand="0" w:noVBand="1" w:val="04A0"/>
+              <w:tblBorders>
+                <w:top w:val="single" w:sz="6" w:color="D94F8A"/>
+                <w:left w:val="single" w:sz="6" w:color="D94F8A"/>
+                <w:bottom w:val="single" w:sz="6" w:color="D94F8A"/>
+                <w:right w:val="single" w:sz="6" w:color="D94F8A"/>
+                <w:insideH w:val="single" w:sz="6" w:color="D94F8A"/>
+                <w:insideV w:val="single" w:sz="6" w:color="D94F8A"/>
+              </w:tblBorders>
+              <w:tblLayout w:type="fixed"/>
+              <w:tblCellMar>
+                <w:top w:w="30" w:type="dxa"/>
+                <w:left w:w="80" w:type="dxa"/>
+                <w:bottom w:w="30" w:type="dxa"/>
+                <w:right w:w="80" w:type="dxa"/>
+              </w:tblCellMar>
+              <w:tblLayout w:type="fixed"/>
+            </w:tblPr>
+            <w:tblGrid>
+              <w:gridCol w:w="5216"/>
             </w:tblGrid>
             <w:tr>
               <w:tc>
                 <w:tcPr>
-                  <w:tcW w:type="dxa" w:w="4649"/>
+                  <w:tcW w:type="dxa" w:w="5216"/>
                   <w:shd w:val="clear" w:color="auto" w:fill="FFF0F6"/>
                 </w:tcPr>
                 <w:p>
@@ -1601,21 +1154,1152 @@
                       <w:rFonts w:ascii="한컴 말랑말랑 Bold" w:hAnsi="한컴 말랑말랑 Bold" w:eastAsia="한컴 말랑말랑 Bold" w:cs="한컴 말랑말랑 Bold"/>
                       <w:b/>
                       <w:color w:val="B03A6E"/>
-                      <w:sz w:val="18"/>
+                      <w:sz w:val="17"/>
                     </w:rPr>
-                    <w:t>✉️ 다 쓰면 만든 모둠에게 돌려줘요.</w:t>
+                    <w:t>✉️ 다 쓰면 만든 모둠에게 돌려줘요.  이름 대신 모둠·별칭만 써요.</w:t>
                   </w:r>
                 </w:p>
               </w:tc>
             </w:tr>
           </w:tbl>
-          <w:p/>
+          <w:p>
+            <w:pPr>
+              <w:spacing w:after="0" w:line="20" w:lineRule="exact"/>
+            </w:pPr>
+          </w:p>
+        </w:tc>
+      </w:tr>
+      <w:tr>
+        <w:trPr>
+          <w:trHeight w:val="7541" w:hRule="exact"/>
+        </w:trPr>
+        <w:tc>
+          <w:tcPr>
+            <w:tcW w:type="dxa" w:w="5386"/>
+            <w:vAlign w:val="top"/>
+          </w:tcPr>
+          <w:p>
+            <w:pPr>
+              <w:spacing w:after="0" w:line="20" w:lineRule="exact"/>
+            </w:pPr>
+          </w:p>
+          <w:tbl>
+            <w:tblPr>
+              <w:tblW w:type="auto" w:w="0"/>
+              <w:jc w:val="center"/>
+              <w:tblLook w:firstColumn="1" w:firstRow="1" w:lastColumn="0" w:lastRow="0" w:noHBand="0" w:noVBand="1" w:val="04A0"/>
+              <w:tblBorders>
+                <w:top w:val="single" w:sz="2" w:color="FFFFFF"/>
+                <w:left w:val="single" w:sz="2" w:color="FFFFFF"/>
+                <w:bottom w:val="single" w:sz="2" w:color="FFFFFF"/>
+                <w:right w:val="single" w:sz="2" w:color="FFFFFF"/>
+                <w:insideH w:val="nil"/>
+                <w:insideV w:val="nil"/>
+              </w:tblBorders>
+              <w:tblLayout w:type="fixed"/>
+              <w:tblCellMar>
+                <w:top w:w="0" w:type="dxa"/>
+                <w:left w:w="0" w:type="dxa"/>
+                <w:bottom w:w="0" w:type="dxa"/>
+                <w:right w:w="0" w:type="dxa"/>
+              </w:tblCellMar>
+              <w:tblLayout w:type="fixed"/>
+            </w:tblPr>
+            <w:tblGrid>
+              <w:gridCol w:w="2721"/>
+              <w:gridCol w:w="2494"/>
+            </w:tblGrid>
+            <w:tr>
+              <w:tc>
+                <w:tcPr>
+                  <w:tcW w:type="dxa" w:w="2721"/>
+                </w:tcPr>
+                <w:p>
+                  <w:pPr>
+                    <w:spacing w:after="0" w:before="0"/>
+                  </w:pPr>
+                  <w:r>
+                    <w:rPr>
+                      <w:rFonts w:ascii="한컴 말랑말랑 Bold" w:hAnsi="한컴 말랑말랑 Bold" w:eastAsia="한컴 말랑말랑 Bold" w:cs="한컴 말랑말랑 Bold"/>
+                      <w:b/>
+                      <w:color w:val="B03A6E"/>
+                      <w:sz w:val="26"/>
+                    </w:rPr>
+                    <w:t>👥 친구 NPC 검토 카드</w:t>
+                  </w:r>
+                </w:p>
+              </w:tc>
+              <w:tc>
+                <w:tcPr>
+                  <w:tcW w:type="dxa" w:w="2494"/>
+                </w:tcPr>
+                <w:p>
+                  <w:pPr>
+                    <w:spacing w:after="0" w:before="0"/>
+                    <w:jc w:val="right"/>
+                  </w:pPr>
+                  <w:r>
+                    <w:rPr>
+                      <w:rFonts w:ascii="한컴 말랑말랑 Regular" w:hAnsi="한컴 말랑말랑 Regular" w:eastAsia="한컴 말랑말랑 Regular" w:cs="한컴 말랑말랑 Regular"/>
+                      <w:b w:val="0"/>
+                      <w:color w:val="1F3A5F"/>
+                      <w:sz w:val="19"/>
+                    </w:rPr>
+                    <w:t>모둠 ____  별칭 ________</w:t>
+                  </w:r>
+                </w:p>
+              </w:tc>
+            </w:tr>
+          </w:tbl>
+          <w:p>
+            <w:pPr>
+              <w:spacing w:after="0" w:before="0" w:line="100" w:lineRule="exact"/>
+            </w:pPr>
+            <w:r>
+              <w:rPr>
+                <w:rFonts w:ascii="한컴 말랑말랑 Regular" w:hAnsi="한컴 말랑말랑 Regular" w:eastAsia="한컴 말랑말랑 Regular" w:cs="한컴 말랑말랑 Regular"/>
+                <w:b w:val="0"/>
+                <w:sz w:val="4"/>
+              </w:rPr>
+              <w:t xml:space="preserve"> </w:t>
+            </w:r>
+          </w:p>
+          <w:tbl>
+            <w:tblPr>
+              <w:tblW w:type="auto" w:w="0"/>
+              <w:jc w:val="center"/>
+              <w:tblLook w:firstColumn="1" w:firstRow="1" w:lastColumn="0" w:lastRow="0" w:noHBand="0" w:noVBand="1" w:val="04A0"/>
+              <w:tblBorders>
+                <w:top w:val="single" w:sz="8" w:color="D94F8A"/>
+                <w:left w:val="single" w:sz="8" w:color="D94F8A"/>
+                <w:bottom w:val="single" w:sz="8" w:color="D94F8A"/>
+                <w:right w:val="single" w:sz="8" w:color="D94F8A"/>
+                <w:insideH w:val="single" w:sz="8" w:color="D94F8A"/>
+                <w:insideV w:val="single" w:sz="8" w:color="D94F8A"/>
+              </w:tblBorders>
+              <w:tblLayout w:type="fixed"/>
+              <w:tblCellMar>
+                <w:top w:w="30" w:type="dxa"/>
+                <w:left w:w="80" w:type="dxa"/>
+                <w:bottom w:w="30" w:type="dxa"/>
+                <w:right w:w="80" w:type="dxa"/>
+              </w:tblCellMar>
+              <w:tblLayout w:type="fixed"/>
+            </w:tblPr>
+            <w:tblGrid>
+              <w:gridCol w:w="1644"/>
+              <w:gridCol w:w="3572"/>
+            </w:tblGrid>
+            <w:tr>
+              <w:trPr>
+                <w:trHeight w:val="351" w:hRule="exact"/>
+              </w:trPr>
+              <w:tc>
+                <w:tcPr>
+                  <w:tcW w:type="dxa" w:w="5216"/>
+                  <w:gridSpan w:val="2"/>
+                  <w:shd w:val="clear" w:color="auto" w:fill="D94F8A"/>
+                </w:tcPr>
+                <w:p>
+                  <w:pPr>
+                    <w:spacing w:after="0" w:before="0"/>
+                  </w:pPr>
+                  <w:r>
+                    <w:rPr>
+                      <w:rFonts w:ascii="한컴 말랑말랑 Bold" w:hAnsi="한컴 말랑말랑 Bold" w:eastAsia="한컴 말랑말랑 Bold" w:cs="한컴 말랑말랑 Bold"/>
+                      <w:b/>
+                      <w:color w:val="FFFFFF"/>
+                      <w:sz w:val="21"/>
+                    </w:rPr>
+                    <w:t>1  우리 모둠 NPC</w:t>
+                  </w:r>
+                  <w:r>
+                    <w:rPr>
+                      <w:rFonts w:ascii="한컴 말랑말랑 Regular" w:hAnsi="한컴 말랑말랑 Regular" w:eastAsia="한컴 말랑말랑 Regular" w:cs="한컴 말랑말랑 Regular"/>
+                      <w:b w:val="0"/>
+                      <w:color w:val="FFE3EF"/>
+                      <w:sz w:val="16"/>
+                    </w:rPr>
+                    <w:t xml:space="preserve">   대화하기 전에 써요</w:t>
+                  </w:r>
+                </w:p>
+              </w:tc>
+            </w:tr>
+            <w:tr>
+              <w:trPr>
+                <w:trHeight w:val="425" w:hRule="atLeast"/>
+              </w:trPr>
+              <w:tc>
+                <w:tcPr>
+                  <w:tcW w:type="dxa" w:w="1644"/>
+                  <w:shd w:val="clear" w:color="auto" w:fill="FFF0F6"/>
+                  <w:vAlign w:val="center"/>
+                </w:tcPr>
+                <w:p>
+                  <w:pPr>
+                    <w:spacing w:after="0" w:before="0" w:line="276" w:lineRule="auto"/>
+                  </w:pPr>
+                  <w:r>
+                    <w:rPr>
+                      <w:rFonts w:ascii="한컴 말랑말랑 Bold" w:hAnsi="한컴 말랑말랑 Bold" w:eastAsia="한컴 말랑말랑 Bold" w:cs="한컴 말랑말랑 Bold"/>
+                      <w:b/>
+                      <w:color w:val="B03A6E"/>
+                      <w:sz w:val="18"/>
+                    </w:rPr>
+                    <w:t>NPC 이름</w:t>
+                  </w:r>
+                </w:p>
+              </w:tc>
+              <w:tc>
+                <w:tcPr>
+                  <w:tcW w:type="dxa" w:w="3572"/>
+                  <w:vAlign w:val="top"/>
+                </w:tcPr>
+                <w:p/>
+              </w:tc>
+            </w:tr>
+            <w:tr>
+              <w:trPr>
+                <w:trHeight w:val="708" w:hRule="atLeast"/>
+              </w:trPr>
+              <w:tc>
+                <w:tcPr>
+                  <w:tcW w:type="dxa" w:w="1644"/>
+                  <w:shd w:val="clear" w:color="auto" w:fill="FFF0F6"/>
+                  <w:vAlign w:val="center"/>
+                </w:tcPr>
+                <w:p>
+                  <w:pPr>
+                    <w:spacing w:after="0" w:before="0" w:line="276" w:lineRule="auto"/>
+                  </w:pPr>
+                  <w:r>
+                    <w:rPr>
+                      <w:rFonts w:ascii="한컴 말랑말랑 Bold" w:hAnsi="한컴 말랑말랑 Bold" w:eastAsia="한컴 말랑말랑 Bold" w:cs="한컴 말랑말랑 Bold"/>
+                      <w:b/>
+                      <w:color w:val="B03A6E"/>
+                      <w:sz w:val="18"/>
+                    </w:rPr>
+                    <w:t>우리가 담으려던</w:t>
+                    <w:br/>
+                    <w:t>이 친구의 마음</w:t>
+                    <w:br/>
+                    <w:t>(낱말 하나)</w:t>
+                  </w:r>
+                </w:p>
+              </w:tc>
+              <w:tc>
+                <w:tcPr>
+                  <w:tcW w:type="dxa" w:w="3572"/>
+                  <w:vAlign w:val="top"/>
+                </w:tcPr>
+                <w:p/>
+              </w:tc>
+            </w:tr>
+          </w:tbl>
+          <w:p>
+            <w:pPr>
+              <w:spacing w:after="0" w:before="0" w:line="140" w:lineRule="exact"/>
+            </w:pPr>
+            <w:r>
+              <w:rPr>
+                <w:rFonts w:ascii="한컴 말랑말랑 Regular" w:hAnsi="한컴 말랑말랑 Regular" w:eastAsia="한컴 말랑말랑 Regular" w:cs="한컴 말랑말랑 Regular"/>
+                <w:b w:val="0"/>
+                <w:sz w:val="4"/>
+              </w:rPr>
+              <w:t xml:space="preserve"> </w:t>
+            </w:r>
+          </w:p>
+          <w:tbl>
+            <w:tblPr>
+              <w:tblW w:type="auto" w:w="0"/>
+              <w:jc w:val="center"/>
+              <w:tblLook w:firstColumn="1" w:firstRow="1" w:lastColumn="0" w:lastRow="0" w:noHBand="0" w:noVBand="1" w:val="04A0"/>
+              <w:tblBorders>
+                <w:top w:val="single" w:sz="8" w:color="D94F8A"/>
+                <w:left w:val="single" w:sz="8" w:color="D94F8A"/>
+                <w:bottom w:val="single" w:sz="8" w:color="D94F8A"/>
+                <w:right w:val="single" w:sz="8" w:color="D94F8A"/>
+                <w:insideH w:val="single" w:sz="8" w:color="D94F8A"/>
+                <w:insideV w:val="single" w:sz="8" w:color="D94F8A"/>
+              </w:tblBorders>
+              <w:tblLayout w:type="fixed"/>
+              <w:tblCellMar>
+                <w:top w:w="30" w:type="dxa"/>
+                <w:left w:w="80" w:type="dxa"/>
+                <w:bottom w:w="30" w:type="dxa"/>
+                <w:right w:w="80" w:type="dxa"/>
+              </w:tblCellMar>
+              <w:tblLayout w:type="fixed"/>
+            </w:tblPr>
+            <w:tblGrid>
+              <w:gridCol w:w="1644"/>
+              <w:gridCol w:w="3572"/>
+            </w:tblGrid>
+            <w:tr>
+              <w:trPr>
+                <w:trHeight w:val="351" w:hRule="exact"/>
+              </w:trPr>
+              <w:tc>
+                <w:tcPr>
+                  <w:tcW w:type="dxa" w:w="5216"/>
+                  <w:gridSpan w:val="2"/>
+                  <w:shd w:val="clear" w:color="auto" w:fill="D94F8A"/>
+                </w:tcPr>
+                <w:p>
+                  <w:pPr>
+                    <w:spacing w:after="0" w:before="0"/>
+                  </w:pPr>
+                  <w:r>
+                    <w:rPr>
+                      <w:rFonts w:ascii="한컴 말랑말랑 Bold" w:hAnsi="한컴 말랑말랑 Bold" w:eastAsia="한컴 말랑말랑 Bold" w:cs="한컴 말랑말랑 Bold"/>
+                      <w:b/>
+                      <w:color w:val="FFFFFF"/>
+                      <w:sz w:val="21"/>
+                    </w:rPr>
+                    <w:t>2  만난 친구 NPC</w:t>
+                  </w:r>
+                  <w:r>
+                    <w:rPr>
+                      <w:rFonts w:ascii="한컴 말랑말랑 Regular" w:hAnsi="한컴 말랑말랑 Regular" w:eastAsia="한컴 말랑말랑 Regular" w:cs="한컴 말랑말랑 Regular"/>
+                      <w:b w:val="0"/>
+                      <w:color w:val="FFE3EF"/>
+                      <w:sz w:val="16"/>
+                    </w:rPr>
+                    <w:t xml:space="preserve">   다른 모둠 NPC와 대화한 뒤에 써요</w:t>
+                  </w:r>
+                </w:p>
+              </w:tc>
+            </w:tr>
+            <w:tr>
+              <w:trPr>
+                <w:trHeight w:val="538" w:hRule="atLeast"/>
+              </w:trPr>
+              <w:tc>
+                <w:tcPr>
+                  <w:tcW w:type="dxa" w:w="1644"/>
+                  <w:shd w:val="clear" w:color="auto" w:fill="FFF0F6"/>
+                  <w:vAlign w:val="center"/>
+                </w:tcPr>
+                <w:p>
+                  <w:pPr>
+                    <w:spacing w:after="0" w:before="0" w:line="276" w:lineRule="auto"/>
+                  </w:pPr>
+                  <w:r>
+                    <w:rPr>
+                      <w:rFonts w:ascii="한컴 말랑말랑 Bold" w:hAnsi="한컴 말랑말랑 Bold" w:eastAsia="한컴 말랑말랑 Bold" w:cs="한컴 말랑말랑 Bold"/>
+                      <w:b/>
+                      <w:color w:val="B03A6E"/>
+                      <w:sz w:val="18"/>
+                    </w:rPr>
+                    <w:t>NPC 이름</w:t>
+                    <w:br/>
+                    <w:t>만든 모둠</w:t>
+                  </w:r>
+                </w:p>
+              </w:tc>
+              <w:tc>
+                <w:tcPr>
+                  <w:tcW w:type="dxa" w:w="3572"/>
+                  <w:vAlign w:val="top"/>
+                </w:tcPr>
+                <w:p>
+                  <w:pPr>
+                    <w:spacing w:after="0" w:before="0"/>
+                  </w:pPr>
+                  <w:r>
+                    <w:rPr>
+                      <w:rFonts w:ascii="한컴 말랑말랑 Regular" w:hAnsi="한컴 말랑말랑 Regular" w:eastAsia="한컴 말랑말랑 Regular" w:cs="한컴 말랑말랑 Regular"/>
+                      <w:b w:val="0"/>
+                      <w:color w:val="666666"/>
+                      <w:sz w:val="17"/>
+                    </w:rPr>
+                    <w:t>이름:</w:t>
+                  </w:r>
+                  <w:r>
+                    <w:rPr>
+                      <w:rFonts w:ascii="한컴 말랑말랑 Regular" w:hAnsi="한컴 말랑말랑 Regular" w:eastAsia="한컴 말랑말랑 Regular" w:cs="한컴 말랑말랑 Regular"/>
+                      <w:b w:val="0"/>
+                      <w:color w:val="666666"/>
+                      <w:sz w:val="17"/>
+                    </w:rPr>
+                    <w:t xml:space="preserve">                          </w:t>
+                  </w:r>
+                  <w:r>
+                    <w:rPr>
+                      <w:rFonts w:ascii="한컴 말랑말랑 Regular" w:hAnsi="한컴 말랑말랑 Regular" w:eastAsia="한컴 말랑말랑 Regular" w:cs="한컴 말랑말랑 Regular"/>
+                      <w:b w:val="0"/>
+                      <w:color w:val="666666"/>
+                      <w:sz w:val="17"/>
+                    </w:rPr>
+                    <w:t>만든 모둠: ____모둠</w:t>
+                  </w:r>
+                </w:p>
+              </w:tc>
+            </w:tr>
+            <w:tr>
+              <w:trPr>
+                <w:trHeight w:val="595" w:hRule="atLeast"/>
+              </w:trPr>
+              <w:tc>
+                <w:tcPr>
+                  <w:tcW w:type="dxa" w:w="1644"/>
+                  <w:shd w:val="clear" w:color="auto" w:fill="FFF0F6"/>
+                  <w:vAlign w:val="center"/>
+                </w:tcPr>
+                <w:p>
+                  <w:pPr>
+                    <w:spacing w:after="0" w:before="0" w:line="276" w:lineRule="auto"/>
+                  </w:pPr>
+                  <w:r>
+                    <w:rPr>
+                      <w:rFonts w:ascii="한컴 말랑말랑 Bold" w:hAnsi="한컴 말랑말랑 Bold" w:eastAsia="한컴 말랑말랑 Bold" w:cs="한컴 말랑말랑 Bold"/>
+                      <w:b/>
+                      <w:color w:val="B03A6E"/>
+                      <w:sz w:val="18"/>
+                    </w:rPr>
+                    <w:t>이 친구의</w:t>
+                    <w:br/>
+                    <w:t>마음은?</w:t>
+                  </w:r>
+                </w:p>
+              </w:tc>
+              <w:tc>
+                <w:tcPr>
+                  <w:tcW w:type="dxa" w:w="3572"/>
+                  <w:vAlign w:val="top"/>
+                </w:tcPr>
+                <w:p/>
+              </w:tc>
+            </w:tr>
+            <w:tr>
+              <w:trPr>
+                <w:trHeight w:val="822" w:hRule="atLeast"/>
+              </w:trPr>
+              <w:tc>
+                <w:tcPr>
+                  <w:tcW w:type="dxa" w:w="1644"/>
+                  <w:shd w:val="clear" w:color="auto" w:fill="FFF0F6"/>
+                  <w:vAlign w:val="center"/>
+                </w:tcPr>
+                <w:p>
+                  <w:pPr>
+                    <w:spacing w:after="0" w:before="0" w:line="276" w:lineRule="auto"/>
+                  </w:pPr>
+                  <w:r>
+                    <w:rPr>
+                      <w:rFonts w:ascii="한컴 말랑말랑 Bold" w:hAnsi="한컴 말랑말랑 Bold" w:eastAsia="한컴 말랑말랑 Bold" w:cs="한컴 말랑말랑 Bold"/>
+                      <w:b/>
+                      <w:color w:val="B03A6E"/>
+                      <w:sz w:val="18"/>
+                    </w:rPr>
+                    <w:t>가장 바라는</w:t>
+                    <w:br/>
+                    <w:t>것은?</w:t>
+                  </w:r>
+                </w:p>
+              </w:tc>
+              <w:tc>
+                <w:tcPr>
+                  <w:tcW w:type="dxa" w:w="3572"/>
+                  <w:vAlign w:val="top"/>
+                </w:tcPr>
+                <w:p/>
+              </w:tc>
+            </w:tr>
+            <w:tr>
+              <w:trPr>
+                <w:trHeight w:val="708" w:hRule="atLeast"/>
+              </w:trPr>
+              <w:tc>
+                <w:tcPr>
+                  <w:tcW w:type="dxa" w:w="1644"/>
+                  <w:shd w:val="clear" w:color="auto" w:fill="FFF0F6"/>
+                  <w:vAlign w:val="center"/>
+                </w:tcPr>
+                <w:p>
+                  <w:pPr>
+                    <w:spacing w:after="0" w:before="0" w:line="276" w:lineRule="auto"/>
+                  </w:pPr>
+                  <w:r>
+                    <w:rPr>
+                      <w:rFonts w:ascii="한컴 말랑말랑 Bold" w:hAnsi="한컴 말랑말랑 Bold" w:eastAsia="한컴 말랑말랑 Bold" w:cs="한컴 말랑말랑 Bold"/>
+                      <w:b/>
+                      <w:color w:val="B03A6E"/>
+                      <w:sz w:val="18"/>
+                    </w:rPr>
+                    <w:t>내가 고른</w:t>
+                    <w:br/>
+                    <w:t>방법과</w:t>
+                    <w:br/>
+                    <w:t>함께할 사람</w:t>
+                  </w:r>
+                </w:p>
+              </w:tc>
+              <w:tc>
+                <w:tcPr>
+                  <w:tcW w:type="dxa" w:w="3572"/>
+                  <w:vAlign w:val="top"/>
+                </w:tcPr>
+                <w:p>
+                  <w:pPr>
+                    <w:spacing w:after="0" w:before="0"/>
+                  </w:pPr>
+                  <w:r>
+                    <w:rPr>
+                      <w:rFonts w:ascii="한컴 말랑말랑 Bold" w:hAnsi="한컴 말랑말랑 Bold" w:eastAsia="한컴 말랑말랑 Bold" w:cs="한컴 말랑말랑 Bold"/>
+                      <w:b/>
+                      <w:color w:val="1F3A5F"/>
+                      <w:sz w:val="19"/>
+                    </w:rPr>
+                    <w:t>A · B · C  중  (      )</w:t>
+                  </w:r>
+                  <w:r>
+                    <w:rPr>
+                      <w:rFonts w:ascii="한컴 말랑말랑 Regular" w:hAnsi="한컴 말랑말랑 Regular" w:eastAsia="한컴 말랑말랑 Regular" w:cs="한컴 말랑말랑 Regular"/>
+                      <w:b w:val="0"/>
+                      <w:color w:val="666666"/>
+                      <w:sz w:val="18"/>
+                    </w:rPr>
+                    <w:t xml:space="preserve">   함께할 사람:</w:t>
+                  </w:r>
+                </w:p>
+              </w:tc>
+            </w:tr>
+          </w:tbl>
+          <w:p>
+            <w:pPr>
+              <w:spacing w:after="0" w:before="0" w:line="120" w:lineRule="exact"/>
+            </w:pPr>
+            <w:r>
+              <w:rPr>
+                <w:rFonts w:ascii="한컴 말랑말랑 Regular" w:hAnsi="한컴 말랑말랑 Regular" w:eastAsia="한컴 말랑말랑 Regular" w:cs="한컴 말랑말랑 Regular"/>
+                <w:b w:val="0"/>
+                <w:sz w:val="4"/>
+              </w:rPr>
+              <w:t xml:space="preserve"> </w:t>
+            </w:r>
+          </w:p>
+          <w:tbl>
+            <w:tblPr>
+              <w:tblW w:type="auto" w:w="0"/>
+              <w:jc w:val="center"/>
+              <w:tblLook w:firstColumn="1" w:firstRow="1" w:lastColumn="0" w:lastRow="0" w:noHBand="0" w:noVBand="1" w:val="04A0"/>
+              <w:tblBorders>
+                <w:top w:val="single" w:sz="6" w:color="D94F8A"/>
+                <w:left w:val="single" w:sz="6" w:color="D94F8A"/>
+                <w:bottom w:val="single" w:sz="6" w:color="D94F8A"/>
+                <w:right w:val="single" w:sz="6" w:color="D94F8A"/>
+                <w:insideH w:val="single" w:sz="6" w:color="D94F8A"/>
+                <w:insideV w:val="single" w:sz="6" w:color="D94F8A"/>
+              </w:tblBorders>
+              <w:tblLayout w:type="fixed"/>
+              <w:tblCellMar>
+                <w:top w:w="30" w:type="dxa"/>
+                <w:left w:w="80" w:type="dxa"/>
+                <w:bottom w:w="30" w:type="dxa"/>
+                <w:right w:w="80" w:type="dxa"/>
+              </w:tblCellMar>
+              <w:tblLayout w:type="fixed"/>
+            </w:tblPr>
+            <w:tblGrid>
+              <w:gridCol w:w="5216"/>
+            </w:tblGrid>
+            <w:tr>
+              <w:tc>
+                <w:tcPr>
+                  <w:tcW w:type="dxa" w:w="5216"/>
+                  <w:shd w:val="clear" w:color="auto" w:fill="FFF0F6"/>
+                </w:tcPr>
+                <w:p>
+                  <w:pPr>
+                    <w:spacing w:after="0" w:before="0"/>
+                    <w:jc w:val="center"/>
+                  </w:pPr>
+                  <w:r>
+                    <w:rPr>
+                      <w:rFonts w:ascii="한컴 말랑말랑 Bold" w:hAnsi="한컴 말랑말랑 Bold" w:eastAsia="한컴 말랑말랑 Bold" w:cs="한컴 말랑말랑 Bold"/>
+                      <w:b/>
+                      <w:color w:val="B03A6E"/>
+                      <w:sz w:val="17"/>
+                    </w:rPr>
+                    <w:t>✉️ 다 쓰면 만든 모둠에게 돌려줘요.  이름 대신 모둠·별칭만 써요.</w:t>
+                  </w:r>
+                </w:p>
+              </w:tc>
+            </w:tr>
+          </w:tbl>
+          <w:p>
+            <w:pPr>
+              <w:spacing w:after="0" w:line="20" w:lineRule="exact"/>
+            </w:pPr>
+          </w:p>
+        </w:tc>
+        <w:tc>
+          <w:tcPr>
+            <w:tcW w:type="dxa" w:w="5386"/>
+            <w:vAlign w:val="top"/>
+          </w:tcPr>
+          <w:p>
+            <w:pPr>
+              <w:spacing w:after="0" w:line="20" w:lineRule="exact"/>
+            </w:pPr>
+          </w:p>
+          <w:tbl>
+            <w:tblPr>
+              <w:tblW w:type="auto" w:w="0"/>
+              <w:jc w:val="center"/>
+              <w:tblLook w:firstColumn="1" w:firstRow="1" w:lastColumn="0" w:lastRow="0" w:noHBand="0" w:noVBand="1" w:val="04A0"/>
+              <w:tblBorders>
+                <w:top w:val="single" w:sz="2" w:color="FFFFFF"/>
+                <w:left w:val="single" w:sz="2" w:color="FFFFFF"/>
+                <w:bottom w:val="single" w:sz="2" w:color="FFFFFF"/>
+                <w:right w:val="single" w:sz="2" w:color="FFFFFF"/>
+                <w:insideH w:val="nil"/>
+                <w:insideV w:val="nil"/>
+              </w:tblBorders>
+              <w:tblLayout w:type="fixed"/>
+              <w:tblCellMar>
+                <w:top w:w="0" w:type="dxa"/>
+                <w:left w:w="0" w:type="dxa"/>
+                <w:bottom w:w="0" w:type="dxa"/>
+                <w:right w:w="0" w:type="dxa"/>
+              </w:tblCellMar>
+              <w:tblLayout w:type="fixed"/>
+            </w:tblPr>
+            <w:tblGrid>
+              <w:gridCol w:w="2721"/>
+              <w:gridCol w:w="2494"/>
+            </w:tblGrid>
+            <w:tr>
+              <w:tc>
+                <w:tcPr>
+                  <w:tcW w:type="dxa" w:w="2721"/>
+                </w:tcPr>
+                <w:p>
+                  <w:pPr>
+                    <w:spacing w:after="0" w:before="0"/>
+                  </w:pPr>
+                  <w:r>
+                    <w:rPr>
+                      <w:rFonts w:ascii="한컴 말랑말랑 Bold" w:hAnsi="한컴 말랑말랑 Bold" w:eastAsia="한컴 말랑말랑 Bold" w:cs="한컴 말랑말랑 Bold"/>
+                      <w:b/>
+                      <w:color w:val="B03A6E"/>
+                      <w:sz w:val="26"/>
+                    </w:rPr>
+                    <w:t>👥 친구 NPC 검토 카드</w:t>
+                  </w:r>
+                </w:p>
+              </w:tc>
+              <w:tc>
+                <w:tcPr>
+                  <w:tcW w:type="dxa" w:w="2494"/>
+                </w:tcPr>
+                <w:p>
+                  <w:pPr>
+                    <w:spacing w:after="0" w:before="0"/>
+                    <w:jc w:val="right"/>
+                  </w:pPr>
+                  <w:r>
+                    <w:rPr>
+                      <w:rFonts w:ascii="한컴 말랑말랑 Regular" w:hAnsi="한컴 말랑말랑 Regular" w:eastAsia="한컴 말랑말랑 Regular" w:cs="한컴 말랑말랑 Regular"/>
+                      <w:b w:val="0"/>
+                      <w:color w:val="1F3A5F"/>
+                      <w:sz w:val="19"/>
+                    </w:rPr>
+                    <w:t>모둠 ____  별칭 ________</w:t>
+                  </w:r>
+                </w:p>
+              </w:tc>
+            </w:tr>
+          </w:tbl>
+          <w:p>
+            <w:pPr>
+              <w:spacing w:after="0" w:before="0" w:line="100" w:lineRule="exact"/>
+            </w:pPr>
+            <w:r>
+              <w:rPr>
+                <w:rFonts w:ascii="한컴 말랑말랑 Regular" w:hAnsi="한컴 말랑말랑 Regular" w:eastAsia="한컴 말랑말랑 Regular" w:cs="한컴 말랑말랑 Regular"/>
+                <w:b w:val="0"/>
+                <w:sz w:val="4"/>
+              </w:rPr>
+              <w:t xml:space="preserve"> </w:t>
+            </w:r>
+          </w:p>
+          <w:tbl>
+            <w:tblPr>
+              <w:tblW w:type="auto" w:w="0"/>
+              <w:jc w:val="center"/>
+              <w:tblLook w:firstColumn="1" w:firstRow="1" w:lastColumn="0" w:lastRow="0" w:noHBand="0" w:noVBand="1" w:val="04A0"/>
+              <w:tblBorders>
+                <w:top w:val="single" w:sz="8" w:color="D94F8A"/>
+                <w:left w:val="single" w:sz="8" w:color="D94F8A"/>
+                <w:bottom w:val="single" w:sz="8" w:color="D94F8A"/>
+                <w:right w:val="single" w:sz="8" w:color="D94F8A"/>
+                <w:insideH w:val="single" w:sz="8" w:color="D94F8A"/>
+                <w:insideV w:val="single" w:sz="8" w:color="D94F8A"/>
+              </w:tblBorders>
+              <w:tblLayout w:type="fixed"/>
+              <w:tblCellMar>
+                <w:top w:w="30" w:type="dxa"/>
+                <w:left w:w="80" w:type="dxa"/>
+                <w:bottom w:w="30" w:type="dxa"/>
+                <w:right w:w="80" w:type="dxa"/>
+              </w:tblCellMar>
+              <w:tblLayout w:type="fixed"/>
+            </w:tblPr>
+            <w:tblGrid>
+              <w:gridCol w:w="1644"/>
+              <w:gridCol w:w="3572"/>
+            </w:tblGrid>
+            <w:tr>
+              <w:trPr>
+                <w:trHeight w:val="351" w:hRule="exact"/>
+              </w:trPr>
+              <w:tc>
+                <w:tcPr>
+                  <w:tcW w:type="dxa" w:w="5216"/>
+                  <w:gridSpan w:val="2"/>
+                  <w:shd w:val="clear" w:color="auto" w:fill="D94F8A"/>
+                </w:tcPr>
+                <w:p>
+                  <w:pPr>
+                    <w:spacing w:after="0" w:before="0"/>
+                  </w:pPr>
+                  <w:r>
+                    <w:rPr>
+                      <w:rFonts w:ascii="한컴 말랑말랑 Bold" w:hAnsi="한컴 말랑말랑 Bold" w:eastAsia="한컴 말랑말랑 Bold" w:cs="한컴 말랑말랑 Bold"/>
+                      <w:b/>
+                      <w:color w:val="FFFFFF"/>
+                      <w:sz w:val="21"/>
+                    </w:rPr>
+                    <w:t>1  우리 모둠 NPC</w:t>
+                  </w:r>
+                  <w:r>
+                    <w:rPr>
+                      <w:rFonts w:ascii="한컴 말랑말랑 Regular" w:hAnsi="한컴 말랑말랑 Regular" w:eastAsia="한컴 말랑말랑 Regular" w:cs="한컴 말랑말랑 Regular"/>
+                      <w:b w:val="0"/>
+                      <w:color w:val="FFE3EF"/>
+                      <w:sz w:val="16"/>
+                    </w:rPr>
+                    <w:t xml:space="preserve">   대화하기 전에 써요</w:t>
+                  </w:r>
+                </w:p>
+              </w:tc>
+            </w:tr>
+            <w:tr>
+              <w:trPr>
+                <w:trHeight w:val="425" w:hRule="atLeast"/>
+              </w:trPr>
+              <w:tc>
+                <w:tcPr>
+                  <w:tcW w:type="dxa" w:w="1644"/>
+                  <w:shd w:val="clear" w:color="auto" w:fill="FFF0F6"/>
+                  <w:vAlign w:val="center"/>
+                </w:tcPr>
+                <w:p>
+                  <w:pPr>
+                    <w:spacing w:after="0" w:before="0" w:line="276" w:lineRule="auto"/>
+                  </w:pPr>
+                  <w:r>
+                    <w:rPr>
+                      <w:rFonts w:ascii="한컴 말랑말랑 Bold" w:hAnsi="한컴 말랑말랑 Bold" w:eastAsia="한컴 말랑말랑 Bold" w:cs="한컴 말랑말랑 Bold"/>
+                      <w:b/>
+                      <w:color w:val="B03A6E"/>
+                      <w:sz w:val="18"/>
+                    </w:rPr>
+                    <w:t>NPC 이름</w:t>
+                  </w:r>
+                </w:p>
+              </w:tc>
+              <w:tc>
+                <w:tcPr>
+                  <w:tcW w:type="dxa" w:w="3572"/>
+                  <w:vAlign w:val="top"/>
+                </w:tcPr>
+                <w:p/>
+              </w:tc>
+            </w:tr>
+            <w:tr>
+              <w:trPr>
+                <w:trHeight w:val="708" w:hRule="atLeast"/>
+              </w:trPr>
+              <w:tc>
+                <w:tcPr>
+                  <w:tcW w:type="dxa" w:w="1644"/>
+                  <w:shd w:val="clear" w:color="auto" w:fill="FFF0F6"/>
+                  <w:vAlign w:val="center"/>
+                </w:tcPr>
+                <w:p>
+                  <w:pPr>
+                    <w:spacing w:after="0" w:before="0" w:line="276" w:lineRule="auto"/>
+                  </w:pPr>
+                  <w:r>
+                    <w:rPr>
+                      <w:rFonts w:ascii="한컴 말랑말랑 Bold" w:hAnsi="한컴 말랑말랑 Bold" w:eastAsia="한컴 말랑말랑 Bold" w:cs="한컴 말랑말랑 Bold"/>
+                      <w:b/>
+                      <w:color w:val="B03A6E"/>
+                      <w:sz w:val="18"/>
+                    </w:rPr>
+                    <w:t>우리가 담으려던</w:t>
+                    <w:br/>
+                    <w:t>이 친구의 마음</w:t>
+                    <w:br/>
+                    <w:t>(낱말 하나)</w:t>
+                  </w:r>
+                </w:p>
+              </w:tc>
+              <w:tc>
+                <w:tcPr>
+                  <w:tcW w:type="dxa" w:w="3572"/>
+                  <w:vAlign w:val="top"/>
+                </w:tcPr>
+                <w:p/>
+              </w:tc>
+            </w:tr>
+          </w:tbl>
+          <w:p>
+            <w:pPr>
+              <w:spacing w:after="0" w:before="0" w:line="140" w:lineRule="exact"/>
+            </w:pPr>
+            <w:r>
+              <w:rPr>
+                <w:rFonts w:ascii="한컴 말랑말랑 Regular" w:hAnsi="한컴 말랑말랑 Regular" w:eastAsia="한컴 말랑말랑 Regular" w:cs="한컴 말랑말랑 Regular"/>
+                <w:b w:val="0"/>
+                <w:sz w:val="4"/>
+              </w:rPr>
+              <w:t xml:space="preserve"> </w:t>
+            </w:r>
+          </w:p>
+          <w:tbl>
+            <w:tblPr>
+              <w:tblW w:type="auto" w:w="0"/>
+              <w:jc w:val="center"/>
+              <w:tblLook w:firstColumn="1" w:firstRow="1" w:lastColumn="0" w:lastRow="0" w:noHBand="0" w:noVBand="1" w:val="04A0"/>
+              <w:tblBorders>
+                <w:top w:val="single" w:sz="8" w:color="D94F8A"/>
+                <w:left w:val="single" w:sz="8" w:color="D94F8A"/>
+                <w:bottom w:val="single" w:sz="8" w:color="D94F8A"/>
+                <w:right w:val="single" w:sz="8" w:color="D94F8A"/>
+                <w:insideH w:val="single" w:sz="8" w:color="D94F8A"/>
+                <w:insideV w:val="single" w:sz="8" w:color="D94F8A"/>
+              </w:tblBorders>
+              <w:tblLayout w:type="fixed"/>
+              <w:tblCellMar>
+                <w:top w:w="30" w:type="dxa"/>
+                <w:left w:w="80" w:type="dxa"/>
+                <w:bottom w:w="30" w:type="dxa"/>
+                <w:right w:w="80" w:type="dxa"/>
+              </w:tblCellMar>
+              <w:tblLayout w:type="fixed"/>
+            </w:tblPr>
+            <w:tblGrid>
+              <w:gridCol w:w="1644"/>
+              <w:gridCol w:w="3572"/>
+            </w:tblGrid>
+            <w:tr>
+              <w:trPr>
+                <w:trHeight w:val="351" w:hRule="exact"/>
+              </w:trPr>
+              <w:tc>
+                <w:tcPr>
+                  <w:tcW w:type="dxa" w:w="5216"/>
+                  <w:gridSpan w:val="2"/>
+                  <w:shd w:val="clear" w:color="auto" w:fill="D94F8A"/>
+                </w:tcPr>
+                <w:p>
+                  <w:pPr>
+                    <w:spacing w:after="0" w:before="0"/>
+                  </w:pPr>
+                  <w:r>
+                    <w:rPr>
+                      <w:rFonts w:ascii="한컴 말랑말랑 Bold" w:hAnsi="한컴 말랑말랑 Bold" w:eastAsia="한컴 말랑말랑 Bold" w:cs="한컴 말랑말랑 Bold"/>
+                      <w:b/>
+                      <w:color w:val="FFFFFF"/>
+                      <w:sz w:val="21"/>
+                    </w:rPr>
+                    <w:t>2  만난 친구 NPC</w:t>
+                  </w:r>
+                  <w:r>
+                    <w:rPr>
+                      <w:rFonts w:ascii="한컴 말랑말랑 Regular" w:hAnsi="한컴 말랑말랑 Regular" w:eastAsia="한컴 말랑말랑 Regular" w:cs="한컴 말랑말랑 Regular"/>
+                      <w:b w:val="0"/>
+                      <w:color w:val="FFE3EF"/>
+                      <w:sz w:val="16"/>
+                    </w:rPr>
+                    <w:t xml:space="preserve">   다른 모둠 NPC와 대화한 뒤에 써요</w:t>
+                  </w:r>
+                </w:p>
+              </w:tc>
+            </w:tr>
+            <w:tr>
+              <w:trPr>
+                <w:trHeight w:val="538" w:hRule="atLeast"/>
+              </w:trPr>
+              <w:tc>
+                <w:tcPr>
+                  <w:tcW w:type="dxa" w:w="1644"/>
+                  <w:shd w:val="clear" w:color="auto" w:fill="FFF0F6"/>
+                  <w:vAlign w:val="center"/>
+                </w:tcPr>
+                <w:p>
+                  <w:pPr>
+                    <w:spacing w:after="0" w:before="0" w:line="276" w:lineRule="auto"/>
+                  </w:pPr>
+                  <w:r>
+                    <w:rPr>
+                      <w:rFonts w:ascii="한컴 말랑말랑 Bold" w:hAnsi="한컴 말랑말랑 Bold" w:eastAsia="한컴 말랑말랑 Bold" w:cs="한컴 말랑말랑 Bold"/>
+                      <w:b/>
+                      <w:color w:val="B03A6E"/>
+                      <w:sz w:val="18"/>
+                    </w:rPr>
+                    <w:t>NPC 이름</w:t>
+                    <w:br/>
+                    <w:t>만든 모둠</w:t>
+                  </w:r>
+                </w:p>
+              </w:tc>
+              <w:tc>
+                <w:tcPr>
+                  <w:tcW w:type="dxa" w:w="3572"/>
+                  <w:vAlign w:val="top"/>
+                </w:tcPr>
+                <w:p>
+                  <w:pPr>
+                    <w:spacing w:after="0" w:before="0"/>
+                  </w:pPr>
+                  <w:r>
+                    <w:rPr>
+                      <w:rFonts w:ascii="한컴 말랑말랑 Regular" w:hAnsi="한컴 말랑말랑 Regular" w:eastAsia="한컴 말랑말랑 Regular" w:cs="한컴 말랑말랑 Regular"/>
+                      <w:b w:val="0"/>
+                      <w:color w:val="666666"/>
+                      <w:sz w:val="17"/>
+                    </w:rPr>
+                    <w:t>이름:</w:t>
+                  </w:r>
+                  <w:r>
+                    <w:rPr>
+                      <w:rFonts w:ascii="한컴 말랑말랑 Regular" w:hAnsi="한컴 말랑말랑 Regular" w:eastAsia="한컴 말랑말랑 Regular" w:cs="한컴 말랑말랑 Regular"/>
+                      <w:b w:val="0"/>
+                      <w:color w:val="666666"/>
+                      <w:sz w:val="17"/>
+                    </w:rPr>
+                    <w:t xml:space="preserve">                          </w:t>
+                  </w:r>
+                  <w:r>
+                    <w:rPr>
+                      <w:rFonts w:ascii="한컴 말랑말랑 Regular" w:hAnsi="한컴 말랑말랑 Regular" w:eastAsia="한컴 말랑말랑 Regular" w:cs="한컴 말랑말랑 Regular"/>
+                      <w:b w:val="0"/>
+                      <w:color w:val="666666"/>
+                      <w:sz w:val="17"/>
+                    </w:rPr>
+                    <w:t>만든 모둠: ____모둠</w:t>
+                  </w:r>
+                </w:p>
+              </w:tc>
+            </w:tr>
+            <w:tr>
+              <w:trPr>
+                <w:trHeight w:val="595" w:hRule="atLeast"/>
+              </w:trPr>
+              <w:tc>
+                <w:tcPr>
+                  <w:tcW w:type="dxa" w:w="1644"/>
+                  <w:shd w:val="clear" w:color="auto" w:fill="FFF0F6"/>
+                  <w:vAlign w:val="center"/>
+                </w:tcPr>
+                <w:p>
+                  <w:pPr>
+                    <w:spacing w:after="0" w:before="0" w:line="276" w:lineRule="auto"/>
+                  </w:pPr>
+                  <w:r>
+                    <w:rPr>
+                      <w:rFonts w:ascii="한컴 말랑말랑 Bold" w:hAnsi="한컴 말랑말랑 Bold" w:eastAsia="한컴 말랑말랑 Bold" w:cs="한컴 말랑말랑 Bold"/>
+                      <w:b/>
+                      <w:color w:val="B03A6E"/>
+                      <w:sz w:val="18"/>
+                    </w:rPr>
+                    <w:t>이 친구의</w:t>
+                    <w:br/>
+                    <w:t>마음은?</w:t>
+                  </w:r>
+                </w:p>
+              </w:tc>
+              <w:tc>
+                <w:tcPr>
+                  <w:tcW w:type="dxa" w:w="3572"/>
+                  <w:vAlign w:val="top"/>
+                </w:tcPr>
+                <w:p/>
+              </w:tc>
+            </w:tr>
+            <w:tr>
+              <w:trPr>
+                <w:trHeight w:val="822" w:hRule="atLeast"/>
+              </w:trPr>
+              <w:tc>
+                <w:tcPr>
+                  <w:tcW w:type="dxa" w:w="1644"/>
+                  <w:shd w:val="clear" w:color="auto" w:fill="FFF0F6"/>
+                  <w:vAlign w:val="center"/>
+                </w:tcPr>
+                <w:p>
+                  <w:pPr>
+                    <w:spacing w:after="0" w:before="0" w:line="276" w:lineRule="auto"/>
+                  </w:pPr>
+                  <w:r>
+                    <w:rPr>
+                      <w:rFonts w:ascii="한컴 말랑말랑 Bold" w:hAnsi="한컴 말랑말랑 Bold" w:eastAsia="한컴 말랑말랑 Bold" w:cs="한컴 말랑말랑 Bold"/>
+                      <w:b/>
+                      <w:color w:val="B03A6E"/>
+                      <w:sz w:val="18"/>
+                    </w:rPr>
+                    <w:t>가장 바라는</w:t>
+                    <w:br/>
+                    <w:t>것은?</w:t>
+                  </w:r>
+                </w:p>
+              </w:tc>
+              <w:tc>
+                <w:tcPr>
+                  <w:tcW w:type="dxa" w:w="3572"/>
+                  <w:vAlign w:val="top"/>
+                </w:tcPr>
+                <w:p/>
+              </w:tc>
+            </w:tr>
+            <w:tr>
+              <w:trPr>
+                <w:trHeight w:val="708" w:hRule="atLeast"/>
+              </w:trPr>
+              <w:tc>
+                <w:tcPr>
+                  <w:tcW w:type="dxa" w:w="1644"/>
+                  <w:shd w:val="clear" w:color="auto" w:fill="FFF0F6"/>
+                  <w:vAlign w:val="center"/>
+                </w:tcPr>
+                <w:p>
+                  <w:pPr>
+                    <w:spacing w:after="0" w:before="0" w:line="276" w:lineRule="auto"/>
+                  </w:pPr>
+                  <w:r>
+                    <w:rPr>
+                      <w:rFonts w:ascii="한컴 말랑말랑 Bold" w:hAnsi="한컴 말랑말랑 Bold" w:eastAsia="한컴 말랑말랑 Bold" w:cs="한컴 말랑말랑 Bold"/>
+                      <w:b/>
+                      <w:color w:val="B03A6E"/>
+                      <w:sz w:val="18"/>
+                    </w:rPr>
+                    <w:t>내가 고른</w:t>
+                    <w:br/>
+                    <w:t>방법과</w:t>
+                    <w:br/>
+                    <w:t>함께할 사람</w:t>
+                  </w:r>
+                </w:p>
+              </w:tc>
+              <w:tc>
+                <w:tcPr>
+                  <w:tcW w:type="dxa" w:w="3572"/>
+                  <w:vAlign w:val="top"/>
+                </w:tcPr>
+                <w:p>
+                  <w:pPr>
+                    <w:spacing w:after="0" w:before="0"/>
+                  </w:pPr>
+                  <w:r>
+                    <w:rPr>
+                      <w:rFonts w:ascii="한컴 말랑말랑 Bold" w:hAnsi="한컴 말랑말랑 Bold" w:eastAsia="한컴 말랑말랑 Bold" w:cs="한컴 말랑말랑 Bold"/>
+                      <w:b/>
+                      <w:color w:val="1F3A5F"/>
+                      <w:sz w:val="19"/>
+                    </w:rPr>
+                    <w:t>A · B · C  중  (      )</w:t>
+                  </w:r>
+                  <w:r>
+                    <w:rPr>
+                      <w:rFonts w:ascii="한컴 말랑말랑 Regular" w:hAnsi="한컴 말랑말랑 Regular" w:eastAsia="한컴 말랑말랑 Regular" w:cs="한컴 말랑말랑 Regular"/>
+                      <w:b w:val="0"/>
+                      <w:color w:val="666666"/>
+                      <w:sz w:val="18"/>
+                    </w:rPr>
+                    <w:t xml:space="preserve">   함께할 사람:</w:t>
+                  </w:r>
+                </w:p>
+              </w:tc>
+            </w:tr>
+          </w:tbl>
+          <w:p>
+            <w:pPr>
+              <w:spacing w:after="0" w:before="0" w:line="120" w:lineRule="exact"/>
+            </w:pPr>
+            <w:r>
+              <w:rPr>
+                <w:rFonts w:ascii="한컴 말랑말랑 Regular" w:hAnsi="한컴 말랑말랑 Regular" w:eastAsia="한컴 말랑말랑 Regular" w:cs="한컴 말랑말랑 Regular"/>
+                <w:b w:val="0"/>
+                <w:sz w:val="4"/>
+              </w:rPr>
+              <w:t xml:space="preserve"> </w:t>
+            </w:r>
+          </w:p>
+          <w:tbl>
+            <w:tblPr>
+              <w:tblW w:type="auto" w:w="0"/>
+              <w:jc w:val="center"/>
+              <w:tblLook w:firstColumn="1" w:firstRow="1" w:lastColumn="0" w:lastRow="0" w:noHBand="0" w:noVBand="1" w:val="04A0"/>
+              <w:tblBorders>
+                <w:top w:val="single" w:sz="6" w:color="D94F8A"/>
+                <w:left w:val="single" w:sz="6" w:color="D94F8A"/>
+                <w:bottom w:val="single" w:sz="6" w:color="D94F8A"/>
+                <w:right w:val="single" w:sz="6" w:color="D94F8A"/>
+                <w:insideH w:val="single" w:sz="6" w:color="D94F8A"/>
+                <w:insideV w:val="single" w:sz="6" w:color="D94F8A"/>
+              </w:tblBorders>
+              <w:tblLayout w:type="fixed"/>
+              <w:tblCellMar>
+                <w:top w:w="30" w:type="dxa"/>
+                <w:left w:w="80" w:type="dxa"/>
+                <w:bottom w:w="30" w:type="dxa"/>
+                <w:right w:w="80" w:type="dxa"/>
+              </w:tblCellMar>
+              <w:tblLayout w:type="fixed"/>
+            </w:tblPr>
+            <w:tblGrid>
+              <w:gridCol w:w="5216"/>
+            </w:tblGrid>
+            <w:tr>
+              <w:tc>
+                <w:tcPr>
+                  <w:tcW w:type="dxa" w:w="5216"/>
+                  <w:shd w:val="clear" w:color="auto" w:fill="FFF0F6"/>
+                </w:tcPr>
+                <w:p>
+                  <w:pPr>
+                    <w:spacing w:after="0" w:before="0"/>
+                    <w:jc w:val="center"/>
+                  </w:pPr>
+                  <w:r>
+                    <w:rPr>
+                      <w:rFonts w:ascii="한컴 말랑말랑 Bold" w:hAnsi="한컴 말랑말랑 Bold" w:eastAsia="한컴 말랑말랑 Bold" w:cs="한컴 말랑말랑 Bold"/>
+                      <w:b/>
+                      <w:color w:val="B03A6E"/>
+                      <w:sz w:val="17"/>
+                    </w:rPr>
+                    <w:t>✉️ 다 쓰면 만든 모둠에게 돌려줘요.  이름 대신 모둠·별칭만 써요.</w:t>
+                  </w:r>
+                </w:p>
+              </w:tc>
+            </w:tr>
+          </w:tbl>
+          <w:p>
+            <w:pPr>
+              <w:spacing w:after="0" w:line="20" w:lineRule="exact"/>
+            </w:pPr>
+          </w:p>
         </w:tc>
       </w:tr>
     </w:tbl>
     <w:p>
       <w:pPr>
-        <w:spacing w:after="0" w:before="0" w:line="20" w:lineRule="exact"/>
+        <w:spacing w:after="0" w:line="20" w:lineRule="exact"/>
       </w:pPr>
       <w:r>
         <w:rPr>
@@ -1628,7 +2312,7 @@
     </w:p>
     <w:sectPr>
       <w:pgSz w:w="11906" w:h="16838"/>
-      <w:pgMar w:top="567" w:right="567" w:bottom="454" w:left="567" w:header="720" w:footer="720" w:gutter="0"/>
+      <w:pgMar w:top="510" w:right="567" w:bottom="397" w:left="567" w:header="720" w:footer="720" w:gutter="0"/>
       <w:cols w:space="720"/>
       <w:docGrid w:linePitch="360"/>
     </w:sectPr>

</xml_diff>

<commit_message>
Review card: remove the bottom strip, enlarge writing boxes
Co-Authored-By: Claude Fable 5.1 <noreply@anthropic.com>
</commit_message>
<xml_diff>
--- a/worksheets/친구NPC_검토카드.docx
+++ b/worksheets/친구NPC_검토카드.docx
@@ -411,7 +411,7 @@
             </w:tr>
             <w:tr>
               <w:trPr>
-                <w:trHeight w:val="595" w:hRule="atLeast"/>
+                <w:trHeight w:val="737" w:hRule="atLeast"/>
               </w:trPr>
               <w:tc>
                 <w:tcPr>
@@ -446,7 +446,7 @@
             </w:tr>
             <w:tr>
               <w:trPr>
-                <w:trHeight w:val="822" w:hRule="atLeast"/>
+                <w:trHeight w:val="963" w:hRule="atLeast"/>
               </w:trPr>
               <w:tc>
                 <w:tcPr>
@@ -534,68 +534,6 @@
                       <w:sz w:val="18"/>
                     </w:rPr>
                     <w:t xml:space="preserve">   함께할 사람:</w:t>
-                  </w:r>
-                </w:p>
-              </w:tc>
-            </w:tr>
-          </w:tbl>
-          <w:p>
-            <w:pPr>
-              <w:spacing w:after="0" w:before="0" w:line="120" w:lineRule="exact"/>
-            </w:pPr>
-            <w:r>
-              <w:rPr>
-                <w:rFonts w:ascii="한컴 말랑말랑 Regular" w:hAnsi="한컴 말랑말랑 Regular" w:eastAsia="한컴 말랑말랑 Regular" w:cs="한컴 말랑말랑 Regular"/>
-                <w:b w:val="0"/>
-                <w:sz w:val="4"/>
-              </w:rPr>
-              <w:t xml:space="preserve"> </w:t>
-            </w:r>
-          </w:p>
-          <w:tbl>
-            <w:tblPr>
-              <w:tblW w:type="auto" w:w="0"/>
-              <w:jc w:val="center"/>
-              <w:tblLook w:firstColumn="1" w:firstRow="1" w:lastColumn="0" w:lastRow="0" w:noHBand="0" w:noVBand="1" w:val="04A0"/>
-              <w:tblBorders>
-                <w:top w:val="single" w:sz="6" w:color="D94F8A"/>
-                <w:left w:val="single" w:sz="6" w:color="D94F8A"/>
-                <w:bottom w:val="single" w:sz="6" w:color="D94F8A"/>
-                <w:right w:val="single" w:sz="6" w:color="D94F8A"/>
-                <w:insideH w:val="single" w:sz="6" w:color="D94F8A"/>
-                <w:insideV w:val="single" w:sz="6" w:color="D94F8A"/>
-              </w:tblBorders>
-              <w:tblLayout w:type="fixed"/>
-              <w:tblCellMar>
-                <w:top w:w="30" w:type="dxa"/>
-                <w:left w:w="80" w:type="dxa"/>
-                <w:bottom w:w="30" w:type="dxa"/>
-                <w:right w:w="80" w:type="dxa"/>
-              </w:tblCellMar>
-              <w:tblLayout w:type="fixed"/>
-            </w:tblPr>
-            <w:tblGrid>
-              <w:gridCol w:w="5216"/>
-            </w:tblGrid>
-            <w:tr>
-              <w:tc>
-                <w:tcPr>
-                  <w:tcW w:type="dxa" w:w="5216"/>
-                  <w:shd w:val="clear" w:color="auto" w:fill="FFF0F6"/>
-                </w:tcPr>
-                <w:p>
-                  <w:pPr>
-                    <w:spacing w:after="0" w:before="0"/>
-                    <w:jc w:val="center"/>
-                  </w:pPr>
-                  <w:r>
-                    <w:rPr>
-                      <w:rFonts w:ascii="한컴 말랑말랑 Bold" w:hAnsi="한컴 말랑말랑 Bold" w:eastAsia="한컴 말랑말랑 Bold" w:cs="한컴 말랑말랑 Bold"/>
-                      <w:b/>
-                      <w:color w:val="B03A6E"/>
-                      <w:sz w:val="17"/>
-                    </w:rPr>
-                    <w:t>✉️ 다 쓰면 만든 모둠에게 돌려줘요.  이름 대신 모둠·별칭만 써요.</w:t>
                   </w:r>
                 </w:p>
               </w:tc>
@@ -972,7 +910,7 @@
             </w:tr>
             <w:tr>
               <w:trPr>
-                <w:trHeight w:val="595" w:hRule="atLeast"/>
+                <w:trHeight w:val="737" w:hRule="atLeast"/>
               </w:trPr>
               <w:tc>
                 <w:tcPr>
@@ -1007,7 +945,7 @@
             </w:tr>
             <w:tr>
               <w:trPr>
-                <w:trHeight w:val="822" w:hRule="atLeast"/>
+                <w:trHeight w:val="963" w:hRule="atLeast"/>
               </w:trPr>
               <w:tc>
                 <w:tcPr>
@@ -1095,68 +1033,6 @@
                       <w:sz w:val="18"/>
                     </w:rPr>
                     <w:t xml:space="preserve">   함께할 사람:</w:t>
-                  </w:r>
-                </w:p>
-              </w:tc>
-            </w:tr>
-          </w:tbl>
-          <w:p>
-            <w:pPr>
-              <w:spacing w:after="0" w:before="0" w:line="120" w:lineRule="exact"/>
-            </w:pPr>
-            <w:r>
-              <w:rPr>
-                <w:rFonts w:ascii="한컴 말랑말랑 Regular" w:hAnsi="한컴 말랑말랑 Regular" w:eastAsia="한컴 말랑말랑 Regular" w:cs="한컴 말랑말랑 Regular"/>
-                <w:b w:val="0"/>
-                <w:sz w:val="4"/>
-              </w:rPr>
-              <w:t xml:space="preserve"> </w:t>
-            </w:r>
-          </w:p>
-          <w:tbl>
-            <w:tblPr>
-              <w:tblW w:type="auto" w:w="0"/>
-              <w:jc w:val="center"/>
-              <w:tblLook w:firstColumn="1" w:firstRow="1" w:lastColumn="0" w:lastRow="0" w:noHBand="0" w:noVBand="1" w:val="04A0"/>
-              <w:tblBorders>
-                <w:top w:val="single" w:sz="6" w:color="D94F8A"/>
-                <w:left w:val="single" w:sz="6" w:color="D94F8A"/>
-                <w:bottom w:val="single" w:sz="6" w:color="D94F8A"/>
-                <w:right w:val="single" w:sz="6" w:color="D94F8A"/>
-                <w:insideH w:val="single" w:sz="6" w:color="D94F8A"/>
-                <w:insideV w:val="single" w:sz="6" w:color="D94F8A"/>
-              </w:tblBorders>
-              <w:tblLayout w:type="fixed"/>
-              <w:tblCellMar>
-                <w:top w:w="30" w:type="dxa"/>
-                <w:left w:w="80" w:type="dxa"/>
-                <w:bottom w:w="30" w:type="dxa"/>
-                <w:right w:w="80" w:type="dxa"/>
-              </w:tblCellMar>
-              <w:tblLayout w:type="fixed"/>
-            </w:tblPr>
-            <w:tblGrid>
-              <w:gridCol w:w="5216"/>
-            </w:tblGrid>
-            <w:tr>
-              <w:tc>
-                <w:tcPr>
-                  <w:tcW w:type="dxa" w:w="5216"/>
-                  <w:shd w:val="clear" w:color="auto" w:fill="FFF0F6"/>
-                </w:tcPr>
-                <w:p>
-                  <w:pPr>
-                    <w:spacing w:after="0" w:before="0"/>
-                    <w:jc w:val="center"/>
-                  </w:pPr>
-                  <w:r>
-                    <w:rPr>
-                      <w:rFonts w:ascii="한컴 말랑말랑 Bold" w:hAnsi="한컴 말랑말랑 Bold" w:eastAsia="한컴 말랑말랑 Bold" w:cs="한컴 말랑말랑 Bold"/>
-                      <w:b/>
-                      <w:color w:val="B03A6E"/>
-                      <w:sz w:val="17"/>
-                    </w:rPr>
-                    <w:t>✉️ 다 쓰면 만든 모둠에게 돌려줘요.  이름 대신 모둠·별칭만 써요.</w:t>
                   </w:r>
                 </w:p>
               </w:tc>
@@ -1538,7 +1414,7 @@
             </w:tr>
             <w:tr>
               <w:trPr>
-                <w:trHeight w:val="595" w:hRule="atLeast"/>
+                <w:trHeight w:val="737" w:hRule="atLeast"/>
               </w:trPr>
               <w:tc>
                 <w:tcPr>
@@ -1573,7 +1449,7 @@
             </w:tr>
             <w:tr>
               <w:trPr>
-                <w:trHeight w:val="822" w:hRule="atLeast"/>
+                <w:trHeight w:val="963" w:hRule="atLeast"/>
               </w:trPr>
               <w:tc>
                 <w:tcPr>
@@ -1661,68 +1537,6 @@
                       <w:sz w:val="18"/>
                     </w:rPr>
                     <w:t xml:space="preserve">   함께할 사람:</w:t>
-                  </w:r>
-                </w:p>
-              </w:tc>
-            </w:tr>
-          </w:tbl>
-          <w:p>
-            <w:pPr>
-              <w:spacing w:after="0" w:before="0" w:line="120" w:lineRule="exact"/>
-            </w:pPr>
-            <w:r>
-              <w:rPr>
-                <w:rFonts w:ascii="한컴 말랑말랑 Regular" w:hAnsi="한컴 말랑말랑 Regular" w:eastAsia="한컴 말랑말랑 Regular" w:cs="한컴 말랑말랑 Regular"/>
-                <w:b w:val="0"/>
-                <w:sz w:val="4"/>
-              </w:rPr>
-              <w:t xml:space="preserve"> </w:t>
-            </w:r>
-          </w:p>
-          <w:tbl>
-            <w:tblPr>
-              <w:tblW w:type="auto" w:w="0"/>
-              <w:jc w:val="center"/>
-              <w:tblLook w:firstColumn="1" w:firstRow="1" w:lastColumn="0" w:lastRow="0" w:noHBand="0" w:noVBand="1" w:val="04A0"/>
-              <w:tblBorders>
-                <w:top w:val="single" w:sz="6" w:color="D94F8A"/>
-                <w:left w:val="single" w:sz="6" w:color="D94F8A"/>
-                <w:bottom w:val="single" w:sz="6" w:color="D94F8A"/>
-                <w:right w:val="single" w:sz="6" w:color="D94F8A"/>
-                <w:insideH w:val="single" w:sz="6" w:color="D94F8A"/>
-                <w:insideV w:val="single" w:sz="6" w:color="D94F8A"/>
-              </w:tblBorders>
-              <w:tblLayout w:type="fixed"/>
-              <w:tblCellMar>
-                <w:top w:w="30" w:type="dxa"/>
-                <w:left w:w="80" w:type="dxa"/>
-                <w:bottom w:w="30" w:type="dxa"/>
-                <w:right w:w="80" w:type="dxa"/>
-              </w:tblCellMar>
-              <w:tblLayout w:type="fixed"/>
-            </w:tblPr>
-            <w:tblGrid>
-              <w:gridCol w:w="5216"/>
-            </w:tblGrid>
-            <w:tr>
-              <w:tc>
-                <w:tcPr>
-                  <w:tcW w:type="dxa" w:w="5216"/>
-                  <w:shd w:val="clear" w:color="auto" w:fill="FFF0F6"/>
-                </w:tcPr>
-                <w:p>
-                  <w:pPr>
-                    <w:spacing w:after="0" w:before="0"/>
-                    <w:jc w:val="center"/>
-                  </w:pPr>
-                  <w:r>
-                    <w:rPr>
-                      <w:rFonts w:ascii="한컴 말랑말랑 Bold" w:hAnsi="한컴 말랑말랑 Bold" w:eastAsia="한컴 말랑말랑 Bold" w:cs="한컴 말랑말랑 Bold"/>
-                      <w:b/>
-                      <w:color w:val="B03A6E"/>
-                      <w:sz w:val="17"/>
-                    </w:rPr>
-                    <w:t>✉️ 다 쓰면 만든 모둠에게 돌려줘요.  이름 대신 모둠·별칭만 써요.</w:t>
                   </w:r>
                 </w:p>
               </w:tc>
@@ -2099,7 +1913,7 @@
             </w:tr>
             <w:tr>
               <w:trPr>
-                <w:trHeight w:val="595" w:hRule="atLeast"/>
+                <w:trHeight w:val="737" w:hRule="atLeast"/>
               </w:trPr>
               <w:tc>
                 <w:tcPr>
@@ -2134,7 +1948,7 @@
             </w:tr>
             <w:tr>
               <w:trPr>
-                <w:trHeight w:val="822" w:hRule="atLeast"/>
+                <w:trHeight w:val="963" w:hRule="atLeast"/>
               </w:trPr>
               <w:tc>
                 <w:tcPr>
@@ -2222,68 +2036,6 @@
                       <w:sz w:val="18"/>
                     </w:rPr>
                     <w:t xml:space="preserve">   함께할 사람:</w:t>
-                  </w:r>
-                </w:p>
-              </w:tc>
-            </w:tr>
-          </w:tbl>
-          <w:p>
-            <w:pPr>
-              <w:spacing w:after="0" w:before="0" w:line="120" w:lineRule="exact"/>
-            </w:pPr>
-            <w:r>
-              <w:rPr>
-                <w:rFonts w:ascii="한컴 말랑말랑 Regular" w:hAnsi="한컴 말랑말랑 Regular" w:eastAsia="한컴 말랑말랑 Regular" w:cs="한컴 말랑말랑 Regular"/>
-                <w:b w:val="0"/>
-                <w:sz w:val="4"/>
-              </w:rPr>
-              <w:t xml:space="preserve"> </w:t>
-            </w:r>
-          </w:p>
-          <w:tbl>
-            <w:tblPr>
-              <w:tblW w:type="auto" w:w="0"/>
-              <w:jc w:val="center"/>
-              <w:tblLook w:firstColumn="1" w:firstRow="1" w:lastColumn="0" w:lastRow="0" w:noHBand="0" w:noVBand="1" w:val="04A0"/>
-              <w:tblBorders>
-                <w:top w:val="single" w:sz="6" w:color="D94F8A"/>
-                <w:left w:val="single" w:sz="6" w:color="D94F8A"/>
-                <w:bottom w:val="single" w:sz="6" w:color="D94F8A"/>
-                <w:right w:val="single" w:sz="6" w:color="D94F8A"/>
-                <w:insideH w:val="single" w:sz="6" w:color="D94F8A"/>
-                <w:insideV w:val="single" w:sz="6" w:color="D94F8A"/>
-              </w:tblBorders>
-              <w:tblLayout w:type="fixed"/>
-              <w:tblCellMar>
-                <w:top w:w="30" w:type="dxa"/>
-                <w:left w:w="80" w:type="dxa"/>
-                <w:bottom w:w="30" w:type="dxa"/>
-                <w:right w:w="80" w:type="dxa"/>
-              </w:tblCellMar>
-              <w:tblLayout w:type="fixed"/>
-            </w:tblPr>
-            <w:tblGrid>
-              <w:gridCol w:w="5216"/>
-            </w:tblGrid>
-            <w:tr>
-              <w:tc>
-                <w:tcPr>
-                  <w:tcW w:type="dxa" w:w="5216"/>
-                  <w:shd w:val="clear" w:color="auto" w:fill="FFF0F6"/>
-                </w:tcPr>
-                <w:p>
-                  <w:pPr>
-                    <w:spacing w:after="0" w:before="0"/>
-                    <w:jc w:val="center"/>
-                  </w:pPr>
-                  <w:r>
-                    <w:rPr>
-                      <w:rFonts w:ascii="한컴 말랑말랑 Bold" w:hAnsi="한컴 말랑말랑 Bold" w:eastAsia="한컴 말랑말랑 Bold" w:cs="한컴 말랑말랑 Bold"/>
-                      <w:b/>
-                      <w:color w:val="B03A6E"/>
-                      <w:sz w:val="17"/>
-                    </w:rPr>
-                    <w:t>✉️ 다 쓰면 만든 모둠에게 돌려줘요.  이름 대신 모둠·별칭만 써요.</w:t>
                   </w:r>
                 </w:p>
               </w:tc>

</xml_diff>